<commit_message>
Update article: prototype validation section + power sources per node
Agent-Logs-Url: https://github.com/Cdcuellar/Sistemas-embebidos---Actividades-de-la-vida-diaria/sessions/a33d6662-4167-4f7c-838b-b86a53d1d2db

Co-authored-by: Cdcuellar <153051653+Cdcuellar@users.noreply.github.com>
</commit_message>
<xml_diff>
--- a/articulo_sistema_monitoreo_vestible_HardwareX.docx
+++ b/articulo_sistema_monitoreo_vestible_HardwareX.docx
@@ -21,13 +21,14 @@
     </w:p>
     <w:p>
       <w:pPr>
-        <w:spacing w:before="80" w:after="40" w:lineRule="auto" w:line="312"/>
+        <w:spacing w:before="0" w:after="40" w:lineRule="auto" w:line="312"/>
         <w:jc w:val="center"/>
       </w:pPr>
       <w:r>
         <w:rPr>
           <w:rFonts w:ascii="Calibri" w:hAnsi="Calibri"/>
           <w:b/>
+          <w:i w:val="0"/>
           <w:sz w:val="24"/>
         </w:rPr>
         <w:t>Carlos Daniel Cuellar Antury</w:t>
@@ -41,6 +42,8 @@
       <w:r>
         <w:rPr>
           <w:rFonts w:ascii="Calibri" w:hAnsi="Calibri"/>
+          <w:b w:val="0"/>
+          <w:i w:val="0"/>
           <w:sz w:val="22"/>
         </w:rPr>
         <w:t>Departamento de Ingeniería Electrónica y Telecomunicaciones</w:t>
@@ -54,6 +57,8 @@
       <w:r>
         <w:rPr>
           <w:rFonts w:ascii="Calibri" w:hAnsi="Calibri"/>
+          <w:b w:val="0"/>
+          <w:i w:val="0"/>
           <w:sz w:val="22"/>
         </w:rPr>
         <w:t>Universidad del Cauca, Popayán, Colombia</w:t>
@@ -61,18 +66,20 @@
     </w:p>
     <w:p>
       <w:pPr>
-        <w:spacing w:before="0" w:after="160" w:lineRule="auto" w:line="312"/>
+        <w:spacing w:before="0" w:after="40" w:lineRule="auto" w:line="312"/>
         <w:jc w:val="center"/>
       </w:pPr>
       <w:r>
         <w:rPr>
           <w:rFonts w:ascii="Calibri" w:hAnsi="Calibri"/>
+          <w:b w:val="0"/>
           <w:i/>
           <w:sz w:val="22"/>
         </w:rPr>
         <w:t>cdcuellar@unicauca.edu.co</w:t>
       </w:r>
     </w:p>
+    <w:p/>
     <w:p>
       <w:pPr>
         <w:spacing w:before="120" w:after="60" w:lineRule="auto" w:line="276"/>
@@ -112,7 +119,6 @@
               <w:insideH w:val="single" w:sz="4" w:space="0" w:color="000000"/>
               <w:insideV w:val="single" w:sz="4" w:space="0" w:color="000000"/>
             </w:tcBorders>
-            <w:vAlign w:val="center"/>
           </w:tcPr>
           <w:p>
             <w:pPr>
@@ -142,7 +148,6 @@
               <w:insideH w:val="single" w:sz="4" w:space="0" w:color="000000"/>
               <w:insideV w:val="single" w:sz="4" w:space="0" w:color="000000"/>
             </w:tcBorders>
-            <w:vAlign w:val="center"/>
           </w:tcPr>
           <w:p>
             <w:pPr>
@@ -174,7 +179,6 @@
               <w:insideH w:val="single" w:sz="4" w:space="0" w:color="000000"/>
               <w:insideV w:val="single" w:sz="4" w:space="0" w:color="000000"/>
             </w:tcBorders>
-            <w:vAlign w:val="center"/>
           </w:tcPr>
           <w:p>
             <w:pPr>
@@ -204,7 +208,6 @@
               <w:insideH w:val="single" w:sz="4" w:space="0" w:color="000000"/>
               <w:insideV w:val="single" w:sz="4" w:space="0" w:color="000000"/>
             </w:tcBorders>
-            <w:vAlign w:val="center"/>
           </w:tcPr>
           <w:p>
             <w:pPr>
@@ -218,7 +221,7 @@
                 <w:b w:val="0"/>
                 <w:sz w:val="20"/>
               </w:rPr>
-              <w:t>Sistema embebido distribuido / Dispositivo vestible</w:t>
+              <w:t>Sistema embebido distribuido / Dispositivo vestible (prototipo)</w:t>
             </w:r>
           </w:p>
         </w:tc>
@@ -235,7 +238,6 @@
               <w:insideH w:val="single" w:sz="4" w:space="0" w:color="000000"/>
               <w:insideV w:val="single" w:sz="4" w:space="0" w:color="000000"/>
             </w:tcBorders>
-            <w:vAlign w:val="center"/>
           </w:tcPr>
           <w:p>
             <w:pPr>
@@ -264,7 +266,6 @@
               <w:insideH w:val="single" w:sz="4" w:space="0" w:color="000000"/>
               <w:insideV w:val="single" w:sz="4" w:space="0" w:color="000000"/>
             </w:tcBorders>
-            <w:vAlign w:val="center"/>
           </w:tcPr>
           <w:p>
             <w:pPr>
@@ -296,7 +297,6 @@
               <w:insideH w:val="single" w:sz="4" w:space="0" w:color="000000"/>
               <w:insideV w:val="single" w:sz="4" w:space="0" w:color="000000"/>
             </w:tcBorders>
-            <w:vAlign w:val="center"/>
           </w:tcPr>
           <w:p>
             <w:pPr>
@@ -326,7 +326,6 @@
               <w:insideH w:val="single" w:sz="4" w:space="0" w:color="000000"/>
               <w:insideV w:val="single" w:sz="4" w:space="0" w:color="000000"/>
             </w:tcBorders>
-            <w:vAlign w:val="center"/>
           </w:tcPr>
           <w:p>
             <w:pPr>
@@ -357,7 +356,6 @@
               <w:insideH w:val="single" w:sz="4" w:space="0" w:color="000000"/>
               <w:insideV w:val="single" w:sz="4" w:space="0" w:color="000000"/>
             </w:tcBorders>
-            <w:vAlign w:val="center"/>
           </w:tcPr>
           <w:p>
             <w:pPr>
@@ -386,7 +384,6 @@
               <w:insideH w:val="single" w:sz="4" w:space="0" w:color="000000"/>
               <w:insideV w:val="single" w:sz="4" w:space="0" w:color="000000"/>
             </w:tcBorders>
-            <w:vAlign w:val="center"/>
           </w:tcPr>
           <w:p>
             <w:pPr>
@@ -400,7 +397,7 @@
                 <w:b w:val="0"/>
                 <w:sz w:val="20"/>
               </w:rPr>
-              <w:t>1.0</w:t>
+              <w:t>1.0 – Prototipo</w:t>
             </w:r>
           </w:p>
         </w:tc>
@@ -418,7 +415,6 @@
               <w:insideH w:val="single" w:sz="4" w:space="0" w:color="000000"/>
               <w:insideV w:val="single" w:sz="4" w:space="0" w:color="000000"/>
             </w:tcBorders>
-            <w:vAlign w:val="center"/>
           </w:tcPr>
           <w:p>
             <w:pPr>
@@ -448,7 +444,6 @@
               <w:insideH w:val="single" w:sz="4" w:space="0" w:color="000000"/>
               <w:insideV w:val="single" w:sz="4" w:space="0" w:color="000000"/>
             </w:tcBorders>
-            <w:vAlign w:val="center"/>
           </w:tcPr>
           <w:p>
             <w:pPr>
@@ -479,7 +474,6 @@
               <w:insideH w:val="single" w:sz="4" w:space="0" w:color="000000"/>
               <w:insideV w:val="single" w:sz="4" w:space="0" w:color="000000"/>
             </w:tcBorders>
-            <w:vAlign w:val="center"/>
           </w:tcPr>
           <w:p>
             <w:pPr>
@@ -508,7 +502,6 @@
               <w:insideH w:val="single" w:sz="4" w:space="0" w:color="000000"/>
               <w:insideV w:val="single" w:sz="4" w:space="0" w:color="000000"/>
             </w:tcBorders>
-            <w:vAlign w:val="center"/>
           </w:tcPr>
           <w:p>
             <w:pPr>
@@ -540,7 +533,6 @@
               <w:insideH w:val="single" w:sz="4" w:space="0" w:color="000000"/>
               <w:insideV w:val="single" w:sz="4" w:space="0" w:color="000000"/>
             </w:tcBorders>
-            <w:vAlign w:val="center"/>
           </w:tcPr>
           <w:p>
             <w:pPr>
@@ -570,7 +562,6 @@
               <w:insideH w:val="single" w:sz="4" w:space="0" w:color="000000"/>
               <w:insideV w:val="single" w:sz="4" w:space="0" w:color="000000"/>
             </w:tcBorders>
-            <w:vAlign w:val="center"/>
           </w:tcPr>
           <w:p>
             <w:pPr>
@@ -601,7 +592,6 @@
               <w:insideH w:val="single" w:sz="4" w:space="0" w:color="000000"/>
               <w:insideV w:val="single" w:sz="4" w:space="0" w:color="000000"/>
             </w:tcBorders>
-            <w:vAlign w:val="center"/>
           </w:tcPr>
           <w:p>
             <w:pPr>
@@ -630,7 +620,6 @@
               <w:insideH w:val="single" w:sz="4" w:space="0" w:color="000000"/>
               <w:insideV w:val="single" w:sz="4" w:space="0" w:color="000000"/>
             </w:tcBorders>
-            <w:vAlign w:val="center"/>
           </w:tcPr>
           <w:p>
             <w:pPr>
@@ -662,7 +651,6 @@
               <w:insideH w:val="single" w:sz="4" w:space="0" w:color="000000"/>
               <w:insideV w:val="single" w:sz="4" w:space="0" w:color="000000"/>
             </w:tcBorders>
-            <w:vAlign w:val="center"/>
           </w:tcPr>
           <w:p>
             <w:pPr>
@@ -692,7 +680,6 @@
               <w:insideH w:val="single" w:sz="4" w:space="0" w:color="000000"/>
               <w:insideV w:val="single" w:sz="4" w:space="0" w:color="000000"/>
             </w:tcBorders>
-            <w:vAlign w:val="center"/>
           </w:tcPr>
           <w:p>
             <w:pPr>
@@ -706,7 +693,7 @@
                 <w:b w:val="0"/>
                 <w:sz w:val="20"/>
               </w:rPr>
-              <w:t>USD 37.40 (~COP 150.000 / ~MXN 600 / ~EUR 35)</w:t>
+              <w:t>USD 60.40 (~COP 240.000 / ~MXN 1.200 / ~EUR 56 / ~ARS 60.000)</w:t>
             </w:r>
           </w:p>
         </w:tc>
@@ -740,7 +727,7 @@
           <w:i w:val="0"/>
           <w:sz w:val="22"/>
         </w:rPr>
-        <w:t>Este artículo documenta el diseño, implementación y validación de un sistema de monitoreo vestible para actividades de la vida diaria (AVD) basado en una arquitectura de sensores inerciales distribuidos sobre microcontroladores ESP32. El sistema comprende cuatro nodos: un nodo maestro (ESP32 DevKit V1) encargado de la coordinación central, la adquisición del ritmo cardíaco, el registro de marcas de tiempo mediante un módulo RTC DS3231 y el almacenamiento persistente en tarjeta microSD; un nodo de movimiento (ESP32 DevKit V1) que captura datos de orientación e inercia con el sensor MPU6050 a través del bus I2C; un nodo táctil-visual (ESP32-S3 Touch 1.28") con sensor QMI8658 e interfaz de pantalla; y una herramienta de diagnóstico para la identificación del registro WHO_AM_I del MPU6050. La comunicación entre nodos se realiza mediante el protocolo ESP-NOW en la banda de 2.4 GHz. El costo total de los componentes es de aproximadamente USD 37.40, lo que sitúa al sistema como una alternativa de bajo costo frente a dispositivos comerciales. El repositorio incluye el firmware completo, esquemas de conexión y documentación técnica bajo licencia MIT, favoreciendo la reproducibilidad y adaptación en contextos académicos y de investigación.</w:t>
+        <w:t>Este artículo documenta el diseño e implementación de un prototipo de sistema de monitoreo vestible para actividades de la vida diaria (AVD) basado en una arquitectura de sensores inerciales distribuidos sobre microcontroladores ESP32. El sistema comprende cuatro nodos: un nodo maestro (ESP32 DevKit V1) alimentado por un portapilas de 4 pilas AA, encargado de la coordinación central, la adquisición del ritmo cardíaco, el registro de marcas de tiempo mediante un módulo RTC DS3231 y el almacenamiento en tarjeta microSD; un nodo de movimiento (ESP32 DevKit V1) alimentado por una batería de litio de 3.7 V / 600 mAh, que captura datos de orientación e inercia con el sensor MPU6050; un nodo táctil-visual (ESP32-S3 Touch 1.28") alimentado por una powerbank de 20.000 mAh con pantalla táctil e interfaz local; y una herramienta de diagnóstico para la identificación del registro WHO_AM_I del MPU6050. La comunicación entre nodos se realiza mediante ESP-NOW. El costo total del prototipo es de aproximadamente USD 60.40, con firmware completo y documentación bajo licencia MIT, favoreciendo la reproducibilidad académica.</w:t>
       </w:r>
     </w:p>
     <w:p>
@@ -770,7 +757,7 @@
           <w:i w:val="0"/>
           <w:sz w:val="22"/>
         </w:rPr>
-        <w:t>This article documents the design, implementation and validation of a wearable monitoring system for activities of daily living (ADL) based on a distributed inertial sensor architecture built on ESP32 microcontrollers. The system comprises four nodes: a master node (ESP32 DevKit V1) responsible for central coordination, heart rate acquisition, real-time timestamping via a DS3231 RTC module, and persistent data logging to a microSD card; a motion node (ESP32 DevKit V1) that captures orientation and inertial data from an MPU6050 sensor over I2C; a touch-display node (ESP32-S3 Touch 1.28") with QMI8658 sensor and graphical interface; and a diagnostic tool for MPU6050 WHO_AM_I register identification. Inter-node communication is achieved through the ESP-NOW protocol in the 2.4 GHz band. The total component cost is approximately USD 37.40, making the system a low-cost open-source alternative to commercial wearable devices. The repository provides complete firmware, connection schematics, and technical documentation under the MIT license, supporting reproducibility and adaptation in academic and research contexts.</w:t>
+        <w:t>This article documents the design and implementation of a wearable monitoring prototype for activities of daily living (ADL) based on a distributed inertial sensor architecture built on ESP32 microcontrollers. The system comprises four nodes: a master node (ESP32 DevKit V1) powered by a 4×AA battery holder, responsible for central coordination, heart rate acquisition, real-time timestamping via DS3231 RTC, and microSD data logging; a motion node (ESP32 DevKit V1) powered by a 3.7 V / 600 mAh lithium battery, capturing orientation and inertial data from an MPU6050 sensor; a touch-display node (ESP32-S3 Touch 1.28") powered by a 20,000 mAh powerbank with graphical interface; and a WHO_AM_I diagnostic tool. Inter-node communication uses the ESP-NOW protocol. The total prototype cost is approximately USD 60.40. Complete firmware and documentation are available under the MIT license.</w:t>
       </w:r>
     </w:p>
     <w:p>
@@ -791,7 +778,7 @@
           <w:rFonts w:ascii="Calibri" w:hAnsi="Calibri"/>
           <w:sz w:val="22"/>
         </w:rPr>
-        <w:t>Monitoreo vestible, ESP32, IMU, Actividades de la vida diaria, Sistemas embebidos, ESP-NOW, MPU6050</w:t>
+        <w:t>Monitoreo vestible, ESP32, IMU, Actividades de la vida diaria, Sistemas embebidos, ESP-NOW, MPU6050, Prototipo</w:t>
       </w:r>
     </w:p>
     <w:p>
@@ -826,7 +813,7 @@
           <w:i w:val="0"/>
           <w:sz w:val="22"/>
         </w:rPr>
-        <w:t>El monitoreo de las actividades de la vida diaria (AVD) mediante dispositivos vestibles ha experimentado un crecimiento considerable en los últimos años, impulsado por los avances en sensores miniaturizados, microcontroladores de bajo consumo y protocolos inalámbricos eficientes. Las AVD incluyen acciones como caminar, subir escaleras, levantarse, sentarse y dormir, cuya caracterización es fundamental en campos como la rehabilitación médica, la gerontología, el deporte de alto rendimiento y la investigación en biomecánica.</w:t>
+        <w:t>El monitoreo de las actividades de la vida diaria (AVD) mediante dispositivos vestibles ha experimentado un crecimiento considerable en los últimos años, impulsado por avances en sensores miniaturizados, microcontroladores de bajo consumo y protocolos inalámbricos eficientes. Las AVD —como caminar, subir escaleras, levantarse, sentarse y dormir— son de fundamental importancia en rehabilitación médica, gerontología, deporte de alto rendimiento e investigación en biomecánica.</w:t>
       </w:r>
     </w:p>
     <w:p>
@@ -841,7 +828,7 @@
           <w:i w:val="0"/>
           <w:sz w:val="22"/>
         </w:rPr>
-        <w:t>Los dispositivos comerciales actuales —como el Fitbit Charge 6, Apple Watch Series 9 o el Garmin Vivosmart 5— ofrecen capacidades de monitoreo avanzadas, pero presentan limitaciones relevantes en entornos académicos e investigativos: acceso restringido a los datos en crudo, imposibilidad de modificar el firmware, costos elevados (USD 150–500) y ausencia de modularidad para agregar nuevos sensores. Frente a esto, el sistema presentado en este artículo propone una arquitectura abierta, de bajo costo (~USD 37.40) y completamente modificable, basada en microcontroladores ESP32 de amplia disponibilidad en el mercado latinoamericano.</w:t>
+        <w:t>Los dispositivos comerciales actuales —Fitbit Charge 6, Apple Watch Series 9, Garmin Vivosmart 5— ofrecen capacidades de monitoreo avanzadas, pero presentan limitaciones en entornos académicos: acceso restringido a datos en crudo, imposibilidad de modificar el firmware, costos elevados (USD 150–500) y ausencia de modularidad. El prototipo presentado propone una arquitectura abierta, de bajo costo (~USD 60.40) y completamente modificable, basada en microcontroladores ESP32 de amplia disponibilidad en el mercado latinoamericano.</w:t>
       </w:r>
     </w:p>
     <w:p>
@@ -856,7 +843,7 @@
           <w:i w:val="0"/>
           <w:sz w:val="22"/>
         </w:rPr>
-        <w:t>Entre las ventajas del enfoque propuesto se destacan: (1) acceso completo al firmware en lenguaje C bajo licencia MIT; (2) posibilidad de integración con nuevos sensores mediante bus I2C o SPI sin cambios de plataforma; (3) comunicación inalámbrica mediante ESP-NOW de Espressif, con latencias inferiores a 10 ms; (4) almacenamiento local en tarjeta microSD para operación autónoma sin dependencia de conectividad a internet; y (5) costo de fabricación accesible para laboratorios universitarios de países en desarrollo.</w:t>
+        <w:t>Entre las ventajas del enfoque propuesto se destacan: (1) acceso completo al firmware en lenguaje C bajo licencia MIT; (2) posibilidad de integrar nuevos sensores sin cambios de plataforma; (3) comunicación inalámbrica mediante ESP-NOW con latencias inferiores a 10 ms; (4) almacenamiento local en microSD para operación autónoma; (5) costo accesible para laboratorios universitarios; y (6) autonomía inalámbrica gracias a las fuentes de alimentación independientes en cada nodo.</w:t>
       </w:r>
     </w:p>
     <w:p>
@@ -871,7 +858,7 @@
           <w:i w:val="0"/>
           <w:sz w:val="22"/>
         </w:rPr>
-        <w:t>El sistema es aplicable en los siguientes escenarios: monitoreo clínico de pacientes en rehabilitación postoperatoria; investigación en biomecánica del movimiento humano; seguimiento del entrenamiento deportivo amateur y profesional; evaluación de actividades funcionales en adultos mayores; y proyectos de aprendizaje en cursos de sistemas embebidos e IoT. La arquitectura distribuida permite escalabilidad, incorporando nodos adicionales sin modificar el nodo maestro.</w:t>
+        <w:t>El prototipo es aplicable en: monitoreo clínico en rehabilitación postoperatoria, investigación en biomecánica del movimiento, seguimiento de entrenamiento deportivo, evaluación de actividades funcionales en adultos mayores, y proyectos de aprendizaje en cursos de sistemas embebidos e IoT.</w:t>
       </w:r>
     </w:p>
     <w:p>
@@ -901,7 +888,7 @@
           <w:i w:val="0"/>
           <w:sz w:val="22"/>
         </w:rPr>
-        <w:t>El sistema está conformado por cuatro nodos ESP32 que operan de manera coordinada mediante el protocolo ESP-NOW. Cada nodo cumple un rol específico dentro de la arquitectura maestro-esclavo distribuida.</w:t>
+        <w:t>El prototipo está conformado por cuatro nodos ESP32 que operan de manera coordinada mediante el protocolo ESP-NOW en una topología en estrella. Cada nodo cuenta con su propia fuente de alimentación independiente, lo que permite su operación de forma inalámbrica y portable.</w:t>
       </w:r>
     </w:p>
     <w:p>
@@ -931,7 +918,7 @@
           <w:i w:val="0"/>
           <w:sz w:val="22"/>
         </w:rPr>
-        <w:t>Directorio: esp32_1_hr_rstc_sd_master. Constituye el núcleo central del sistema. Recibe paquetes de datos IMU (32 bytes) desde los nodos esclavos mediante ESP-NOW en el canal 1. Adquiere la señal de ritmo cardíaco a través del ADC en GPIO 34 (resolución de 12 bits). Se comunica con el módulo RTC DS3231 por I2C (SDA: GPIO 21, SCL: GPIO 22) para obtener marcas de tiempo con precisión de ±2 ppm. Almacena todos los registros en tarjeta microSD mediante interfaz SPI (MOSI: GPIO 23, MISO: GPIO 19, SCK: GPIO 18, CS: GPIO 5). La cadencia de muestreo es de 100 ms y la transmisión ESP-NOW se realiza cada 500 ms.</w:t>
+        <w:t>Directorio: esp32_1_hr_rstc_sd_master. Constituye el núcleo central del sistema. Fuente de alimentación: portapilas de 4 pilas AA (6 V nominal → regulado a 3.3 V por el regulador integrado del DevKit) con capacidad aproximada de 2.400–3.000 mAh en configuración alcalina. Recibe paquetes de datos IMU (32 bytes) desde los nodos esclavos mediante ESP-NOW en el canal 1. Adquiere la señal de ritmo cardíaco a través del ADC en GPIO 34 (12 bits). Se comunica con el módulo RTC DS3231 por I2C (SDA: GPIO 21, SCL: GPIO 22) para marcas de tiempo con precisión ±2 ppm. Almacena los registros en tarjeta microSD mediante SPI (MOSI: GPIO 23, MISO: GPIO 19, SCK: GPIO 18, CS: GPIO 5).</w:t>
       </w:r>
     </w:p>
     <w:p>
@@ -961,7 +948,7 @@
           <w:i w:val="0"/>
           <w:sz w:val="22"/>
         </w:rPr>
-        <w:t>Directorio: esp32_2. Integra el sensor MPU6050 a través del bus I2C (SDA: GPIO 21, SCL: GPIO 22). Implementa un driver propio (mpu6050.c / mpu6050.h) que realiza la calibración automática del sensor al inicio, calcula los ángulos de roll y pitch mediante relaciones trigonométricas y normaliza las lecturas del acelerómetro. Los datos calculados se encapsulan en una estructura de 32 bytes y se transmiten al nodo maestro por ESP-NOW. El acelerómetro opera en el rango ±2g (resolución: 16 384 LSB/g) y el giroscopio en ±250°/s (resolución: 131 LSB/°/s).</w:t>
+        <w:t>Directorio: esp32_2. Fuente de alimentación: batería de litio recargable de 3.7 V / 600 mAh, conectada directamente al pin VIN del DevKit a través de un módulo de carga TP4056. Esta configuración permite una autonomía estimada de 2–4 horas en operación continua. Integra el sensor MPU6050 mediante I2C (SDA: GPIO 21, SCL: GPIO 22). El driver propio (mpu6050.c / mpu6050.h) realiza calibración automática, calcula roll y pitch, y encapsula los datos en una estructura de 32 bytes que se transmite al nodo maestro por ESP-NOW cada 500 ms. El acelerómetro opera en ±2g (16 384 LSB/g) y el giroscopio en ±250°/s (131 LSB/°/s).</w:t>
       </w:r>
     </w:p>
     <w:p>
@@ -991,7 +978,7 @@
           <w:i w:val="0"/>
           <w:sz w:val="22"/>
         </w:rPr>
-        <w:t>Directorio: esp_32_s3_touch_1.28. Utiliza el sensor inercial QMI8658 como dispositivo primario, con compatibilidad hacia el MPU6050 como alternativa. Dispone de una pantalla táctil circular de 1.28 pulgadas que permite la interacción local del usuario con el sistema. Los datos IMU se transmiten al nodo maestro mediante ESP-NOW, siguiendo el mismo esquema de empaquetado que el nodo de movimiento.</w:t>
+        <w:t>Directorio: esp_32_s3_touch_1.28. Fuente de alimentación: powerbank de 20.000 mAh conectada por USB-C, lo que proporciona una autonomía muy extensa (estimada en 40–60 horas de operación continua), adecuada para uso prolongado durante el día. Utiliza el sensor inercial QMI8658 como dispositivo primario, con compatibilidad hacia el MPU6050. Dispone de pantalla táctil circular de 1.28 pulgadas que permite la interacción local del usuario. Los datos IMU se transmiten al nodo maestro mediante ESP-NOW siguiendo el mismo esquema de empaquetado del nodo de movimiento.</w:t>
       </w:r>
     </w:p>
     <w:p>
@@ -1021,7 +1008,7 @@
           <w:i w:val="0"/>
           <w:sz w:val="22"/>
         </w:rPr>
-        <w:t>Directorio: herramienta_who_i_am_id_interno_arduino_ide. Desarrollada en Arduino IDE para ESP32 DevKit V1. Lee el registro 0x75 (WHO_AM_I) del MPU6050 mediante I2C a 100 kHz (GPIO 21/22). El valor esperado es 0x72, correspondiente a la variante MPU6050C. Permite detectar sensores falsificados o revisiones de hardware diferentes, garantizando la integridad de los componentes antes de su integración en el sistema.</w:t>
+        <w:t>Directorio: herramienta_who_i_am_id_interno_arduino_ide. Desarrollada en Arduino IDE para ESP32 DevKit V1. Lee el registro 0x75 (WHO_AM_I) del MPU6050 mediante I2C a 100 kHz (GPIO 21/22). El valor esperado es 0x72 (variante MPU6050C). Permite detectar sensores falsificados o revisiones de hardware diferentes antes de su integración en el sistema.</w:t>
       </w:r>
     </w:p>
     <w:p>
@@ -1036,7 +1023,7 @@
           <w:i w:val="0"/>
           <w:sz w:val="22"/>
         </w:rPr>
-        <w:t>La topología de red ESP-NOW conecta los tres nodos esclavos directamente con el nodo maestro en una configuración en estrella. No se requiere punto de acceso WiFi, ya que ESP-NOW opera sobre la capa MAC de 802.11 con latencias menores a 10 ms y alcance de hasta 250 metros en línea de visión directa. La dirección MAC del nodo maestro debe configurarse en cada nodo esclavo antes del despliegue.</w:t>
+        <w:t>La topología ESP-NOW conecta los tres nodos esclavos directamente con el maestro sin requerir punto de acceso WiFi, operando sobre la capa MAC 802.11 con latencias menores a 10 ms y alcance de hasta 250 m en línea de visión. La dirección MAC del maestro debe configurarse en cada nodo esclavo antes del despliegue.</w:t>
       </w:r>
     </w:p>
     <w:p>
@@ -1071,7 +1058,7 @@
           <w:i w:val="0"/>
           <w:sz w:val="22"/>
         </w:rPr>
-        <w:t>Todos los archivos de diseño, firmware y documentación están disponibles públicamente en el repositorio de GitHub bajo licencia MIT: https://github.com/Cdcuellar/Sistemas-embebidos---Actividades-de-la-vida-diaria</w:t>
+        <w:t>Todos los archivos de diseño, firmware y documentación están disponibles públicamente bajo licencia MIT: https://github.com/Cdcuellar/Sistemas-embebidos---Actividades-de-la-vida-diaria</w:t>
       </w:r>
     </w:p>
     <w:tbl>
@@ -1100,7 +1087,6 @@
               <w:insideH w:val="single" w:sz="4" w:space="0" w:color="000000"/>
               <w:insideV w:val="single" w:sz="4" w:space="0" w:color="000000"/>
             </w:tcBorders>
-            <w:vAlign w:val="center"/>
           </w:tcPr>
           <w:p>
             <w:pPr>
@@ -1130,7 +1116,6 @@
               <w:insideH w:val="single" w:sz="4" w:space="0" w:color="000000"/>
               <w:insideV w:val="single" w:sz="4" w:space="0" w:color="000000"/>
             </w:tcBorders>
-            <w:vAlign w:val="center"/>
           </w:tcPr>
           <w:p>
             <w:pPr>
@@ -1160,7 +1145,6 @@
               <w:insideH w:val="single" w:sz="4" w:space="0" w:color="000000"/>
               <w:insideV w:val="single" w:sz="4" w:space="0" w:color="000000"/>
             </w:tcBorders>
-            <w:vAlign w:val="center"/>
           </w:tcPr>
           <w:p>
             <w:pPr>
@@ -1190,7 +1174,6 @@
               <w:insideH w:val="single" w:sz="4" w:space="0" w:color="000000"/>
               <w:insideV w:val="single" w:sz="4" w:space="0" w:color="000000"/>
             </w:tcBorders>
-            <w:vAlign w:val="center"/>
           </w:tcPr>
           <w:p>
             <w:pPr>
@@ -1222,7 +1205,6 @@
               <w:insideH w:val="single" w:sz="4" w:space="0" w:color="000000"/>
               <w:insideV w:val="single" w:sz="4" w:space="0" w:color="000000"/>
             </w:tcBorders>
-            <w:vAlign w:val="center"/>
           </w:tcPr>
           <w:p>
             <w:pPr>
@@ -1252,7 +1234,6 @@
               <w:insideH w:val="single" w:sz="4" w:space="0" w:color="000000"/>
               <w:insideV w:val="single" w:sz="4" w:space="0" w:color="000000"/>
             </w:tcBorders>
-            <w:vAlign w:val="center"/>
           </w:tcPr>
           <w:p>
             <w:pPr>
@@ -1282,7 +1263,6 @@
               <w:insideH w:val="single" w:sz="4" w:space="0" w:color="000000"/>
               <w:insideV w:val="single" w:sz="4" w:space="0" w:color="000000"/>
             </w:tcBorders>
-            <w:vAlign w:val="center"/>
           </w:tcPr>
           <w:p>
             <w:pPr>
@@ -1312,7 +1292,6 @@
               <w:insideH w:val="single" w:sz="4" w:space="0" w:color="000000"/>
               <w:insideV w:val="single" w:sz="4" w:space="0" w:color="000000"/>
             </w:tcBorders>
-            <w:vAlign w:val="center"/>
           </w:tcPr>
           <w:p>
             <w:pPr>
@@ -1343,7 +1322,6 @@
               <w:insideH w:val="single" w:sz="4" w:space="0" w:color="000000"/>
               <w:insideV w:val="single" w:sz="4" w:space="0" w:color="000000"/>
             </w:tcBorders>
-            <w:vAlign w:val="center"/>
           </w:tcPr>
           <w:p>
             <w:pPr>
@@ -1372,7 +1350,6 @@
               <w:insideH w:val="single" w:sz="4" w:space="0" w:color="000000"/>
               <w:insideV w:val="single" w:sz="4" w:space="0" w:color="000000"/>
             </w:tcBorders>
-            <w:vAlign w:val="center"/>
           </w:tcPr>
           <w:p>
             <w:pPr>
@@ -1401,7 +1378,6 @@
               <w:insideH w:val="single" w:sz="4" w:space="0" w:color="000000"/>
               <w:insideV w:val="single" w:sz="4" w:space="0" w:color="000000"/>
             </w:tcBorders>
-            <w:vAlign w:val="center"/>
           </w:tcPr>
           <w:p>
             <w:pPr>
@@ -1430,7 +1406,6 @@
               <w:insideH w:val="single" w:sz="4" w:space="0" w:color="000000"/>
               <w:insideV w:val="single" w:sz="4" w:space="0" w:color="000000"/>
             </w:tcBorders>
-            <w:vAlign w:val="center"/>
           </w:tcPr>
           <w:p>
             <w:pPr>
@@ -1444,7 +1419,7 @@
                 <w:b w:val="0"/>
                 <w:sz w:val="18"/>
               </w:rPr>
-              <w:t>Driver IMU MPU6050: inicialización, calibración, lectura de datos</w:t>
+              <w:t>Driver IMU MPU6050: inicialización, calibración, lectura</w:t>
             </w:r>
           </w:p>
         </w:tc>
@@ -1462,7 +1437,6 @@
               <w:insideH w:val="single" w:sz="4" w:space="0" w:color="000000"/>
               <w:insideV w:val="single" w:sz="4" w:space="0" w:color="000000"/>
             </w:tcBorders>
-            <w:vAlign w:val="center"/>
           </w:tcPr>
           <w:p>
             <w:pPr>
@@ -1492,7 +1466,6 @@
               <w:insideH w:val="single" w:sz="4" w:space="0" w:color="000000"/>
               <w:insideV w:val="single" w:sz="4" w:space="0" w:color="000000"/>
             </w:tcBorders>
-            <w:vAlign w:val="center"/>
           </w:tcPr>
           <w:p>
             <w:pPr>
@@ -1522,7 +1495,6 @@
               <w:insideH w:val="single" w:sz="4" w:space="0" w:color="000000"/>
               <w:insideV w:val="single" w:sz="4" w:space="0" w:color="000000"/>
             </w:tcBorders>
-            <w:vAlign w:val="center"/>
           </w:tcPr>
           <w:p>
             <w:pPr>
@@ -1552,7 +1524,6 @@
               <w:insideH w:val="single" w:sz="4" w:space="0" w:color="000000"/>
               <w:insideV w:val="single" w:sz="4" w:space="0" w:color="000000"/>
             </w:tcBorders>
-            <w:vAlign w:val="center"/>
           </w:tcPr>
           <w:p>
             <w:pPr>
@@ -1566,7 +1537,7 @@
                 <w:b w:val="0"/>
                 <w:sz w:val="18"/>
               </w:rPr>
-              <w:t>Cabecera del driver MPU6050, definición de estructuras y prototipos</w:t>
+              <w:t>Cabecera driver MPU6050, estructuras y prototipos</w:t>
             </w:r>
           </w:p>
         </w:tc>
@@ -1583,7 +1554,6 @@
               <w:insideH w:val="single" w:sz="4" w:space="0" w:color="000000"/>
               <w:insideV w:val="single" w:sz="4" w:space="0" w:color="000000"/>
             </w:tcBorders>
-            <w:vAlign w:val="center"/>
           </w:tcPr>
           <w:p>
             <w:pPr>
@@ -1612,7 +1582,6 @@
               <w:insideH w:val="single" w:sz="4" w:space="0" w:color="000000"/>
               <w:insideV w:val="single" w:sz="4" w:space="0" w:color="000000"/>
             </w:tcBorders>
-            <w:vAlign w:val="center"/>
           </w:tcPr>
           <w:p>
             <w:pPr>
@@ -1641,7 +1610,6 @@
               <w:insideH w:val="single" w:sz="4" w:space="0" w:color="000000"/>
               <w:insideV w:val="single" w:sz="4" w:space="0" w:color="000000"/>
             </w:tcBorders>
-            <w:vAlign w:val="center"/>
           </w:tcPr>
           <w:p>
             <w:pPr>
@@ -1670,7 +1638,6 @@
               <w:insideH w:val="single" w:sz="4" w:space="0" w:color="000000"/>
               <w:insideV w:val="single" w:sz="4" w:space="0" w:color="000000"/>
             </w:tcBorders>
-            <w:vAlign w:val="center"/>
           </w:tcPr>
           <w:p>
             <w:pPr>
@@ -1684,7 +1651,7 @@
                 <w:b w:val="0"/>
                 <w:sz w:val="18"/>
               </w:rPr>
-              <w:t>Firmware nodo de movimiento: lectura MPU6050 y transmisión ESP-NOW</w:t>
+              <w:t>Firmware nodo movimiento: lectura MPU6050 y TX ESP-NOW</w:t>
             </w:r>
           </w:p>
         </w:tc>
@@ -1702,7 +1669,6 @@
               <w:insideH w:val="single" w:sz="4" w:space="0" w:color="000000"/>
               <w:insideV w:val="single" w:sz="4" w:space="0" w:color="000000"/>
             </w:tcBorders>
-            <w:vAlign w:val="center"/>
           </w:tcPr>
           <w:p>
             <w:pPr>
@@ -1732,7 +1698,6 @@
               <w:insideH w:val="single" w:sz="4" w:space="0" w:color="000000"/>
               <w:insideV w:val="single" w:sz="4" w:space="0" w:color="000000"/>
             </w:tcBorders>
-            <w:vAlign w:val="center"/>
           </w:tcPr>
           <w:p>
             <w:pPr>
@@ -1762,7 +1727,6 @@
               <w:insideH w:val="single" w:sz="4" w:space="0" w:color="000000"/>
               <w:insideV w:val="single" w:sz="4" w:space="0" w:color="000000"/>
             </w:tcBorders>
-            <w:vAlign w:val="center"/>
           </w:tcPr>
           <w:p>
             <w:pPr>
@@ -1792,7 +1756,6 @@
               <w:insideH w:val="single" w:sz="4" w:space="0" w:color="000000"/>
               <w:insideV w:val="single" w:sz="4" w:space="0" w:color="000000"/>
             </w:tcBorders>
-            <w:vAlign w:val="center"/>
           </w:tcPr>
           <w:p>
             <w:pPr>
@@ -1823,7 +1786,6 @@
               <w:insideH w:val="single" w:sz="4" w:space="0" w:color="000000"/>
               <w:insideV w:val="single" w:sz="4" w:space="0" w:color="000000"/>
             </w:tcBorders>
-            <w:vAlign w:val="center"/>
           </w:tcPr>
           <w:p>
             <w:pPr>
@@ -1852,7 +1814,6 @@
               <w:insideH w:val="single" w:sz="4" w:space="0" w:color="000000"/>
               <w:insideV w:val="single" w:sz="4" w:space="0" w:color="000000"/>
             </w:tcBorders>
-            <w:vAlign w:val="center"/>
           </w:tcPr>
           <w:p>
             <w:pPr>
@@ -1881,7 +1842,6 @@
               <w:insideH w:val="single" w:sz="4" w:space="0" w:color="000000"/>
               <w:insideV w:val="single" w:sz="4" w:space="0" w:color="000000"/>
             </w:tcBorders>
-            <w:vAlign w:val="center"/>
           </w:tcPr>
           <w:p>
             <w:pPr>
@@ -1910,7 +1870,6 @@
               <w:insideH w:val="single" w:sz="4" w:space="0" w:color="000000"/>
               <w:insideV w:val="single" w:sz="4" w:space="0" w:color="000000"/>
             </w:tcBorders>
-            <w:vAlign w:val="center"/>
           </w:tcPr>
           <w:p>
             <w:pPr>
@@ -1942,7 +1901,6 @@
               <w:insideH w:val="single" w:sz="4" w:space="0" w:color="000000"/>
               <w:insideV w:val="single" w:sz="4" w:space="0" w:color="000000"/>
             </w:tcBorders>
-            <w:vAlign w:val="center"/>
           </w:tcPr>
           <w:p>
             <w:pPr>
@@ -1972,7 +1930,6 @@
               <w:insideH w:val="single" w:sz="4" w:space="0" w:color="000000"/>
               <w:insideV w:val="single" w:sz="4" w:space="0" w:color="000000"/>
             </w:tcBorders>
-            <w:vAlign w:val="center"/>
           </w:tcPr>
           <w:p>
             <w:pPr>
@@ -2002,7 +1959,6 @@
               <w:insideH w:val="single" w:sz="4" w:space="0" w:color="000000"/>
               <w:insideV w:val="single" w:sz="4" w:space="0" w:color="000000"/>
             </w:tcBorders>
-            <w:vAlign w:val="center"/>
           </w:tcPr>
           <w:p>
             <w:pPr>
@@ -2032,7 +1988,6 @@
               <w:insideH w:val="single" w:sz="4" w:space="0" w:color="000000"/>
               <w:insideV w:val="single" w:sz="4" w:space="0" w:color="000000"/>
             </w:tcBorders>
-            <w:vAlign w:val="center"/>
           </w:tcPr>
           <w:p>
             <w:pPr>
@@ -2063,7 +2018,6 @@
               <w:insideH w:val="single" w:sz="4" w:space="0" w:color="000000"/>
               <w:insideV w:val="single" w:sz="4" w:space="0" w:color="000000"/>
             </w:tcBorders>
-            <w:vAlign w:val="center"/>
           </w:tcPr>
           <w:p>
             <w:pPr>
@@ -2077,7 +2031,7 @@
                 <w:b w:val="0"/>
                 <w:sz w:val="18"/>
               </w:rPr>
-              <w:t>CMakeLists.txt (x3)</w:t>
+              <w:t>CMakeLists.txt (×3)</w:t>
             </w:r>
           </w:p>
         </w:tc>
@@ -2092,7 +2046,6 @@
               <w:insideH w:val="single" w:sz="4" w:space="0" w:color="000000"/>
               <w:insideV w:val="single" w:sz="4" w:space="0" w:color="000000"/>
             </w:tcBorders>
-            <w:vAlign w:val="center"/>
           </w:tcPr>
           <w:p>
             <w:pPr>
@@ -2121,7 +2074,6 @@
               <w:insideH w:val="single" w:sz="4" w:space="0" w:color="000000"/>
               <w:insideV w:val="single" w:sz="4" w:space="0" w:color="000000"/>
             </w:tcBorders>
-            <w:vAlign w:val="center"/>
           </w:tcPr>
           <w:p>
             <w:pPr>
@@ -2150,7 +2102,6 @@
               <w:insideH w:val="single" w:sz="4" w:space="0" w:color="000000"/>
               <w:insideV w:val="single" w:sz="4" w:space="0" w:color="000000"/>
             </w:tcBorders>
-            <w:vAlign w:val="center"/>
           </w:tcPr>
           <w:p>
             <w:pPr>
@@ -2170,7 +2121,6 @@
         </w:tc>
       </w:tr>
     </w:tbl>
-    <w:p/>
     <w:p>
       <w:pPr>
         <w:spacing w:before="120" w:after="60" w:lineRule="auto" w:line="276"/>
@@ -2188,21 +2138,6 @@
     </w:p>
     <w:p>
       <w:pPr>
-        <w:spacing w:before="0" w:after="80" w:lineRule="auto" w:line="360"/>
-        <w:jc w:val="both"/>
-      </w:pPr>
-      <w:r>
-        <w:rPr>
-          <w:rFonts w:ascii="Calibri" w:hAnsi="Calibri"/>
-          <w:b w:val="0"/>
-          <w:i w:val="0"/>
-          <w:sz w:val="22"/>
-        </w:rPr>
-        <w:t>A continuación se presenta el diagrama de bloques de la arquitectura de comunicación:</w:t>
-      </w:r>
-    </w:p>
-    <w:p>
-      <w:pPr>
         <w:spacing w:before="40" w:after="40" w:lineRule="auto" w:line="276"/>
         <w:jc w:val="left"/>
       </w:pPr>
@@ -2211,29 +2146,31 @@
           <w:rFonts w:ascii="Courier New" w:hAnsi="Courier New"/>
           <w:sz w:val="16"/>
         </w:rPr>
-        <w:t xml:space="preserve">  [Nodo Movimiento]        [Nodo Táctil S3]      [Nodo Diagnóstico]</w:t>
+        <w:t xml:space="preserve">  [Nodo Movimiento]          [Nodo Táctil S3]         [Diagnóstico]</w:t>
         <w:br/>
-        <w:t xml:space="preserve">  MPU6050 (I2C)            QMI8658 / MPU6050     Arduino WHO_AM_I</w:t>
+        <w:t xml:space="preserve">  MPU6050 (I2C)              QMI8658 / MPU6050        WHO_AM_I Tool</w:t>
         <w:br/>
-        <w:t xml:space="preserve">  GPIO21/22                GPIO21/22             GPIO21/22 (100kHz)</w:t>
+        <w:t xml:space="preserve">  Bat. Litio 3.7V/600mAh     Powerbank 20.000 mAh     USB/Serial</w:t>
         <w:br/>
-        <w:t xml:space="preserve">        |     ESP-NOW           |     ESP-NOW          |</w:t>
+        <w:t xml:space="preserve">        |     ESP-NOW              |     ESP-NOW</w:t>
         <w:br/>
-        <w:t xml:space="preserve">        +----------+------------+                      |</w:t>
+        <w:t xml:space="preserve">        +-----------+--------------+</w:t>
         <w:br/>
-        <w:t xml:space="preserve">                   |                                   |</w:t>
+        <w:t xml:space="preserve">                    |</w:t>
         <w:br/>
-        <w:t xml:space="preserve">          [NODO MAESTRO – ESP32 DevKit V1]             |</w:t>
+        <w:t xml:space="preserve">           [NODO MAESTRO – ESP32 DevKit V1]</w:t>
         <w:br/>
-        <w:t xml:space="preserve">          ┌──────────────────────────────┐             |</w:t>
+        <w:t xml:space="preserve">           ┌──────────────────────────────┐</w:t>
         <w:br/>
-        <w:t xml:space="preserve">          │ ADC HR      GPIO 34           │&lt;───────────+</w:t>
+        <w:t xml:space="preserve">           │ Portapilas 4×AA (6V)          │</w:t>
         <w:br/>
-        <w:t xml:space="preserve">          │ RTC DS3231  I2C GPIO 21/22    │</w:t>
+        <w:t xml:space="preserve">           │ ADC HR      GPIO 34           │</w:t>
         <w:br/>
-        <w:t xml:space="preserve">          │ MicroSD     SPI GPIO 5/18/19/23│</w:t>
+        <w:t xml:space="preserve">           │ RTC DS3231  I2C GPIO 21/22    │</w:t>
         <w:br/>
-        <w:t xml:space="preserve">          └──────────────────────────────┘</w:t>
+        <w:t xml:space="preserve">           │ MicroSD     SPI GPIO 5/18/19/23│</w:t>
+        <w:br/>
+        <w:t xml:space="preserve">           └──────────────────────────────┘</w:t>
       </w:r>
     </w:p>
     <w:p/>
@@ -2264,7 +2201,7 @@
           <w:i w:val="0"/>
           <w:sz w:val="22"/>
         </w:rPr>
-        <w:t>Los precios indicados corresponden a valores de mercado vigentes en 2026 para Latinoamérica (AliExpress, Mercado Libre Colombia, Mercado Libre México). Se incluyen equivalencias en COP, MXN, EUR y ARS.</w:t>
+        <w:t>Precios de mercado 2026 para Latinoamérica (AliExpress, Mercado Libre Colombia/México). Se incluyen las fuentes de alimentación de cada nodo.</w:t>
       </w:r>
     </w:p>
     <w:tbl>
@@ -2296,7 +2233,6 @@
               <w:insideH w:val="single" w:sz="4" w:space="0" w:color="000000"/>
               <w:insideV w:val="single" w:sz="4" w:space="0" w:color="000000"/>
             </w:tcBorders>
-            <w:vAlign w:val="center"/>
           </w:tcPr>
           <w:p>
             <w:pPr>
@@ -2326,7 +2262,6 @@
               <w:insideH w:val="single" w:sz="4" w:space="0" w:color="000000"/>
               <w:insideV w:val="single" w:sz="4" w:space="0" w:color="000000"/>
             </w:tcBorders>
-            <w:vAlign w:val="center"/>
           </w:tcPr>
           <w:p>
             <w:pPr>
@@ -2356,7 +2291,6 @@
               <w:insideH w:val="single" w:sz="4" w:space="0" w:color="000000"/>
               <w:insideV w:val="single" w:sz="4" w:space="0" w:color="000000"/>
             </w:tcBorders>
-            <w:vAlign w:val="center"/>
           </w:tcPr>
           <w:p>
             <w:pPr>
@@ -2386,7 +2320,6 @@
               <w:insideH w:val="single" w:sz="4" w:space="0" w:color="000000"/>
               <w:insideV w:val="single" w:sz="4" w:space="0" w:color="000000"/>
             </w:tcBorders>
-            <w:vAlign w:val="center"/>
           </w:tcPr>
           <w:p>
             <w:pPr>
@@ -2418,7 +2351,6 @@
               <w:insideH w:val="single" w:sz="4" w:space="0" w:color="000000"/>
               <w:insideV w:val="single" w:sz="4" w:space="0" w:color="000000"/>
             </w:tcBorders>
-            <w:vAlign w:val="center"/>
           </w:tcPr>
           <w:p>
             <w:pPr>
@@ -2450,7 +2382,6 @@
               <w:insideH w:val="single" w:sz="4" w:space="0" w:color="000000"/>
               <w:insideV w:val="single" w:sz="4" w:space="0" w:color="000000"/>
             </w:tcBorders>
-            <w:vAlign w:val="center"/>
           </w:tcPr>
           <w:p>
             <w:pPr>
@@ -2480,7 +2411,6 @@
               <w:insideH w:val="single" w:sz="4" w:space="0" w:color="000000"/>
               <w:insideV w:val="single" w:sz="4" w:space="0" w:color="000000"/>
             </w:tcBorders>
-            <w:vAlign w:val="center"/>
           </w:tcPr>
           <w:p>
             <w:pPr>
@@ -2512,7 +2442,6 @@
               <w:insideH w:val="single" w:sz="4" w:space="0" w:color="000000"/>
               <w:insideV w:val="single" w:sz="4" w:space="0" w:color="000000"/>
             </w:tcBorders>
-            <w:vAlign w:val="center"/>
           </w:tcPr>
           <w:p>
             <w:pPr>
@@ -2542,7 +2471,6 @@
               <w:insideH w:val="single" w:sz="4" w:space="0" w:color="000000"/>
               <w:insideV w:val="single" w:sz="4" w:space="0" w:color="000000"/>
             </w:tcBorders>
-            <w:vAlign w:val="center"/>
           </w:tcPr>
           <w:p>
             <w:pPr>
@@ -2572,7 +2500,6 @@
               <w:insideH w:val="single" w:sz="4" w:space="0" w:color="000000"/>
               <w:insideV w:val="single" w:sz="4" w:space="0" w:color="000000"/>
             </w:tcBorders>
-            <w:vAlign w:val="center"/>
           </w:tcPr>
           <w:p>
             <w:pPr>
@@ -2602,7 +2529,6 @@
               <w:insideH w:val="single" w:sz="4" w:space="0" w:color="000000"/>
               <w:insideV w:val="single" w:sz="4" w:space="0" w:color="000000"/>
             </w:tcBorders>
-            <w:vAlign w:val="center"/>
           </w:tcPr>
           <w:p>
             <w:pPr>
@@ -2632,7 +2558,6 @@
               <w:insideH w:val="single" w:sz="4" w:space="0" w:color="000000"/>
               <w:insideV w:val="single" w:sz="4" w:space="0" w:color="000000"/>
             </w:tcBorders>
-            <w:vAlign w:val="center"/>
           </w:tcPr>
           <w:p>
             <w:pPr>
@@ -2662,7 +2587,6 @@
               <w:insideH w:val="single" w:sz="4" w:space="0" w:color="000000"/>
               <w:insideV w:val="single" w:sz="4" w:space="0" w:color="000000"/>
             </w:tcBorders>
-            <w:vAlign w:val="center"/>
           </w:tcPr>
           <w:p>
             <w:pPr>
@@ -2692,7 +2616,6 @@
               <w:insideH w:val="single" w:sz="4" w:space="0" w:color="000000"/>
               <w:insideV w:val="single" w:sz="4" w:space="0" w:color="000000"/>
             </w:tcBorders>
-            <w:vAlign w:val="center"/>
           </w:tcPr>
           <w:p>
             <w:pPr>
@@ -2723,7 +2646,6 @@
               <w:insideH w:val="single" w:sz="4" w:space="0" w:color="000000"/>
               <w:insideV w:val="single" w:sz="4" w:space="0" w:color="000000"/>
             </w:tcBorders>
-            <w:vAlign w:val="center"/>
           </w:tcPr>
           <w:p>
             <w:pPr>
@@ -2752,7 +2674,6 @@
               <w:insideH w:val="single" w:sz="4" w:space="0" w:color="000000"/>
               <w:insideV w:val="single" w:sz="4" w:space="0" w:color="000000"/>
             </w:tcBorders>
-            <w:vAlign w:val="center"/>
           </w:tcPr>
           <w:p>
             <w:pPr>
@@ -2781,7 +2702,6 @@
               <w:insideH w:val="single" w:sz="4" w:space="0" w:color="000000"/>
               <w:insideV w:val="single" w:sz="4" w:space="0" w:color="000000"/>
             </w:tcBorders>
-            <w:vAlign w:val="center"/>
           </w:tcPr>
           <w:p>
             <w:pPr>
@@ -2810,7 +2730,6 @@
               <w:insideH w:val="single" w:sz="4" w:space="0" w:color="000000"/>
               <w:insideV w:val="single" w:sz="4" w:space="0" w:color="000000"/>
             </w:tcBorders>
-            <w:vAlign w:val="center"/>
           </w:tcPr>
           <w:p>
             <w:pPr>
@@ -2839,7 +2758,6 @@
               <w:insideH w:val="single" w:sz="4" w:space="0" w:color="000000"/>
               <w:insideV w:val="single" w:sz="4" w:space="0" w:color="000000"/>
             </w:tcBorders>
-            <w:vAlign w:val="center"/>
           </w:tcPr>
           <w:p>
             <w:pPr>
@@ -2868,7 +2786,6 @@
               <w:insideH w:val="single" w:sz="4" w:space="0" w:color="000000"/>
               <w:insideV w:val="single" w:sz="4" w:space="0" w:color="000000"/>
             </w:tcBorders>
-            <w:vAlign w:val="center"/>
           </w:tcPr>
           <w:p>
             <w:pPr>
@@ -2897,7 +2814,6 @@
               <w:insideH w:val="single" w:sz="4" w:space="0" w:color="000000"/>
               <w:insideV w:val="single" w:sz="4" w:space="0" w:color="000000"/>
             </w:tcBorders>
-            <w:vAlign w:val="center"/>
           </w:tcPr>
           <w:p>
             <w:pPr>
@@ -2929,7 +2845,6 @@
               <w:insideH w:val="single" w:sz="4" w:space="0" w:color="000000"/>
               <w:insideV w:val="single" w:sz="4" w:space="0" w:color="000000"/>
             </w:tcBorders>
-            <w:vAlign w:val="center"/>
           </w:tcPr>
           <w:p>
             <w:pPr>
@@ -2959,7 +2874,6 @@
               <w:insideH w:val="single" w:sz="4" w:space="0" w:color="000000"/>
               <w:insideV w:val="single" w:sz="4" w:space="0" w:color="000000"/>
             </w:tcBorders>
-            <w:vAlign w:val="center"/>
           </w:tcPr>
           <w:p>
             <w:pPr>
@@ -2989,7 +2903,6 @@
               <w:insideH w:val="single" w:sz="4" w:space="0" w:color="000000"/>
               <w:insideV w:val="single" w:sz="4" w:space="0" w:color="000000"/>
             </w:tcBorders>
-            <w:vAlign w:val="center"/>
           </w:tcPr>
           <w:p>
             <w:pPr>
@@ -3019,7 +2932,6 @@
               <w:insideH w:val="single" w:sz="4" w:space="0" w:color="000000"/>
               <w:insideV w:val="single" w:sz="4" w:space="0" w:color="000000"/>
             </w:tcBorders>
-            <w:vAlign w:val="center"/>
           </w:tcPr>
           <w:p>
             <w:pPr>
@@ -3049,7 +2961,6 @@
               <w:insideH w:val="single" w:sz="4" w:space="0" w:color="000000"/>
               <w:insideV w:val="single" w:sz="4" w:space="0" w:color="000000"/>
             </w:tcBorders>
-            <w:vAlign w:val="center"/>
           </w:tcPr>
           <w:p>
             <w:pPr>
@@ -3079,7 +2990,6 @@
               <w:insideH w:val="single" w:sz="4" w:space="0" w:color="000000"/>
               <w:insideV w:val="single" w:sz="4" w:space="0" w:color="000000"/>
             </w:tcBorders>
-            <w:vAlign w:val="center"/>
           </w:tcPr>
           <w:p>
             <w:pPr>
@@ -3109,7 +3019,6 @@
               <w:insideH w:val="single" w:sz="4" w:space="0" w:color="000000"/>
               <w:insideV w:val="single" w:sz="4" w:space="0" w:color="000000"/>
             </w:tcBorders>
-            <w:vAlign w:val="center"/>
           </w:tcPr>
           <w:p>
             <w:pPr>
@@ -3140,7 +3049,6 @@
               <w:insideH w:val="single" w:sz="4" w:space="0" w:color="000000"/>
               <w:insideV w:val="single" w:sz="4" w:space="0" w:color="000000"/>
             </w:tcBorders>
-            <w:vAlign w:val="center"/>
           </w:tcPr>
           <w:p>
             <w:pPr>
@@ -3169,7 +3077,6 @@
               <w:insideH w:val="single" w:sz="4" w:space="0" w:color="000000"/>
               <w:insideV w:val="single" w:sz="4" w:space="0" w:color="000000"/>
             </w:tcBorders>
-            <w:vAlign w:val="center"/>
           </w:tcPr>
           <w:p>
             <w:pPr>
@@ -3198,7 +3105,6 @@
               <w:insideH w:val="single" w:sz="4" w:space="0" w:color="000000"/>
               <w:insideV w:val="single" w:sz="4" w:space="0" w:color="000000"/>
             </w:tcBorders>
-            <w:vAlign w:val="center"/>
           </w:tcPr>
           <w:p>
             <w:pPr>
@@ -3227,7 +3133,6 @@
               <w:insideH w:val="single" w:sz="4" w:space="0" w:color="000000"/>
               <w:insideV w:val="single" w:sz="4" w:space="0" w:color="000000"/>
             </w:tcBorders>
-            <w:vAlign w:val="center"/>
           </w:tcPr>
           <w:p>
             <w:pPr>
@@ -3256,7 +3161,6 @@
               <w:insideH w:val="single" w:sz="4" w:space="0" w:color="000000"/>
               <w:insideV w:val="single" w:sz="4" w:space="0" w:color="000000"/>
             </w:tcBorders>
-            <w:vAlign w:val="center"/>
           </w:tcPr>
           <w:p>
             <w:pPr>
@@ -3285,7 +3189,6 @@
               <w:insideH w:val="single" w:sz="4" w:space="0" w:color="000000"/>
               <w:insideV w:val="single" w:sz="4" w:space="0" w:color="000000"/>
             </w:tcBorders>
-            <w:vAlign w:val="center"/>
           </w:tcPr>
           <w:p>
             <w:pPr>
@@ -3314,7 +3217,6 @@
               <w:insideH w:val="single" w:sz="4" w:space="0" w:color="000000"/>
               <w:insideV w:val="single" w:sz="4" w:space="0" w:color="000000"/>
             </w:tcBorders>
-            <w:vAlign w:val="center"/>
           </w:tcPr>
           <w:p>
             <w:pPr>
@@ -3346,7 +3248,6 @@
               <w:insideH w:val="single" w:sz="4" w:space="0" w:color="000000"/>
               <w:insideV w:val="single" w:sz="4" w:space="0" w:color="000000"/>
             </w:tcBorders>
-            <w:vAlign w:val="center"/>
           </w:tcPr>
           <w:p>
             <w:pPr>
@@ -3376,7 +3277,6 @@
               <w:insideH w:val="single" w:sz="4" w:space="0" w:color="000000"/>
               <w:insideV w:val="single" w:sz="4" w:space="0" w:color="000000"/>
             </w:tcBorders>
-            <w:vAlign w:val="center"/>
           </w:tcPr>
           <w:p>
             <w:pPr>
@@ -3406,7 +3306,6 @@
               <w:insideH w:val="single" w:sz="4" w:space="0" w:color="000000"/>
               <w:insideV w:val="single" w:sz="4" w:space="0" w:color="000000"/>
             </w:tcBorders>
-            <w:vAlign w:val="center"/>
           </w:tcPr>
           <w:p>
             <w:pPr>
@@ -3436,7 +3335,6 @@
               <w:insideH w:val="single" w:sz="4" w:space="0" w:color="000000"/>
               <w:insideV w:val="single" w:sz="4" w:space="0" w:color="000000"/>
             </w:tcBorders>
-            <w:vAlign w:val="center"/>
           </w:tcPr>
           <w:p>
             <w:pPr>
@@ -3466,7 +3364,6 @@
               <w:insideH w:val="single" w:sz="4" w:space="0" w:color="000000"/>
               <w:insideV w:val="single" w:sz="4" w:space="0" w:color="000000"/>
             </w:tcBorders>
-            <w:vAlign w:val="center"/>
           </w:tcPr>
           <w:p>
             <w:pPr>
@@ -3496,7 +3393,6 @@
               <w:insideH w:val="single" w:sz="4" w:space="0" w:color="000000"/>
               <w:insideV w:val="single" w:sz="4" w:space="0" w:color="000000"/>
             </w:tcBorders>
-            <w:vAlign w:val="center"/>
           </w:tcPr>
           <w:p>
             <w:pPr>
@@ -3526,7 +3422,6 @@
               <w:insideH w:val="single" w:sz="4" w:space="0" w:color="000000"/>
               <w:insideV w:val="single" w:sz="4" w:space="0" w:color="000000"/>
             </w:tcBorders>
-            <w:vAlign w:val="center"/>
           </w:tcPr>
           <w:p>
             <w:pPr>
@@ -3557,7 +3452,6 @@
               <w:insideH w:val="single" w:sz="4" w:space="0" w:color="000000"/>
               <w:insideV w:val="single" w:sz="4" w:space="0" w:color="000000"/>
             </w:tcBorders>
-            <w:vAlign w:val="center"/>
           </w:tcPr>
           <w:p>
             <w:pPr>
@@ -3571,7 +3465,7 @@
                 <w:b w:val="0"/>
                 <w:sz w:val="18"/>
               </w:rPr>
-              <w:t>R1, R2</w:t>
+              <w:t>BAT1</w:t>
             </w:r>
           </w:p>
         </w:tc>
@@ -3586,7 +3480,6 @@
               <w:insideH w:val="single" w:sz="4" w:space="0" w:color="000000"/>
               <w:insideV w:val="single" w:sz="4" w:space="0" w:color="000000"/>
             </w:tcBorders>
-            <w:vAlign w:val="center"/>
           </w:tcPr>
           <w:p>
             <w:pPr>
@@ -3600,7 +3493,7 @@
                 <w:b w:val="0"/>
                 <w:sz w:val="18"/>
               </w:rPr>
-              <w:t>Resistencia 4.7 kΩ, 1/4 W, ±5% (pull-up I2C)</w:t>
+              <w:t>Batería de litio 3.7 V / 600 mAh (Nodo Movimiento)</w:t>
             </w:r>
           </w:p>
         </w:tc>
@@ -3615,7 +3508,6 @@
               <w:insideH w:val="single" w:sz="4" w:space="0" w:color="000000"/>
               <w:insideV w:val="single" w:sz="4" w:space="0" w:color="000000"/>
             </w:tcBorders>
-            <w:vAlign w:val="center"/>
           </w:tcPr>
           <w:p>
             <w:pPr>
@@ -3629,7 +3521,7 @@
                 <w:b w:val="0"/>
                 <w:sz w:val="18"/>
               </w:rPr>
-              <w:t>2</w:t>
+              <w:t>1</w:t>
             </w:r>
           </w:p>
         </w:tc>
@@ -3644,7 +3536,6 @@
               <w:insideH w:val="single" w:sz="4" w:space="0" w:color="000000"/>
               <w:insideV w:val="single" w:sz="4" w:space="0" w:color="000000"/>
             </w:tcBorders>
-            <w:vAlign w:val="center"/>
           </w:tcPr>
           <w:p>
             <w:pPr>
@@ -3658,7 +3549,7 @@
                 <w:b w:val="0"/>
                 <w:sz w:val="18"/>
               </w:rPr>
-              <w:t>$0.10</w:t>
+              <w:t>$3.00</w:t>
             </w:r>
           </w:p>
         </w:tc>
@@ -3673,7 +3564,6 @@
               <w:insideH w:val="single" w:sz="4" w:space="0" w:color="000000"/>
               <w:insideV w:val="single" w:sz="4" w:space="0" w:color="000000"/>
             </w:tcBorders>
-            <w:vAlign w:val="center"/>
           </w:tcPr>
           <w:p>
             <w:pPr>
@@ -3687,7 +3577,7 @@
                 <w:b w:val="0"/>
                 <w:sz w:val="18"/>
               </w:rPr>
-              <w:t>$0.20</w:t>
+              <w:t>$3.00</w:t>
             </w:r>
           </w:p>
         </w:tc>
@@ -3702,7 +3592,6 @@
               <w:insideH w:val="single" w:sz="4" w:space="0" w:color="000000"/>
               <w:insideV w:val="single" w:sz="4" w:space="0" w:color="000000"/>
             </w:tcBorders>
-            <w:vAlign w:val="center"/>
           </w:tcPr>
           <w:p>
             <w:pPr>
@@ -3716,7 +3605,7 @@
                 <w:b w:val="0"/>
                 <w:sz w:val="18"/>
               </w:rPr>
-              <w:t>Local / AliExpress</w:t>
+              <w:t>AliExpress</w:t>
             </w:r>
           </w:p>
         </w:tc>
@@ -3731,7 +3620,6 @@
               <w:insideH w:val="single" w:sz="4" w:space="0" w:color="000000"/>
               <w:insideV w:val="single" w:sz="4" w:space="0" w:color="000000"/>
             </w:tcBorders>
-            <w:vAlign w:val="center"/>
           </w:tcPr>
           <w:p>
             <w:pPr>
@@ -3745,7 +3633,7 @@
                 <w:b w:val="0"/>
                 <w:sz w:val="18"/>
               </w:rPr>
-              <w:t>Metal film</w:t>
+              <w:t>Electroquímico</w:t>
             </w:r>
           </w:p>
         </w:tc>
@@ -3763,7 +3651,6 @@
               <w:insideH w:val="single" w:sz="4" w:space="0" w:color="000000"/>
               <w:insideV w:val="single" w:sz="4" w:space="0" w:color="000000"/>
             </w:tcBorders>
-            <w:vAlign w:val="center"/>
           </w:tcPr>
           <w:p>
             <w:pPr>
@@ -3777,7 +3664,7 @@
                 <w:b w:val="0"/>
                 <w:sz w:val="18"/>
               </w:rPr>
-              <w:t>J1–J16</w:t>
+              <w:t>CHG1</w:t>
             </w:r>
           </w:p>
         </w:tc>
@@ -3793,7 +3680,6 @@
               <w:insideH w:val="single" w:sz="4" w:space="0" w:color="000000"/>
               <w:insideV w:val="single" w:sz="4" w:space="0" w:color="000000"/>
             </w:tcBorders>
-            <w:vAlign w:val="center"/>
           </w:tcPr>
           <w:p>
             <w:pPr>
@@ -3807,7 +3693,7 @@
                 <w:b w:val="0"/>
                 <w:sz w:val="18"/>
               </w:rPr>
-              <w:t>Cables Jumper macho-hembra, 20 cm</w:t>
+              <w:t>Módulo cargador TP4056 micro-USB (para BAT1)</w:t>
             </w:r>
           </w:p>
         </w:tc>
@@ -3823,7 +3709,6 @@
               <w:insideH w:val="single" w:sz="4" w:space="0" w:color="000000"/>
               <w:insideV w:val="single" w:sz="4" w:space="0" w:color="000000"/>
             </w:tcBorders>
-            <w:vAlign w:val="center"/>
           </w:tcPr>
           <w:p>
             <w:pPr>
@@ -3837,7 +3722,7 @@
                 <w:b w:val="0"/>
                 <w:sz w:val="18"/>
               </w:rPr>
-              <w:t>16</w:t>
+              <w:t>1</w:t>
             </w:r>
           </w:p>
         </w:tc>
@@ -3853,7 +3738,6 @@
               <w:insideH w:val="single" w:sz="4" w:space="0" w:color="000000"/>
               <w:insideV w:val="single" w:sz="4" w:space="0" w:color="000000"/>
             </w:tcBorders>
-            <w:vAlign w:val="center"/>
           </w:tcPr>
           <w:p>
             <w:pPr>
@@ -3867,7 +3751,7 @@
                 <w:b w:val="0"/>
                 <w:sz w:val="18"/>
               </w:rPr>
-              <w:t>$0.08</w:t>
+              <w:t>$0.80</w:t>
             </w:r>
           </w:p>
         </w:tc>
@@ -3883,7 +3767,6 @@
               <w:insideH w:val="single" w:sz="4" w:space="0" w:color="000000"/>
               <w:insideV w:val="single" w:sz="4" w:space="0" w:color="000000"/>
             </w:tcBorders>
-            <w:vAlign w:val="center"/>
           </w:tcPr>
           <w:p>
             <w:pPr>
@@ -3897,7 +3780,7 @@
                 <w:b w:val="0"/>
                 <w:sz w:val="18"/>
               </w:rPr>
-              <w:t>$1.20</w:t>
+              <w:t>$0.80</w:t>
             </w:r>
           </w:p>
         </w:tc>
@@ -3913,7 +3796,6 @@
               <w:insideH w:val="single" w:sz="4" w:space="0" w:color="000000"/>
               <w:insideV w:val="single" w:sz="4" w:space="0" w:color="000000"/>
             </w:tcBorders>
-            <w:vAlign w:val="center"/>
           </w:tcPr>
           <w:p>
             <w:pPr>
@@ -3943,7 +3825,6 @@
               <w:insideH w:val="single" w:sz="4" w:space="0" w:color="000000"/>
               <w:insideV w:val="single" w:sz="4" w:space="0" w:color="000000"/>
             </w:tcBorders>
-            <w:vAlign w:val="center"/>
           </w:tcPr>
           <w:p>
             <w:pPr>
@@ -3957,7 +3838,7 @@
                 <w:b w:val="0"/>
                 <w:sz w:val="18"/>
               </w:rPr>
-              <w:t>Polímero</w:t>
+              <w:t>Semiconductor</w:t>
             </w:r>
           </w:p>
         </w:tc>
@@ -3974,7 +3855,6 @@
               <w:insideH w:val="single" w:sz="4" w:space="0" w:color="000000"/>
               <w:insideV w:val="single" w:sz="4" w:space="0" w:color="000000"/>
             </w:tcBorders>
-            <w:vAlign w:val="center"/>
           </w:tcPr>
           <w:p>
             <w:pPr>
@@ -3988,7 +3868,7 @@
                 <w:b w:val="0"/>
                 <w:sz w:val="18"/>
               </w:rPr>
-              <w:t>PCB1</w:t>
+              <w:t>PB1</w:t>
             </w:r>
           </w:p>
         </w:tc>
@@ -4003,7 +3883,6 @@
               <w:insideH w:val="single" w:sz="4" w:space="0" w:color="000000"/>
               <w:insideV w:val="single" w:sz="4" w:space="0" w:color="000000"/>
             </w:tcBorders>
-            <w:vAlign w:val="center"/>
           </w:tcPr>
           <w:p>
             <w:pPr>
@@ -4017,7 +3896,7 @@
                 <w:b w:val="0"/>
                 <w:sz w:val="18"/>
               </w:rPr>
-              <w:t>PCB prototipo 5×7 cm (breadboard o perforada)</w:t>
+              <w:t>Powerbank 20.000 mAh USB-C (Nodo Táctil S3)</w:t>
             </w:r>
           </w:p>
         </w:tc>
@@ -4032,7 +3911,6 @@
               <w:insideH w:val="single" w:sz="4" w:space="0" w:color="000000"/>
               <w:insideV w:val="single" w:sz="4" w:space="0" w:color="000000"/>
             </w:tcBorders>
-            <w:vAlign w:val="center"/>
           </w:tcPr>
           <w:p>
             <w:pPr>
@@ -4061,7 +3939,208 @@
               <w:insideH w:val="single" w:sz="4" w:space="0" w:color="000000"/>
               <w:insideV w:val="single" w:sz="4" w:space="0" w:color="000000"/>
             </w:tcBorders>
-            <w:vAlign w:val="center"/>
+          </w:tcPr>
+          <w:p>
+            <w:pPr>
+              <w:spacing w:before="20" w:after="20" w:lineRule="auto" w:line="276"/>
+              <w:jc w:val="center"/>
+            </w:pPr>
+            <w:r/>
+            <w:r>
+              <w:rPr>
+                <w:rFonts w:ascii="Calibri" w:hAnsi="Calibri"/>
+                <w:b w:val="0"/>
+                <w:sz w:val="18"/>
+              </w:rPr>
+              <w:t>$15.00</w:t>
+            </w:r>
+          </w:p>
+        </w:tc>
+        <w:tc>
+          <w:tcPr>
+            <w:tcW w:type="dxa" w:w="1506"/>
+            <w:tcBorders>
+              <w:top w:val="single" w:sz="4" w:space="0" w:color="000000"/>
+              <w:left w:val="single" w:sz="4" w:space="0" w:color="000000"/>
+              <w:bottom w:val="single" w:sz="4" w:space="0" w:color="000000"/>
+              <w:right w:val="single" w:sz="4" w:space="0" w:color="000000"/>
+              <w:insideH w:val="single" w:sz="4" w:space="0" w:color="000000"/>
+              <w:insideV w:val="single" w:sz="4" w:space="0" w:color="000000"/>
+            </w:tcBorders>
+          </w:tcPr>
+          <w:p>
+            <w:pPr>
+              <w:spacing w:before="20" w:after="20" w:lineRule="auto" w:line="276"/>
+              <w:jc w:val="center"/>
+            </w:pPr>
+            <w:r/>
+            <w:r>
+              <w:rPr>
+                <w:rFonts w:ascii="Calibri" w:hAnsi="Calibri"/>
+                <w:b w:val="0"/>
+                <w:sz w:val="18"/>
+              </w:rPr>
+              <w:t>$15.00</w:t>
+            </w:r>
+          </w:p>
+        </w:tc>
+        <w:tc>
+          <w:tcPr>
+            <w:tcW w:type="dxa" w:w="1506"/>
+            <w:tcBorders>
+              <w:top w:val="single" w:sz="4" w:space="0" w:color="000000"/>
+              <w:left w:val="single" w:sz="4" w:space="0" w:color="000000"/>
+              <w:bottom w:val="single" w:sz="4" w:space="0" w:color="000000"/>
+              <w:right w:val="single" w:sz="4" w:space="0" w:color="000000"/>
+              <w:insideH w:val="single" w:sz="4" w:space="0" w:color="000000"/>
+              <w:insideV w:val="single" w:sz="4" w:space="0" w:color="000000"/>
+            </w:tcBorders>
+          </w:tcPr>
+          <w:p>
+            <w:pPr>
+              <w:spacing w:before="20" w:after="20" w:lineRule="auto" w:line="276"/>
+              <w:jc w:val="left"/>
+            </w:pPr>
+            <w:r/>
+            <w:r>
+              <w:rPr>
+                <w:rFonts w:ascii="Calibri" w:hAnsi="Calibri"/>
+                <w:b w:val="0"/>
+                <w:sz w:val="18"/>
+              </w:rPr>
+              <w:t>Mercado Libre</w:t>
+            </w:r>
+          </w:p>
+        </w:tc>
+        <w:tc>
+          <w:tcPr>
+            <w:tcW w:type="dxa" w:w="1506"/>
+            <w:tcBorders>
+              <w:top w:val="single" w:sz="4" w:space="0" w:color="000000"/>
+              <w:left w:val="single" w:sz="4" w:space="0" w:color="000000"/>
+              <w:bottom w:val="single" w:sz="4" w:space="0" w:color="000000"/>
+              <w:right w:val="single" w:sz="4" w:space="0" w:color="000000"/>
+              <w:insideH w:val="single" w:sz="4" w:space="0" w:color="000000"/>
+              <w:insideV w:val="single" w:sz="4" w:space="0" w:color="000000"/>
+            </w:tcBorders>
+          </w:tcPr>
+          <w:p>
+            <w:pPr>
+              <w:spacing w:before="20" w:after="20" w:lineRule="auto" w:line="276"/>
+              <w:jc w:val="left"/>
+            </w:pPr>
+            <w:r/>
+            <w:r>
+              <w:rPr>
+                <w:rFonts w:ascii="Calibri" w:hAnsi="Calibri"/>
+                <w:b w:val="0"/>
+                <w:sz w:val="18"/>
+              </w:rPr>
+              <w:t>Electroquímico</w:t>
+            </w:r>
+          </w:p>
+        </w:tc>
+      </w:tr>
+      <w:tr>
+        <w:tc>
+          <w:tcPr>
+            <w:tcW w:type="dxa" w:w="1506"/>
+            <w:shd w:val="clear" w:color="auto" w:fill="F2F8FF"/>
+            <w:tcBorders>
+              <w:top w:val="single" w:sz="4" w:space="0" w:color="000000"/>
+              <w:left w:val="single" w:sz="4" w:space="0" w:color="000000"/>
+              <w:bottom w:val="single" w:sz="4" w:space="0" w:color="000000"/>
+              <w:right w:val="single" w:sz="4" w:space="0" w:color="000000"/>
+              <w:insideH w:val="single" w:sz="4" w:space="0" w:color="000000"/>
+              <w:insideV w:val="single" w:sz="4" w:space="0" w:color="000000"/>
+            </w:tcBorders>
+          </w:tcPr>
+          <w:p>
+            <w:pPr>
+              <w:spacing w:before="20" w:after="20" w:lineRule="auto" w:line="276"/>
+              <w:jc w:val="left"/>
+            </w:pPr>
+            <w:r/>
+            <w:r>
+              <w:rPr>
+                <w:rFonts w:ascii="Calibri" w:hAnsi="Calibri"/>
+                <w:b w:val="0"/>
+                <w:sz w:val="18"/>
+              </w:rPr>
+              <w:t>PP1</w:t>
+            </w:r>
+          </w:p>
+        </w:tc>
+        <w:tc>
+          <w:tcPr>
+            <w:tcW w:type="dxa" w:w="1506"/>
+            <w:shd w:val="clear" w:color="auto" w:fill="F2F8FF"/>
+            <w:tcBorders>
+              <w:top w:val="single" w:sz="4" w:space="0" w:color="000000"/>
+              <w:left w:val="single" w:sz="4" w:space="0" w:color="000000"/>
+              <w:bottom w:val="single" w:sz="4" w:space="0" w:color="000000"/>
+              <w:right w:val="single" w:sz="4" w:space="0" w:color="000000"/>
+              <w:insideH w:val="single" w:sz="4" w:space="0" w:color="000000"/>
+              <w:insideV w:val="single" w:sz="4" w:space="0" w:color="000000"/>
+            </w:tcBorders>
+          </w:tcPr>
+          <w:p>
+            <w:pPr>
+              <w:spacing w:before="20" w:after="20" w:lineRule="auto" w:line="276"/>
+              <w:jc w:val="left"/>
+            </w:pPr>
+            <w:r/>
+            <w:r>
+              <w:rPr>
+                <w:rFonts w:ascii="Calibri" w:hAnsi="Calibri"/>
+                <w:b w:val="0"/>
+                <w:sz w:val="18"/>
+              </w:rPr>
+              <w:t>Portapilas 4×AA con tapa y switch ON/OFF (Nodo Maestro)</w:t>
+            </w:r>
+          </w:p>
+        </w:tc>
+        <w:tc>
+          <w:tcPr>
+            <w:tcW w:type="dxa" w:w="1506"/>
+            <w:shd w:val="clear" w:color="auto" w:fill="F2F8FF"/>
+            <w:tcBorders>
+              <w:top w:val="single" w:sz="4" w:space="0" w:color="000000"/>
+              <w:left w:val="single" w:sz="4" w:space="0" w:color="000000"/>
+              <w:bottom w:val="single" w:sz="4" w:space="0" w:color="000000"/>
+              <w:right w:val="single" w:sz="4" w:space="0" w:color="000000"/>
+              <w:insideH w:val="single" w:sz="4" w:space="0" w:color="000000"/>
+              <w:insideV w:val="single" w:sz="4" w:space="0" w:color="000000"/>
+            </w:tcBorders>
+          </w:tcPr>
+          <w:p>
+            <w:pPr>
+              <w:spacing w:before="20" w:after="20" w:lineRule="auto" w:line="276"/>
+              <w:jc w:val="center"/>
+            </w:pPr>
+            <w:r/>
+            <w:r>
+              <w:rPr>
+                <w:rFonts w:ascii="Calibri" w:hAnsi="Calibri"/>
+                <w:b w:val="0"/>
+                <w:sz w:val="18"/>
+              </w:rPr>
+              <w:t>1</w:t>
+            </w:r>
+          </w:p>
+        </w:tc>
+        <w:tc>
+          <w:tcPr>
+            <w:tcW w:type="dxa" w:w="1506"/>
+            <w:shd w:val="clear" w:color="auto" w:fill="F2F8FF"/>
+            <w:tcBorders>
+              <w:top w:val="single" w:sz="4" w:space="0" w:color="000000"/>
+              <w:left w:val="single" w:sz="4" w:space="0" w:color="000000"/>
+              <w:bottom w:val="single" w:sz="4" w:space="0" w:color="000000"/>
+              <w:right w:val="single" w:sz="4" w:space="0" w:color="000000"/>
+              <w:insideH w:val="single" w:sz="4" w:space="0" w:color="000000"/>
+              <w:insideV w:val="single" w:sz="4" w:space="0" w:color="000000"/>
+            </w:tcBorders>
           </w:tcPr>
           <w:p>
             <w:pPr>
@@ -4082,6 +4161,7 @@
         <w:tc>
           <w:tcPr>
             <w:tcW w:type="dxa" w:w="1506"/>
+            <w:shd w:val="clear" w:color="auto" w:fill="F2F8FF"/>
             <w:tcBorders>
               <w:top w:val="single" w:sz="4" w:space="0" w:color="000000"/>
               <w:left w:val="single" w:sz="4" w:space="0" w:color="000000"/>
@@ -4090,7 +4170,6 @@
               <w:insideH w:val="single" w:sz="4" w:space="0" w:color="000000"/>
               <w:insideV w:val="single" w:sz="4" w:space="0" w:color="000000"/>
             </w:tcBorders>
-            <w:vAlign w:val="center"/>
           </w:tcPr>
           <w:p>
             <w:pPr>
@@ -4111,6 +4190,7 @@
         <w:tc>
           <w:tcPr>
             <w:tcW w:type="dxa" w:w="1506"/>
+            <w:shd w:val="clear" w:color="auto" w:fill="F2F8FF"/>
             <w:tcBorders>
               <w:top w:val="single" w:sz="4" w:space="0" w:color="000000"/>
               <w:left w:val="single" w:sz="4" w:space="0" w:color="000000"/>
@@ -4119,7 +4199,409 @@
               <w:insideH w:val="single" w:sz="4" w:space="0" w:color="000000"/>
               <w:insideV w:val="single" w:sz="4" w:space="0" w:color="000000"/>
             </w:tcBorders>
-            <w:vAlign w:val="center"/>
+          </w:tcPr>
+          <w:p>
+            <w:pPr>
+              <w:spacing w:before="20" w:after="20" w:lineRule="auto" w:line="276"/>
+              <w:jc w:val="left"/>
+            </w:pPr>
+            <w:r/>
+            <w:r>
+              <w:rPr>
+                <w:rFonts w:ascii="Calibri" w:hAnsi="Calibri"/>
+                <w:b w:val="0"/>
+                <w:sz w:val="18"/>
+              </w:rPr>
+              <w:t>Local</w:t>
+            </w:r>
+          </w:p>
+        </w:tc>
+        <w:tc>
+          <w:tcPr>
+            <w:tcW w:type="dxa" w:w="1506"/>
+            <w:shd w:val="clear" w:color="auto" w:fill="F2F8FF"/>
+            <w:tcBorders>
+              <w:top w:val="single" w:sz="4" w:space="0" w:color="000000"/>
+              <w:left w:val="single" w:sz="4" w:space="0" w:color="000000"/>
+              <w:bottom w:val="single" w:sz="4" w:space="0" w:color="000000"/>
+              <w:right w:val="single" w:sz="4" w:space="0" w:color="000000"/>
+              <w:insideH w:val="single" w:sz="4" w:space="0" w:color="000000"/>
+              <w:insideV w:val="single" w:sz="4" w:space="0" w:color="000000"/>
+            </w:tcBorders>
+          </w:tcPr>
+          <w:p>
+            <w:pPr>
+              <w:spacing w:before="20" w:after="20" w:lineRule="auto" w:line="276"/>
+              <w:jc w:val="left"/>
+            </w:pPr>
+            <w:r/>
+            <w:r>
+              <w:rPr>
+                <w:rFonts w:ascii="Calibri" w:hAnsi="Calibri"/>
+                <w:b w:val="0"/>
+                <w:sz w:val="18"/>
+              </w:rPr>
+              <w:t>Polímero / Metal</w:t>
+            </w:r>
+          </w:p>
+        </w:tc>
+      </w:tr>
+      <w:tr>
+        <w:tc>
+          <w:tcPr>
+            <w:tcW w:type="dxa" w:w="1506"/>
+            <w:tcBorders>
+              <w:top w:val="single" w:sz="4" w:space="0" w:color="000000"/>
+              <w:left w:val="single" w:sz="4" w:space="0" w:color="000000"/>
+              <w:bottom w:val="single" w:sz="4" w:space="0" w:color="000000"/>
+              <w:right w:val="single" w:sz="4" w:space="0" w:color="000000"/>
+              <w:insideH w:val="single" w:sz="4" w:space="0" w:color="000000"/>
+              <w:insideV w:val="single" w:sz="4" w:space="0" w:color="000000"/>
+            </w:tcBorders>
+          </w:tcPr>
+          <w:p>
+            <w:pPr>
+              <w:spacing w:before="20" w:after="20" w:lineRule="auto" w:line="276"/>
+              <w:jc w:val="left"/>
+            </w:pPr>
+            <w:r/>
+            <w:r>
+              <w:rPr>
+                <w:rFonts w:ascii="Calibri" w:hAnsi="Calibri"/>
+                <w:b w:val="0"/>
+                <w:sz w:val="18"/>
+              </w:rPr>
+              <w:t>BA1</w:t>
+            </w:r>
+          </w:p>
+        </w:tc>
+        <w:tc>
+          <w:tcPr>
+            <w:tcW w:type="dxa" w:w="1506"/>
+            <w:tcBorders>
+              <w:top w:val="single" w:sz="4" w:space="0" w:color="000000"/>
+              <w:left w:val="single" w:sz="4" w:space="0" w:color="000000"/>
+              <w:bottom w:val="single" w:sz="4" w:space="0" w:color="000000"/>
+              <w:right w:val="single" w:sz="4" w:space="0" w:color="000000"/>
+              <w:insideH w:val="single" w:sz="4" w:space="0" w:color="000000"/>
+              <w:insideV w:val="single" w:sz="4" w:space="0" w:color="000000"/>
+            </w:tcBorders>
+          </w:tcPr>
+          <w:p>
+            <w:pPr>
+              <w:spacing w:before="20" w:after="20" w:lineRule="auto" w:line="276"/>
+              <w:jc w:val="left"/>
+            </w:pPr>
+            <w:r/>
+            <w:r>
+              <w:rPr>
+                <w:rFonts w:ascii="Calibri" w:hAnsi="Calibri"/>
+                <w:b w:val="0"/>
+                <w:sz w:val="18"/>
+              </w:rPr>
+              <w:t>Pilas AA alcalinas 1.5 V (pack ×4)</w:t>
+            </w:r>
+          </w:p>
+        </w:tc>
+        <w:tc>
+          <w:tcPr>
+            <w:tcW w:type="dxa" w:w="1506"/>
+            <w:tcBorders>
+              <w:top w:val="single" w:sz="4" w:space="0" w:color="000000"/>
+              <w:left w:val="single" w:sz="4" w:space="0" w:color="000000"/>
+              <w:bottom w:val="single" w:sz="4" w:space="0" w:color="000000"/>
+              <w:right w:val="single" w:sz="4" w:space="0" w:color="000000"/>
+              <w:insideH w:val="single" w:sz="4" w:space="0" w:color="000000"/>
+              <w:insideV w:val="single" w:sz="4" w:space="0" w:color="000000"/>
+            </w:tcBorders>
+          </w:tcPr>
+          <w:p>
+            <w:pPr>
+              <w:spacing w:before="20" w:after="20" w:lineRule="auto" w:line="276"/>
+              <w:jc w:val="center"/>
+            </w:pPr>
+            <w:r/>
+            <w:r>
+              <w:rPr>
+                <w:rFonts w:ascii="Calibri" w:hAnsi="Calibri"/>
+                <w:b w:val="0"/>
+                <w:sz w:val="18"/>
+              </w:rPr>
+              <w:t>1</w:t>
+            </w:r>
+          </w:p>
+        </w:tc>
+        <w:tc>
+          <w:tcPr>
+            <w:tcW w:type="dxa" w:w="1506"/>
+            <w:tcBorders>
+              <w:top w:val="single" w:sz="4" w:space="0" w:color="000000"/>
+              <w:left w:val="single" w:sz="4" w:space="0" w:color="000000"/>
+              <w:bottom w:val="single" w:sz="4" w:space="0" w:color="000000"/>
+              <w:right w:val="single" w:sz="4" w:space="0" w:color="000000"/>
+              <w:insideH w:val="single" w:sz="4" w:space="0" w:color="000000"/>
+              <w:insideV w:val="single" w:sz="4" w:space="0" w:color="000000"/>
+            </w:tcBorders>
+          </w:tcPr>
+          <w:p>
+            <w:pPr>
+              <w:spacing w:before="20" w:after="20" w:lineRule="auto" w:line="276"/>
+              <w:jc w:val="center"/>
+            </w:pPr>
+            <w:r/>
+            <w:r>
+              <w:rPr>
+                <w:rFonts w:ascii="Calibri" w:hAnsi="Calibri"/>
+                <w:b w:val="0"/>
+                <w:sz w:val="18"/>
+              </w:rPr>
+              <w:t>$2.00</w:t>
+            </w:r>
+          </w:p>
+        </w:tc>
+        <w:tc>
+          <w:tcPr>
+            <w:tcW w:type="dxa" w:w="1506"/>
+            <w:tcBorders>
+              <w:top w:val="single" w:sz="4" w:space="0" w:color="000000"/>
+              <w:left w:val="single" w:sz="4" w:space="0" w:color="000000"/>
+              <w:bottom w:val="single" w:sz="4" w:space="0" w:color="000000"/>
+              <w:right w:val="single" w:sz="4" w:space="0" w:color="000000"/>
+              <w:insideH w:val="single" w:sz="4" w:space="0" w:color="000000"/>
+              <w:insideV w:val="single" w:sz="4" w:space="0" w:color="000000"/>
+            </w:tcBorders>
+          </w:tcPr>
+          <w:p>
+            <w:pPr>
+              <w:spacing w:before="20" w:after="20" w:lineRule="auto" w:line="276"/>
+              <w:jc w:val="center"/>
+            </w:pPr>
+            <w:r/>
+            <w:r>
+              <w:rPr>
+                <w:rFonts w:ascii="Calibri" w:hAnsi="Calibri"/>
+                <w:b w:val="0"/>
+                <w:sz w:val="18"/>
+              </w:rPr>
+              <w:t>$2.00</w:t>
+            </w:r>
+          </w:p>
+        </w:tc>
+        <w:tc>
+          <w:tcPr>
+            <w:tcW w:type="dxa" w:w="1506"/>
+            <w:tcBorders>
+              <w:top w:val="single" w:sz="4" w:space="0" w:color="000000"/>
+              <w:left w:val="single" w:sz="4" w:space="0" w:color="000000"/>
+              <w:bottom w:val="single" w:sz="4" w:space="0" w:color="000000"/>
+              <w:right w:val="single" w:sz="4" w:space="0" w:color="000000"/>
+              <w:insideH w:val="single" w:sz="4" w:space="0" w:color="000000"/>
+              <w:insideV w:val="single" w:sz="4" w:space="0" w:color="000000"/>
+            </w:tcBorders>
+          </w:tcPr>
+          <w:p>
+            <w:pPr>
+              <w:spacing w:before="20" w:after="20" w:lineRule="auto" w:line="276"/>
+              <w:jc w:val="left"/>
+            </w:pPr>
+            <w:r/>
+            <w:r>
+              <w:rPr>
+                <w:rFonts w:ascii="Calibri" w:hAnsi="Calibri"/>
+                <w:b w:val="0"/>
+                <w:sz w:val="18"/>
+              </w:rPr>
+              <w:t>Local / Supermercado</w:t>
+            </w:r>
+          </w:p>
+        </w:tc>
+        <w:tc>
+          <w:tcPr>
+            <w:tcW w:type="dxa" w:w="1506"/>
+            <w:tcBorders>
+              <w:top w:val="single" w:sz="4" w:space="0" w:color="000000"/>
+              <w:left w:val="single" w:sz="4" w:space="0" w:color="000000"/>
+              <w:bottom w:val="single" w:sz="4" w:space="0" w:color="000000"/>
+              <w:right w:val="single" w:sz="4" w:space="0" w:color="000000"/>
+              <w:insideH w:val="single" w:sz="4" w:space="0" w:color="000000"/>
+              <w:insideV w:val="single" w:sz="4" w:space="0" w:color="000000"/>
+            </w:tcBorders>
+          </w:tcPr>
+          <w:p>
+            <w:pPr>
+              <w:spacing w:before="20" w:after="20" w:lineRule="auto" w:line="276"/>
+              <w:jc w:val="left"/>
+            </w:pPr>
+            <w:r/>
+            <w:r>
+              <w:rPr>
+                <w:rFonts w:ascii="Calibri" w:hAnsi="Calibri"/>
+                <w:b w:val="0"/>
+                <w:sz w:val="18"/>
+              </w:rPr>
+              <w:t>Electroquímico</w:t>
+            </w:r>
+          </w:p>
+        </w:tc>
+      </w:tr>
+      <w:tr>
+        <w:tc>
+          <w:tcPr>
+            <w:tcW w:type="dxa" w:w="1506"/>
+            <w:shd w:val="clear" w:color="auto" w:fill="F2F8FF"/>
+            <w:tcBorders>
+              <w:top w:val="single" w:sz="4" w:space="0" w:color="000000"/>
+              <w:left w:val="single" w:sz="4" w:space="0" w:color="000000"/>
+              <w:bottom w:val="single" w:sz="4" w:space="0" w:color="000000"/>
+              <w:right w:val="single" w:sz="4" w:space="0" w:color="000000"/>
+              <w:insideH w:val="single" w:sz="4" w:space="0" w:color="000000"/>
+              <w:insideV w:val="single" w:sz="4" w:space="0" w:color="000000"/>
+            </w:tcBorders>
+          </w:tcPr>
+          <w:p>
+            <w:pPr>
+              <w:spacing w:before="20" w:after="20" w:lineRule="auto" w:line="276"/>
+              <w:jc w:val="left"/>
+            </w:pPr>
+            <w:r/>
+            <w:r>
+              <w:rPr>
+                <w:rFonts w:ascii="Calibri" w:hAnsi="Calibri"/>
+                <w:b w:val="0"/>
+                <w:sz w:val="18"/>
+              </w:rPr>
+              <w:t>R1, R2</w:t>
+            </w:r>
+          </w:p>
+        </w:tc>
+        <w:tc>
+          <w:tcPr>
+            <w:tcW w:type="dxa" w:w="1506"/>
+            <w:shd w:val="clear" w:color="auto" w:fill="F2F8FF"/>
+            <w:tcBorders>
+              <w:top w:val="single" w:sz="4" w:space="0" w:color="000000"/>
+              <w:left w:val="single" w:sz="4" w:space="0" w:color="000000"/>
+              <w:bottom w:val="single" w:sz="4" w:space="0" w:color="000000"/>
+              <w:right w:val="single" w:sz="4" w:space="0" w:color="000000"/>
+              <w:insideH w:val="single" w:sz="4" w:space="0" w:color="000000"/>
+              <w:insideV w:val="single" w:sz="4" w:space="0" w:color="000000"/>
+            </w:tcBorders>
+          </w:tcPr>
+          <w:p>
+            <w:pPr>
+              <w:spacing w:before="20" w:after="20" w:lineRule="auto" w:line="276"/>
+              <w:jc w:val="left"/>
+            </w:pPr>
+            <w:r/>
+            <w:r>
+              <w:rPr>
+                <w:rFonts w:ascii="Calibri" w:hAnsi="Calibri"/>
+                <w:b w:val="0"/>
+                <w:sz w:val="18"/>
+              </w:rPr>
+              <w:t>Resistencia 4.7 kΩ, 1/4 W, ±5% (pull-up I2C)</w:t>
+            </w:r>
+          </w:p>
+        </w:tc>
+        <w:tc>
+          <w:tcPr>
+            <w:tcW w:type="dxa" w:w="1506"/>
+            <w:shd w:val="clear" w:color="auto" w:fill="F2F8FF"/>
+            <w:tcBorders>
+              <w:top w:val="single" w:sz="4" w:space="0" w:color="000000"/>
+              <w:left w:val="single" w:sz="4" w:space="0" w:color="000000"/>
+              <w:bottom w:val="single" w:sz="4" w:space="0" w:color="000000"/>
+              <w:right w:val="single" w:sz="4" w:space="0" w:color="000000"/>
+              <w:insideH w:val="single" w:sz="4" w:space="0" w:color="000000"/>
+              <w:insideV w:val="single" w:sz="4" w:space="0" w:color="000000"/>
+            </w:tcBorders>
+          </w:tcPr>
+          <w:p>
+            <w:pPr>
+              <w:spacing w:before="20" w:after="20" w:lineRule="auto" w:line="276"/>
+              <w:jc w:val="center"/>
+            </w:pPr>
+            <w:r/>
+            <w:r>
+              <w:rPr>
+                <w:rFonts w:ascii="Calibri" w:hAnsi="Calibri"/>
+                <w:b w:val="0"/>
+                <w:sz w:val="18"/>
+              </w:rPr>
+              <w:t>2</w:t>
+            </w:r>
+          </w:p>
+        </w:tc>
+        <w:tc>
+          <w:tcPr>
+            <w:tcW w:type="dxa" w:w="1506"/>
+            <w:shd w:val="clear" w:color="auto" w:fill="F2F8FF"/>
+            <w:tcBorders>
+              <w:top w:val="single" w:sz="4" w:space="0" w:color="000000"/>
+              <w:left w:val="single" w:sz="4" w:space="0" w:color="000000"/>
+              <w:bottom w:val="single" w:sz="4" w:space="0" w:color="000000"/>
+              <w:right w:val="single" w:sz="4" w:space="0" w:color="000000"/>
+              <w:insideH w:val="single" w:sz="4" w:space="0" w:color="000000"/>
+              <w:insideV w:val="single" w:sz="4" w:space="0" w:color="000000"/>
+            </w:tcBorders>
+          </w:tcPr>
+          <w:p>
+            <w:pPr>
+              <w:spacing w:before="20" w:after="20" w:lineRule="auto" w:line="276"/>
+              <w:jc w:val="center"/>
+            </w:pPr>
+            <w:r/>
+            <w:r>
+              <w:rPr>
+                <w:rFonts w:ascii="Calibri" w:hAnsi="Calibri"/>
+                <w:b w:val="0"/>
+                <w:sz w:val="18"/>
+              </w:rPr>
+              <w:t>$0.10</w:t>
+            </w:r>
+          </w:p>
+        </w:tc>
+        <w:tc>
+          <w:tcPr>
+            <w:tcW w:type="dxa" w:w="1506"/>
+            <w:shd w:val="clear" w:color="auto" w:fill="F2F8FF"/>
+            <w:tcBorders>
+              <w:top w:val="single" w:sz="4" w:space="0" w:color="000000"/>
+              <w:left w:val="single" w:sz="4" w:space="0" w:color="000000"/>
+              <w:bottom w:val="single" w:sz="4" w:space="0" w:color="000000"/>
+              <w:right w:val="single" w:sz="4" w:space="0" w:color="000000"/>
+              <w:insideH w:val="single" w:sz="4" w:space="0" w:color="000000"/>
+              <w:insideV w:val="single" w:sz="4" w:space="0" w:color="000000"/>
+            </w:tcBorders>
+          </w:tcPr>
+          <w:p>
+            <w:pPr>
+              <w:spacing w:before="20" w:after="20" w:lineRule="auto" w:line="276"/>
+              <w:jc w:val="center"/>
+            </w:pPr>
+            <w:r/>
+            <w:r>
+              <w:rPr>
+                <w:rFonts w:ascii="Calibri" w:hAnsi="Calibri"/>
+                <w:b w:val="0"/>
+                <w:sz w:val="18"/>
+              </w:rPr>
+              <w:t>$0.20</w:t>
+            </w:r>
+          </w:p>
+        </w:tc>
+        <w:tc>
+          <w:tcPr>
+            <w:tcW w:type="dxa" w:w="1506"/>
+            <w:shd w:val="clear" w:color="auto" w:fill="F2F8FF"/>
+            <w:tcBorders>
+              <w:top w:val="single" w:sz="4" w:space="0" w:color="000000"/>
+              <w:left w:val="single" w:sz="4" w:space="0" w:color="000000"/>
+              <w:bottom w:val="single" w:sz="4" w:space="0" w:color="000000"/>
+              <w:right w:val="single" w:sz="4" w:space="0" w:color="000000"/>
+              <w:insideH w:val="single" w:sz="4" w:space="0" w:color="000000"/>
+              <w:insideV w:val="single" w:sz="4" w:space="0" w:color="000000"/>
+            </w:tcBorders>
           </w:tcPr>
           <w:p>
             <w:pPr>
@@ -4140,6 +4622,7 @@
         <w:tc>
           <w:tcPr>
             <w:tcW w:type="dxa" w:w="1506"/>
+            <w:shd w:val="clear" w:color="auto" w:fill="F2F8FF"/>
             <w:tcBorders>
               <w:top w:val="single" w:sz="4" w:space="0" w:color="000000"/>
               <w:left w:val="single" w:sz="4" w:space="0" w:color="000000"/>
@@ -4148,7 +4631,409 @@
               <w:insideH w:val="single" w:sz="4" w:space="0" w:color="000000"/>
               <w:insideV w:val="single" w:sz="4" w:space="0" w:color="000000"/>
             </w:tcBorders>
-            <w:vAlign w:val="center"/>
+          </w:tcPr>
+          <w:p>
+            <w:pPr>
+              <w:spacing w:before="20" w:after="20" w:lineRule="auto" w:line="276"/>
+              <w:jc w:val="left"/>
+            </w:pPr>
+            <w:r/>
+            <w:r>
+              <w:rPr>
+                <w:rFonts w:ascii="Calibri" w:hAnsi="Calibri"/>
+                <w:b w:val="0"/>
+                <w:sz w:val="18"/>
+              </w:rPr>
+              <w:t>Metal film</w:t>
+            </w:r>
+          </w:p>
+        </w:tc>
+      </w:tr>
+      <w:tr>
+        <w:tc>
+          <w:tcPr>
+            <w:tcW w:type="dxa" w:w="1506"/>
+            <w:tcBorders>
+              <w:top w:val="single" w:sz="4" w:space="0" w:color="000000"/>
+              <w:left w:val="single" w:sz="4" w:space="0" w:color="000000"/>
+              <w:bottom w:val="single" w:sz="4" w:space="0" w:color="000000"/>
+              <w:right w:val="single" w:sz="4" w:space="0" w:color="000000"/>
+              <w:insideH w:val="single" w:sz="4" w:space="0" w:color="000000"/>
+              <w:insideV w:val="single" w:sz="4" w:space="0" w:color="000000"/>
+            </w:tcBorders>
+          </w:tcPr>
+          <w:p>
+            <w:pPr>
+              <w:spacing w:before="20" w:after="20" w:lineRule="auto" w:line="276"/>
+              <w:jc w:val="left"/>
+            </w:pPr>
+            <w:r/>
+            <w:r>
+              <w:rPr>
+                <w:rFonts w:ascii="Calibri" w:hAnsi="Calibri"/>
+                <w:b w:val="0"/>
+                <w:sz w:val="18"/>
+              </w:rPr>
+              <w:t>J1–J16</w:t>
+            </w:r>
+          </w:p>
+        </w:tc>
+        <w:tc>
+          <w:tcPr>
+            <w:tcW w:type="dxa" w:w="1506"/>
+            <w:tcBorders>
+              <w:top w:val="single" w:sz="4" w:space="0" w:color="000000"/>
+              <w:left w:val="single" w:sz="4" w:space="0" w:color="000000"/>
+              <w:bottom w:val="single" w:sz="4" w:space="0" w:color="000000"/>
+              <w:right w:val="single" w:sz="4" w:space="0" w:color="000000"/>
+              <w:insideH w:val="single" w:sz="4" w:space="0" w:color="000000"/>
+              <w:insideV w:val="single" w:sz="4" w:space="0" w:color="000000"/>
+            </w:tcBorders>
+          </w:tcPr>
+          <w:p>
+            <w:pPr>
+              <w:spacing w:before="20" w:after="20" w:lineRule="auto" w:line="276"/>
+              <w:jc w:val="left"/>
+            </w:pPr>
+            <w:r/>
+            <w:r>
+              <w:rPr>
+                <w:rFonts w:ascii="Calibri" w:hAnsi="Calibri"/>
+                <w:b w:val="0"/>
+                <w:sz w:val="18"/>
+              </w:rPr>
+              <w:t>Cables Jumper macho-hembra, 20 cm</w:t>
+            </w:r>
+          </w:p>
+        </w:tc>
+        <w:tc>
+          <w:tcPr>
+            <w:tcW w:type="dxa" w:w="1506"/>
+            <w:tcBorders>
+              <w:top w:val="single" w:sz="4" w:space="0" w:color="000000"/>
+              <w:left w:val="single" w:sz="4" w:space="0" w:color="000000"/>
+              <w:bottom w:val="single" w:sz="4" w:space="0" w:color="000000"/>
+              <w:right w:val="single" w:sz="4" w:space="0" w:color="000000"/>
+              <w:insideH w:val="single" w:sz="4" w:space="0" w:color="000000"/>
+              <w:insideV w:val="single" w:sz="4" w:space="0" w:color="000000"/>
+            </w:tcBorders>
+          </w:tcPr>
+          <w:p>
+            <w:pPr>
+              <w:spacing w:before="20" w:after="20" w:lineRule="auto" w:line="276"/>
+              <w:jc w:val="center"/>
+            </w:pPr>
+            <w:r/>
+            <w:r>
+              <w:rPr>
+                <w:rFonts w:ascii="Calibri" w:hAnsi="Calibri"/>
+                <w:b w:val="0"/>
+                <w:sz w:val="18"/>
+              </w:rPr>
+              <w:t>16</w:t>
+            </w:r>
+          </w:p>
+        </w:tc>
+        <w:tc>
+          <w:tcPr>
+            <w:tcW w:type="dxa" w:w="1506"/>
+            <w:tcBorders>
+              <w:top w:val="single" w:sz="4" w:space="0" w:color="000000"/>
+              <w:left w:val="single" w:sz="4" w:space="0" w:color="000000"/>
+              <w:bottom w:val="single" w:sz="4" w:space="0" w:color="000000"/>
+              <w:right w:val="single" w:sz="4" w:space="0" w:color="000000"/>
+              <w:insideH w:val="single" w:sz="4" w:space="0" w:color="000000"/>
+              <w:insideV w:val="single" w:sz="4" w:space="0" w:color="000000"/>
+            </w:tcBorders>
+          </w:tcPr>
+          <w:p>
+            <w:pPr>
+              <w:spacing w:before="20" w:after="20" w:lineRule="auto" w:line="276"/>
+              <w:jc w:val="center"/>
+            </w:pPr>
+            <w:r/>
+            <w:r>
+              <w:rPr>
+                <w:rFonts w:ascii="Calibri" w:hAnsi="Calibri"/>
+                <w:b w:val="0"/>
+                <w:sz w:val="18"/>
+              </w:rPr>
+              <w:t>$0.08</w:t>
+            </w:r>
+          </w:p>
+        </w:tc>
+        <w:tc>
+          <w:tcPr>
+            <w:tcW w:type="dxa" w:w="1506"/>
+            <w:tcBorders>
+              <w:top w:val="single" w:sz="4" w:space="0" w:color="000000"/>
+              <w:left w:val="single" w:sz="4" w:space="0" w:color="000000"/>
+              <w:bottom w:val="single" w:sz="4" w:space="0" w:color="000000"/>
+              <w:right w:val="single" w:sz="4" w:space="0" w:color="000000"/>
+              <w:insideH w:val="single" w:sz="4" w:space="0" w:color="000000"/>
+              <w:insideV w:val="single" w:sz="4" w:space="0" w:color="000000"/>
+            </w:tcBorders>
+          </w:tcPr>
+          <w:p>
+            <w:pPr>
+              <w:spacing w:before="20" w:after="20" w:lineRule="auto" w:line="276"/>
+              <w:jc w:val="center"/>
+            </w:pPr>
+            <w:r/>
+            <w:r>
+              <w:rPr>
+                <w:rFonts w:ascii="Calibri" w:hAnsi="Calibri"/>
+                <w:b w:val="0"/>
+                <w:sz w:val="18"/>
+              </w:rPr>
+              <w:t>$1.20</w:t>
+            </w:r>
+          </w:p>
+        </w:tc>
+        <w:tc>
+          <w:tcPr>
+            <w:tcW w:type="dxa" w:w="1506"/>
+            <w:tcBorders>
+              <w:top w:val="single" w:sz="4" w:space="0" w:color="000000"/>
+              <w:left w:val="single" w:sz="4" w:space="0" w:color="000000"/>
+              <w:bottom w:val="single" w:sz="4" w:space="0" w:color="000000"/>
+              <w:right w:val="single" w:sz="4" w:space="0" w:color="000000"/>
+              <w:insideH w:val="single" w:sz="4" w:space="0" w:color="000000"/>
+              <w:insideV w:val="single" w:sz="4" w:space="0" w:color="000000"/>
+            </w:tcBorders>
+          </w:tcPr>
+          <w:p>
+            <w:pPr>
+              <w:spacing w:before="20" w:after="20" w:lineRule="auto" w:line="276"/>
+              <w:jc w:val="left"/>
+            </w:pPr>
+            <w:r/>
+            <w:r>
+              <w:rPr>
+                <w:rFonts w:ascii="Calibri" w:hAnsi="Calibri"/>
+                <w:b w:val="0"/>
+                <w:sz w:val="18"/>
+              </w:rPr>
+              <w:t>AliExpress</w:t>
+            </w:r>
+          </w:p>
+        </w:tc>
+        <w:tc>
+          <w:tcPr>
+            <w:tcW w:type="dxa" w:w="1506"/>
+            <w:tcBorders>
+              <w:top w:val="single" w:sz="4" w:space="0" w:color="000000"/>
+              <w:left w:val="single" w:sz="4" w:space="0" w:color="000000"/>
+              <w:bottom w:val="single" w:sz="4" w:space="0" w:color="000000"/>
+              <w:right w:val="single" w:sz="4" w:space="0" w:color="000000"/>
+              <w:insideH w:val="single" w:sz="4" w:space="0" w:color="000000"/>
+              <w:insideV w:val="single" w:sz="4" w:space="0" w:color="000000"/>
+            </w:tcBorders>
+          </w:tcPr>
+          <w:p>
+            <w:pPr>
+              <w:spacing w:before="20" w:after="20" w:lineRule="auto" w:line="276"/>
+              <w:jc w:val="left"/>
+            </w:pPr>
+            <w:r/>
+            <w:r>
+              <w:rPr>
+                <w:rFonts w:ascii="Calibri" w:hAnsi="Calibri"/>
+                <w:b w:val="0"/>
+                <w:sz w:val="18"/>
+              </w:rPr>
+              <w:t>Polímero</w:t>
+            </w:r>
+          </w:p>
+        </w:tc>
+      </w:tr>
+      <w:tr>
+        <w:tc>
+          <w:tcPr>
+            <w:tcW w:type="dxa" w:w="1506"/>
+            <w:shd w:val="clear" w:color="auto" w:fill="F2F8FF"/>
+            <w:tcBorders>
+              <w:top w:val="single" w:sz="4" w:space="0" w:color="000000"/>
+              <w:left w:val="single" w:sz="4" w:space="0" w:color="000000"/>
+              <w:bottom w:val="single" w:sz="4" w:space="0" w:color="000000"/>
+              <w:right w:val="single" w:sz="4" w:space="0" w:color="000000"/>
+              <w:insideH w:val="single" w:sz="4" w:space="0" w:color="000000"/>
+              <w:insideV w:val="single" w:sz="4" w:space="0" w:color="000000"/>
+            </w:tcBorders>
+          </w:tcPr>
+          <w:p>
+            <w:pPr>
+              <w:spacing w:before="20" w:after="20" w:lineRule="auto" w:line="276"/>
+              <w:jc w:val="left"/>
+            </w:pPr>
+            <w:r/>
+            <w:r>
+              <w:rPr>
+                <w:rFonts w:ascii="Calibri" w:hAnsi="Calibri"/>
+                <w:b w:val="0"/>
+                <w:sz w:val="18"/>
+              </w:rPr>
+              <w:t>PCB1</w:t>
+            </w:r>
+          </w:p>
+        </w:tc>
+        <w:tc>
+          <w:tcPr>
+            <w:tcW w:type="dxa" w:w="1506"/>
+            <w:shd w:val="clear" w:color="auto" w:fill="F2F8FF"/>
+            <w:tcBorders>
+              <w:top w:val="single" w:sz="4" w:space="0" w:color="000000"/>
+              <w:left w:val="single" w:sz="4" w:space="0" w:color="000000"/>
+              <w:bottom w:val="single" w:sz="4" w:space="0" w:color="000000"/>
+              <w:right w:val="single" w:sz="4" w:space="0" w:color="000000"/>
+              <w:insideH w:val="single" w:sz="4" w:space="0" w:color="000000"/>
+              <w:insideV w:val="single" w:sz="4" w:space="0" w:color="000000"/>
+            </w:tcBorders>
+          </w:tcPr>
+          <w:p>
+            <w:pPr>
+              <w:spacing w:before="20" w:after="20" w:lineRule="auto" w:line="276"/>
+              <w:jc w:val="left"/>
+            </w:pPr>
+            <w:r/>
+            <w:r>
+              <w:rPr>
+                <w:rFonts w:ascii="Calibri" w:hAnsi="Calibri"/>
+                <w:b w:val="0"/>
+                <w:sz w:val="18"/>
+              </w:rPr>
+              <w:t>PCB prototipo 5×7 cm (breadboard o perforada)</w:t>
+            </w:r>
+          </w:p>
+        </w:tc>
+        <w:tc>
+          <w:tcPr>
+            <w:tcW w:type="dxa" w:w="1506"/>
+            <w:shd w:val="clear" w:color="auto" w:fill="F2F8FF"/>
+            <w:tcBorders>
+              <w:top w:val="single" w:sz="4" w:space="0" w:color="000000"/>
+              <w:left w:val="single" w:sz="4" w:space="0" w:color="000000"/>
+              <w:bottom w:val="single" w:sz="4" w:space="0" w:color="000000"/>
+              <w:right w:val="single" w:sz="4" w:space="0" w:color="000000"/>
+              <w:insideH w:val="single" w:sz="4" w:space="0" w:color="000000"/>
+              <w:insideV w:val="single" w:sz="4" w:space="0" w:color="000000"/>
+            </w:tcBorders>
+          </w:tcPr>
+          <w:p>
+            <w:pPr>
+              <w:spacing w:before="20" w:after="20" w:lineRule="auto" w:line="276"/>
+              <w:jc w:val="center"/>
+            </w:pPr>
+            <w:r/>
+            <w:r>
+              <w:rPr>
+                <w:rFonts w:ascii="Calibri" w:hAnsi="Calibri"/>
+                <w:b w:val="0"/>
+                <w:sz w:val="18"/>
+              </w:rPr>
+              <w:t>1</w:t>
+            </w:r>
+          </w:p>
+        </w:tc>
+        <w:tc>
+          <w:tcPr>
+            <w:tcW w:type="dxa" w:w="1506"/>
+            <w:shd w:val="clear" w:color="auto" w:fill="F2F8FF"/>
+            <w:tcBorders>
+              <w:top w:val="single" w:sz="4" w:space="0" w:color="000000"/>
+              <w:left w:val="single" w:sz="4" w:space="0" w:color="000000"/>
+              <w:bottom w:val="single" w:sz="4" w:space="0" w:color="000000"/>
+              <w:right w:val="single" w:sz="4" w:space="0" w:color="000000"/>
+              <w:insideH w:val="single" w:sz="4" w:space="0" w:color="000000"/>
+              <w:insideV w:val="single" w:sz="4" w:space="0" w:color="000000"/>
+            </w:tcBorders>
+          </w:tcPr>
+          <w:p>
+            <w:pPr>
+              <w:spacing w:before="20" w:after="20" w:lineRule="auto" w:line="276"/>
+              <w:jc w:val="center"/>
+            </w:pPr>
+            <w:r/>
+            <w:r>
+              <w:rPr>
+                <w:rFonts w:ascii="Calibri" w:hAnsi="Calibri"/>
+                <w:b w:val="0"/>
+                <w:sz w:val="18"/>
+              </w:rPr>
+              <w:t>$1.50</w:t>
+            </w:r>
+          </w:p>
+        </w:tc>
+        <w:tc>
+          <w:tcPr>
+            <w:tcW w:type="dxa" w:w="1506"/>
+            <w:shd w:val="clear" w:color="auto" w:fill="F2F8FF"/>
+            <w:tcBorders>
+              <w:top w:val="single" w:sz="4" w:space="0" w:color="000000"/>
+              <w:left w:val="single" w:sz="4" w:space="0" w:color="000000"/>
+              <w:bottom w:val="single" w:sz="4" w:space="0" w:color="000000"/>
+              <w:right w:val="single" w:sz="4" w:space="0" w:color="000000"/>
+              <w:insideH w:val="single" w:sz="4" w:space="0" w:color="000000"/>
+              <w:insideV w:val="single" w:sz="4" w:space="0" w:color="000000"/>
+            </w:tcBorders>
+          </w:tcPr>
+          <w:p>
+            <w:pPr>
+              <w:spacing w:before="20" w:after="20" w:lineRule="auto" w:line="276"/>
+              <w:jc w:val="center"/>
+            </w:pPr>
+            <w:r/>
+            <w:r>
+              <w:rPr>
+                <w:rFonts w:ascii="Calibri" w:hAnsi="Calibri"/>
+                <w:b w:val="0"/>
+                <w:sz w:val="18"/>
+              </w:rPr>
+              <w:t>$1.50</w:t>
+            </w:r>
+          </w:p>
+        </w:tc>
+        <w:tc>
+          <w:tcPr>
+            <w:tcW w:type="dxa" w:w="1506"/>
+            <w:shd w:val="clear" w:color="auto" w:fill="F2F8FF"/>
+            <w:tcBorders>
+              <w:top w:val="single" w:sz="4" w:space="0" w:color="000000"/>
+              <w:left w:val="single" w:sz="4" w:space="0" w:color="000000"/>
+              <w:bottom w:val="single" w:sz="4" w:space="0" w:color="000000"/>
+              <w:right w:val="single" w:sz="4" w:space="0" w:color="000000"/>
+              <w:insideH w:val="single" w:sz="4" w:space="0" w:color="000000"/>
+              <w:insideV w:val="single" w:sz="4" w:space="0" w:color="000000"/>
+            </w:tcBorders>
+          </w:tcPr>
+          <w:p>
+            <w:pPr>
+              <w:spacing w:before="20" w:after="20" w:lineRule="auto" w:line="276"/>
+              <w:jc w:val="left"/>
+            </w:pPr>
+            <w:r/>
+            <w:r>
+              <w:rPr>
+                <w:rFonts w:ascii="Calibri" w:hAnsi="Calibri"/>
+                <w:b w:val="0"/>
+                <w:sz w:val="18"/>
+              </w:rPr>
+              <w:t>Local / AliExpress</w:t>
+            </w:r>
+          </w:p>
+        </w:tc>
+        <w:tc>
+          <w:tcPr>
+            <w:tcW w:type="dxa" w:w="1506"/>
+            <w:shd w:val="clear" w:color="auto" w:fill="F2F8FF"/>
+            <w:tcBorders>
+              <w:top w:val="single" w:sz="4" w:space="0" w:color="000000"/>
+              <w:left w:val="single" w:sz="4" w:space="0" w:color="000000"/>
+              <w:bottom w:val="single" w:sz="4" w:space="0" w:color="000000"/>
+              <w:right w:val="single" w:sz="4" w:space="0" w:color="000000"/>
+              <w:insideH w:val="single" w:sz="4" w:space="0" w:color="000000"/>
+              <w:insideV w:val="single" w:sz="4" w:space="0" w:color="000000"/>
+            </w:tcBorders>
           </w:tcPr>
           <w:p>
             <w:pPr>
@@ -4180,7 +5065,6 @@
               <w:insideH w:val="single" w:sz="4" w:space="0" w:color="000000"/>
               <w:insideV w:val="single" w:sz="4" w:space="0" w:color="000000"/>
             </w:tcBorders>
-            <w:vAlign w:val="center"/>
           </w:tcPr>
           <w:p>
             <w:pPr>
@@ -4210,7 +5094,6 @@
               <w:insideH w:val="single" w:sz="4" w:space="0" w:color="000000"/>
               <w:insideV w:val="single" w:sz="4" w:space="0" w:color="000000"/>
             </w:tcBorders>
-            <w:vAlign w:val="center"/>
           </w:tcPr>
           <w:p>
             <w:pPr>
@@ -4239,7 +5122,6 @@
               <w:insideH w:val="single" w:sz="4" w:space="0" w:color="000000"/>
               <w:insideV w:val="single" w:sz="4" w:space="0" w:color="000000"/>
             </w:tcBorders>
-            <w:vAlign w:val="center"/>
           </w:tcPr>
           <w:p>
             <w:pPr>
@@ -4268,7 +5150,6 @@
               <w:insideH w:val="single" w:sz="4" w:space="0" w:color="000000"/>
               <w:insideV w:val="single" w:sz="4" w:space="0" w:color="000000"/>
             </w:tcBorders>
-            <w:vAlign w:val="center"/>
           </w:tcPr>
           <w:p>
             <w:pPr>
@@ -4297,7 +5178,6 @@
               <w:insideH w:val="single" w:sz="4" w:space="0" w:color="000000"/>
               <w:insideV w:val="single" w:sz="4" w:space="0" w:color="000000"/>
             </w:tcBorders>
-            <w:vAlign w:val="center"/>
           </w:tcPr>
           <w:p>
             <w:pPr>
@@ -4311,7 +5191,7 @@
                 <w:b/>
                 <w:sz w:val="18"/>
               </w:rPr>
-              <w:t>$55.40</w:t>
+              <w:t>$77.70</w:t>
             </w:r>
           </w:p>
         </w:tc>
@@ -4327,7 +5207,6 @@
               <w:insideH w:val="single" w:sz="4" w:space="0" w:color="000000"/>
               <w:insideV w:val="single" w:sz="4" w:space="0" w:color="000000"/>
             </w:tcBorders>
-            <w:vAlign w:val="center"/>
           </w:tcPr>
           <w:p>
             <w:pPr>
@@ -4341,7 +5220,7 @@
                 <w:b/>
                 <w:sz w:val="18"/>
               </w:rPr>
-              <w:t>USD / ~COP 220.000 / ~MXN 1.100 / ~EUR 51 / ~ARS 55.000</w:t>
+              <w:t>USD / ~COP 310.000 / ~MXN 1.550 / ~EUR 72 / ~ARS 77.700</w:t>
             </w:r>
           </w:p>
         </w:tc>
@@ -4357,7 +5236,6 @@
               <w:insideH w:val="single" w:sz="4" w:space="0" w:color="000000"/>
               <w:insideV w:val="single" w:sz="4" w:space="0" w:color="000000"/>
             </w:tcBorders>
-            <w:vAlign w:val="center"/>
           </w:tcPr>
           <w:p>
             <w:pPr>
@@ -4398,21 +5276,6 @@
     </w:p>
     <w:p>
       <w:pPr>
-        <w:spacing w:before="0" w:after="80" w:lineRule="auto" w:line="360"/>
-        <w:jc w:val="both"/>
-      </w:pPr>
-      <w:r>
-        <w:rPr>
-          <w:rFonts w:ascii="Calibri" w:hAnsi="Calibri"/>
-          <w:b w:val="0"/>
-          <w:i w:val="0"/>
-          <w:sz w:val="22"/>
-        </w:rPr>
-        <w:t>El proceso de construcción del sistema sigue los pasos descritos a continuación. Se recomienda trabajar en un entorno controlado con protección antiestática para los componentes electrónicos.</w:t>
-      </w:r>
-    </w:p>
-    <w:p>
-      <w:pPr>
         <w:spacing w:before="120" w:after="60" w:lineRule="auto" w:line="276"/>
         <w:jc w:val="left"/>
       </w:pPr>
@@ -4424,21 +5287,6 @@
           <w:sz w:val="22"/>
         </w:rPr>
         <w:t>5.1 Requisitos de Software</w:t>
-      </w:r>
-    </w:p>
-    <w:p>
-      <w:pPr>
-        <w:spacing w:before="0" w:after="80" w:lineRule="auto" w:line="360"/>
-        <w:jc w:val="both"/>
-      </w:pPr>
-      <w:r>
-        <w:rPr>
-          <w:rFonts w:ascii="Calibri" w:hAnsi="Calibri"/>
-          <w:b w:val="0"/>
-          <w:i w:val="0"/>
-          <w:sz w:val="22"/>
-        </w:rPr>
-        <w:t>Instalar los siguientes entornos de desarrollo antes de proceder con la carga de firmware:</w:t>
       </w:r>
     </w:p>
     <w:p>
@@ -4466,7 +5314,7 @@
           <w:rFonts w:ascii="Calibri" w:hAnsi="Calibri"/>
           <w:sz w:val="20"/>
         </w:rPr>
-        <w:t>Arduino IDE 2.x + Soporte para ESP32 v3.x (https://arduino.esp32.com/stable/package_esp32_index.json) – Para la herramienta WHO_AM_I.</w:t>
+        <w:t>Arduino IDE 2.x + Soporte ESP32 v3.x (https://arduino.esp32.com/stable/package_esp32_index.json) – Para la herramienta WHO_AM_I.</w:t>
       </w:r>
     </w:p>
     <w:p>
@@ -4526,21 +5374,6 @@
         <w:t>5.2 Configuración de Pines y Conexiones</w:t>
       </w:r>
     </w:p>
-    <w:p>
-      <w:pPr>
-        <w:spacing w:before="0" w:after="80" w:lineRule="auto" w:line="360"/>
-        <w:jc w:val="both"/>
-      </w:pPr>
-      <w:r>
-        <w:rPr>
-          <w:rFonts w:ascii="Calibri" w:hAnsi="Calibri"/>
-          <w:b w:val="0"/>
-          <w:i w:val="0"/>
-          <w:sz w:val="22"/>
-        </w:rPr>
-        <w:t>La siguiente tabla resume las conexiones físicas requeridas para cada nodo:</w:t>
-      </w:r>
-    </w:p>
     <w:tbl>
       <w:tblPr>
         <w:tblStyle w:val="TableGrid"/>
@@ -4566,7 +5399,6 @@
               <w:insideH w:val="single" w:sz="4" w:space="0" w:color="000000"/>
               <w:insideV w:val="single" w:sz="4" w:space="0" w:color="000000"/>
             </w:tcBorders>
-            <w:vAlign w:val="center"/>
           </w:tcPr>
           <w:p>
             <w:pPr>
@@ -4596,7 +5428,6 @@
               <w:insideH w:val="single" w:sz="4" w:space="0" w:color="000000"/>
               <w:insideV w:val="single" w:sz="4" w:space="0" w:color="000000"/>
             </w:tcBorders>
-            <w:vAlign w:val="center"/>
           </w:tcPr>
           <w:p>
             <w:pPr>
@@ -4626,7 +5457,6 @@
               <w:insideH w:val="single" w:sz="4" w:space="0" w:color="000000"/>
               <w:insideV w:val="single" w:sz="4" w:space="0" w:color="000000"/>
             </w:tcBorders>
-            <w:vAlign w:val="center"/>
           </w:tcPr>
           <w:p>
             <w:pPr>
@@ -4658,7 +5488,6 @@
               <w:insideH w:val="single" w:sz="4" w:space="0" w:color="000000"/>
               <w:insideV w:val="single" w:sz="4" w:space="0" w:color="000000"/>
             </w:tcBorders>
-            <w:vAlign w:val="center"/>
           </w:tcPr>
           <w:p>
             <w:pPr>
@@ -4688,7 +5517,6 @@
               <w:insideH w:val="single" w:sz="4" w:space="0" w:color="000000"/>
               <w:insideV w:val="single" w:sz="4" w:space="0" w:color="000000"/>
             </w:tcBorders>
-            <w:vAlign w:val="center"/>
           </w:tcPr>
           <w:p>
             <w:pPr>
@@ -4718,7 +5546,6 @@
               <w:insideH w:val="single" w:sz="4" w:space="0" w:color="000000"/>
               <w:insideV w:val="single" w:sz="4" w:space="0" w:color="000000"/>
             </w:tcBorders>
-            <w:vAlign w:val="center"/>
           </w:tcPr>
           <w:p>
             <w:pPr>
@@ -4749,7 +5576,6 @@
               <w:insideH w:val="single" w:sz="4" w:space="0" w:color="000000"/>
               <w:insideV w:val="single" w:sz="4" w:space="0" w:color="000000"/>
             </w:tcBorders>
-            <w:vAlign w:val="center"/>
           </w:tcPr>
           <w:p>
             <w:pPr>
@@ -4778,7 +5604,6 @@
               <w:insideH w:val="single" w:sz="4" w:space="0" w:color="000000"/>
               <w:insideV w:val="single" w:sz="4" w:space="0" w:color="000000"/>
             </w:tcBorders>
-            <w:vAlign w:val="center"/>
           </w:tcPr>
           <w:p>
             <w:pPr>
@@ -4807,7 +5632,6 @@
               <w:insideH w:val="single" w:sz="4" w:space="0" w:color="000000"/>
               <w:insideV w:val="single" w:sz="4" w:space="0" w:color="000000"/>
             </w:tcBorders>
-            <w:vAlign w:val="center"/>
           </w:tcPr>
           <w:p>
             <w:pPr>
@@ -4839,7 +5663,6 @@
               <w:insideH w:val="single" w:sz="4" w:space="0" w:color="000000"/>
               <w:insideV w:val="single" w:sz="4" w:space="0" w:color="000000"/>
             </w:tcBorders>
-            <w:vAlign w:val="center"/>
           </w:tcPr>
           <w:p>
             <w:pPr>
@@ -4869,7 +5692,6 @@
               <w:insideH w:val="single" w:sz="4" w:space="0" w:color="000000"/>
               <w:insideV w:val="single" w:sz="4" w:space="0" w:color="000000"/>
             </w:tcBorders>
-            <w:vAlign w:val="center"/>
           </w:tcPr>
           <w:p>
             <w:pPr>
@@ -4899,7 +5721,6 @@
               <w:insideH w:val="single" w:sz="4" w:space="0" w:color="000000"/>
               <w:insideV w:val="single" w:sz="4" w:space="0" w:color="000000"/>
             </w:tcBorders>
-            <w:vAlign w:val="center"/>
           </w:tcPr>
           <w:p>
             <w:pPr>
@@ -4930,97 +5751,6 @@
               <w:insideH w:val="single" w:sz="4" w:space="0" w:color="000000"/>
               <w:insideV w:val="single" w:sz="4" w:space="0" w:color="000000"/>
             </w:tcBorders>
-            <w:vAlign w:val="center"/>
-          </w:tcPr>
-          <w:p>
-            <w:pPr>
-              <w:spacing w:before="20" w:after="20" w:lineRule="auto" w:line="276"/>
-              <w:jc w:val="left"/>
-            </w:pPr>
-            <w:r/>
-            <w:r>
-              <w:rPr>
-                <w:rFonts w:ascii="Calibri" w:hAnsi="Calibri"/>
-                <w:b w:val="0"/>
-                <w:sz w:val="18"/>
-              </w:rPr>
-              <w:t>MPU6050 GND</w:t>
-            </w:r>
-          </w:p>
-        </w:tc>
-        <w:tc>
-          <w:tcPr>
-            <w:tcW w:type="dxa" w:w="3513"/>
-            <w:tcBorders>
-              <w:top w:val="single" w:sz="4" w:space="0" w:color="000000"/>
-              <w:left w:val="single" w:sz="4" w:space="0" w:color="000000"/>
-              <w:bottom w:val="single" w:sz="4" w:space="0" w:color="000000"/>
-              <w:right w:val="single" w:sz="4" w:space="0" w:color="000000"/>
-              <w:insideH w:val="single" w:sz="4" w:space="0" w:color="000000"/>
-              <w:insideV w:val="single" w:sz="4" w:space="0" w:color="000000"/>
-            </w:tcBorders>
-            <w:vAlign w:val="center"/>
-          </w:tcPr>
-          <w:p>
-            <w:pPr>
-              <w:spacing w:before="20" w:after="20" w:lineRule="auto" w:line="276"/>
-              <w:jc w:val="center"/>
-            </w:pPr>
-            <w:r/>
-            <w:r>
-              <w:rPr>
-                <w:rFonts w:ascii="Calibri" w:hAnsi="Calibri"/>
-                <w:b w:val="0"/>
-                <w:sz w:val="18"/>
-              </w:rPr>
-              <w:t>GND</w:t>
-            </w:r>
-          </w:p>
-        </w:tc>
-        <w:tc>
-          <w:tcPr>
-            <w:tcW w:type="dxa" w:w="3513"/>
-            <w:tcBorders>
-              <w:top w:val="single" w:sz="4" w:space="0" w:color="000000"/>
-              <w:left w:val="single" w:sz="4" w:space="0" w:color="000000"/>
-              <w:bottom w:val="single" w:sz="4" w:space="0" w:color="000000"/>
-              <w:right w:val="single" w:sz="4" w:space="0" w:color="000000"/>
-              <w:insideH w:val="single" w:sz="4" w:space="0" w:color="000000"/>
-              <w:insideV w:val="single" w:sz="4" w:space="0" w:color="000000"/>
-            </w:tcBorders>
-            <w:vAlign w:val="center"/>
-          </w:tcPr>
-          <w:p>
-            <w:pPr>
-              <w:spacing w:before="20" w:after="20" w:lineRule="auto" w:line="276"/>
-              <w:jc w:val="left"/>
-            </w:pPr>
-            <w:r/>
-            <w:r>
-              <w:rPr>
-                <w:rFonts w:ascii="Calibri" w:hAnsi="Calibri"/>
-                <w:b w:val="0"/>
-                <w:sz w:val="18"/>
-              </w:rPr>
-              <w:t>Nodo esp32_2</w:t>
-            </w:r>
-          </w:p>
-        </w:tc>
-      </w:tr>
-      <w:tr>
-        <w:tc>
-          <w:tcPr>
-            <w:tcW w:type="dxa" w:w="3513"/>
-            <w:shd w:val="clear" w:color="auto" w:fill="F2F8FF"/>
-            <w:tcBorders>
-              <w:top w:val="single" w:sz="4" w:space="0" w:color="000000"/>
-              <w:left w:val="single" w:sz="4" w:space="0" w:color="000000"/>
-              <w:bottom w:val="single" w:sz="4" w:space="0" w:color="000000"/>
-              <w:right w:val="single" w:sz="4" w:space="0" w:color="000000"/>
-              <w:insideH w:val="single" w:sz="4" w:space="0" w:color="000000"/>
-              <w:insideV w:val="single" w:sz="4" w:space="0" w:color="000000"/>
-            </w:tcBorders>
-            <w:vAlign w:val="center"/>
           </w:tcPr>
           <w:p>
             <w:pPr>
@@ -5041,7 +5771,6 @@
         <w:tc>
           <w:tcPr>
             <w:tcW w:type="dxa" w:w="3513"/>
-            <w:shd w:val="clear" w:color="auto" w:fill="F2F8FF"/>
             <w:tcBorders>
               <w:top w:val="single" w:sz="4" w:space="0" w:color="000000"/>
               <w:left w:val="single" w:sz="4" w:space="0" w:color="000000"/>
@@ -5050,7 +5779,6 @@
               <w:insideH w:val="single" w:sz="4" w:space="0" w:color="000000"/>
               <w:insideV w:val="single" w:sz="4" w:space="0" w:color="000000"/>
             </w:tcBorders>
-            <w:vAlign w:val="center"/>
           </w:tcPr>
           <w:p>
             <w:pPr>
@@ -5064,14 +5792,13 @@
                 <w:b w:val="0"/>
                 <w:sz w:val="18"/>
               </w:rPr>
-              <w:t>SDA–3.3V</w:t>
+              <w:t>SDA – 3.3V</w:t>
             </w:r>
           </w:p>
         </w:tc>
         <w:tc>
           <w:tcPr>
             <w:tcW w:type="dxa" w:w="3513"/>
-            <w:shd w:val="clear" w:color="auto" w:fill="F2F8FF"/>
             <w:tcBorders>
               <w:top w:val="single" w:sz="4" w:space="0" w:color="000000"/>
               <w:left w:val="single" w:sz="4" w:space="0" w:color="000000"/>
@@ -5080,7 +5807,6 @@
               <w:insideH w:val="single" w:sz="4" w:space="0" w:color="000000"/>
               <w:insideV w:val="single" w:sz="4" w:space="0" w:color="000000"/>
             </w:tcBorders>
-            <w:vAlign w:val="center"/>
           </w:tcPr>
           <w:p>
             <w:pPr>
@@ -5103,6 +5829,7 @@
         <w:tc>
           <w:tcPr>
             <w:tcW w:type="dxa" w:w="3513"/>
+            <w:shd w:val="clear" w:color="auto" w:fill="F2F8FF"/>
             <w:tcBorders>
               <w:top w:val="single" w:sz="4" w:space="0" w:color="000000"/>
               <w:left w:val="single" w:sz="4" w:space="0" w:color="000000"/>
@@ -5111,7 +5838,6 @@
               <w:insideH w:val="single" w:sz="4" w:space="0" w:color="000000"/>
               <w:insideV w:val="single" w:sz="4" w:space="0" w:color="000000"/>
             </w:tcBorders>
-            <w:vAlign w:val="center"/>
           </w:tcPr>
           <w:p>
             <w:pPr>
@@ -5132,6 +5858,7 @@
         <w:tc>
           <w:tcPr>
             <w:tcW w:type="dxa" w:w="3513"/>
+            <w:shd w:val="clear" w:color="auto" w:fill="F2F8FF"/>
             <w:tcBorders>
               <w:top w:val="single" w:sz="4" w:space="0" w:color="000000"/>
               <w:left w:val="single" w:sz="4" w:space="0" w:color="000000"/>
@@ -5140,7 +5867,6 @@
               <w:insideH w:val="single" w:sz="4" w:space="0" w:color="000000"/>
               <w:insideV w:val="single" w:sz="4" w:space="0" w:color="000000"/>
             </w:tcBorders>
-            <w:vAlign w:val="center"/>
           </w:tcPr>
           <w:p>
             <w:pPr>
@@ -5154,13 +5880,14 @@
                 <w:b w:val="0"/>
                 <w:sz w:val="18"/>
               </w:rPr>
-              <w:t>SCL–3.3V</w:t>
+              <w:t>SCL – 3.3V</w:t>
             </w:r>
           </w:p>
         </w:tc>
         <w:tc>
           <w:tcPr>
             <w:tcW w:type="dxa" w:w="3513"/>
+            <w:shd w:val="clear" w:color="auto" w:fill="F2F8FF"/>
             <w:tcBorders>
               <w:top w:val="single" w:sz="4" w:space="0" w:color="000000"/>
               <w:left w:val="single" w:sz="4" w:space="0" w:color="000000"/>
@@ -5169,7 +5896,6 @@
               <w:insideH w:val="single" w:sz="4" w:space="0" w:color="000000"/>
               <w:insideV w:val="single" w:sz="4" w:space="0" w:color="000000"/>
             </w:tcBorders>
-            <w:vAlign w:val="center"/>
           </w:tcPr>
           <w:p>
             <w:pPr>
@@ -5192,7 +5918,6 @@
         <w:tc>
           <w:tcPr>
             <w:tcW w:type="dxa" w:w="3513"/>
-            <w:shd w:val="clear" w:color="auto" w:fill="F2F8FF"/>
             <w:tcBorders>
               <w:top w:val="single" w:sz="4" w:space="0" w:color="000000"/>
               <w:left w:val="single" w:sz="4" w:space="0" w:color="000000"/>
@@ -5201,7 +5926,6 @@
               <w:insideH w:val="single" w:sz="4" w:space="0" w:color="000000"/>
               <w:insideV w:val="single" w:sz="4" w:space="0" w:color="000000"/>
             </w:tcBorders>
-            <w:vAlign w:val="center"/>
           </w:tcPr>
           <w:p>
             <w:pPr>
@@ -5222,7 +5946,6 @@
         <w:tc>
           <w:tcPr>
             <w:tcW w:type="dxa" w:w="3513"/>
-            <w:shd w:val="clear" w:color="auto" w:fill="F2F8FF"/>
             <w:tcBorders>
               <w:top w:val="single" w:sz="4" w:space="0" w:color="000000"/>
               <w:left w:val="single" w:sz="4" w:space="0" w:color="000000"/>
@@ -5231,7 +5954,6 @@
               <w:insideH w:val="single" w:sz="4" w:space="0" w:color="000000"/>
               <w:insideV w:val="single" w:sz="4" w:space="0" w:color="000000"/>
             </w:tcBorders>
-            <w:vAlign w:val="center"/>
           </w:tcPr>
           <w:p>
             <w:pPr>
@@ -5252,7 +5974,6 @@
         <w:tc>
           <w:tcPr>
             <w:tcW w:type="dxa" w:w="3513"/>
-            <w:shd w:val="clear" w:color="auto" w:fill="F2F8FF"/>
             <w:tcBorders>
               <w:top w:val="single" w:sz="4" w:space="0" w:color="000000"/>
               <w:left w:val="single" w:sz="4" w:space="0" w:color="000000"/>
@@ -5261,7 +5982,6 @@
               <w:insideH w:val="single" w:sz="4" w:space="0" w:color="000000"/>
               <w:insideV w:val="single" w:sz="4" w:space="0" w:color="000000"/>
             </w:tcBorders>
-            <w:vAlign w:val="center"/>
           </w:tcPr>
           <w:p>
             <w:pPr>
@@ -5275,7 +5995,7 @@
                 <w:b w:val="0"/>
                 <w:sz w:val="18"/>
               </w:rPr>
-              <w:t>Nodo maestro (I2C compartido)</w:t>
+              <w:t>Nodo maestro (I2C)</w:t>
             </w:r>
           </w:p>
         </w:tc>
@@ -5284,6 +6004,7 @@
         <w:tc>
           <w:tcPr>
             <w:tcW w:type="dxa" w:w="3513"/>
+            <w:shd w:val="clear" w:color="auto" w:fill="F2F8FF"/>
             <w:tcBorders>
               <w:top w:val="single" w:sz="4" w:space="0" w:color="000000"/>
               <w:left w:val="single" w:sz="4" w:space="0" w:color="000000"/>
@@ -5292,7 +6013,6 @@
               <w:insideH w:val="single" w:sz="4" w:space="0" w:color="000000"/>
               <w:insideV w:val="single" w:sz="4" w:space="0" w:color="000000"/>
             </w:tcBorders>
-            <w:vAlign w:val="center"/>
           </w:tcPr>
           <w:p>
             <w:pPr>
@@ -5313,6 +6033,7 @@
         <w:tc>
           <w:tcPr>
             <w:tcW w:type="dxa" w:w="3513"/>
+            <w:shd w:val="clear" w:color="auto" w:fill="F2F8FF"/>
             <w:tcBorders>
               <w:top w:val="single" w:sz="4" w:space="0" w:color="000000"/>
               <w:left w:val="single" w:sz="4" w:space="0" w:color="000000"/>
@@ -5321,7 +6042,6 @@
               <w:insideH w:val="single" w:sz="4" w:space="0" w:color="000000"/>
               <w:insideV w:val="single" w:sz="4" w:space="0" w:color="000000"/>
             </w:tcBorders>
-            <w:vAlign w:val="center"/>
           </w:tcPr>
           <w:p>
             <w:pPr>
@@ -5342,6 +6062,7 @@
         <w:tc>
           <w:tcPr>
             <w:tcW w:type="dxa" w:w="3513"/>
+            <w:shd w:val="clear" w:color="auto" w:fill="F2F8FF"/>
             <w:tcBorders>
               <w:top w:val="single" w:sz="4" w:space="0" w:color="000000"/>
               <w:left w:val="single" w:sz="4" w:space="0" w:color="000000"/>
@@ -5350,7 +6071,442 @@
               <w:insideH w:val="single" w:sz="4" w:space="0" w:color="000000"/>
               <w:insideV w:val="single" w:sz="4" w:space="0" w:color="000000"/>
             </w:tcBorders>
-            <w:vAlign w:val="center"/>
+          </w:tcPr>
+          <w:p>
+            <w:pPr>
+              <w:spacing w:before="20" w:after="20" w:lineRule="auto" w:line="276"/>
+              <w:jc w:val="left"/>
+            </w:pPr>
+            <w:r/>
+            <w:r>
+              <w:rPr>
+                <w:rFonts w:ascii="Calibri" w:hAnsi="Calibri"/>
+                <w:b w:val="0"/>
+                <w:sz w:val="18"/>
+              </w:rPr>
+              <w:t>Nodo maestro</w:t>
+            </w:r>
+          </w:p>
+        </w:tc>
+      </w:tr>
+      <w:tr>
+        <w:tc>
+          <w:tcPr>
+            <w:tcW w:type="dxa" w:w="3513"/>
+            <w:tcBorders>
+              <w:top w:val="single" w:sz="4" w:space="0" w:color="000000"/>
+              <w:left w:val="single" w:sz="4" w:space="0" w:color="000000"/>
+              <w:bottom w:val="single" w:sz="4" w:space="0" w:color="000000"/>
+              <w:right w:val="single" w:sz="4" w:space="0" w:color="000000"/>
+              <w:insideH w:val="single" w:sz="4" w:space="0" w:color="000000"/>
+              <w:insideV w:val="single" w:sz="4" w:space="0" w:color="000000"/>
+            </w:tcBorders>
+          </w:tcPr>
+          <w:p>
+            <w:pPr>
+              <w:spacing w:before="20" w:after="20" w:lineRule="auto" w:line="276"/>
+              <w:jc w:val="left"/>
+            </w:pPr>
+            <w:r/>
+            <w:r>
+              <w:rPr>
+                <w:rFonts w:ascii="Calibri" w:hAnsi="Calibri"/>
+                <w:b w:val="0"/>
+                <w:sz w:val="18"/>
+              </w:rPr>
+              <w:t>SD MOSI</w:t>
+            </w:r>
+          </w:p>
+        </w:tc>
+        <w:tc>
+          <w:tcPr>
+            <w:tcW w:type="dxa" w:w="3513"/>
+            <w:tcBorders>
+              <w:top w:val="single" w:sz="4" w:space="0" w:color="000000"/>
+              <w:left w:val="single" w:sz="4" w:space="0" w:color="000000"/>
+              <w:bottom w:val="single" w:sz="4" w:space="0" w:color="000000"/>
+              <w:right w:val="single" w:sz="4" w:space="0" w:color="000000"/>
+              <w:insideH w:val="single" w:sz="4" w:space="0" w:color="000000"/>
+              <w:insideV w:val="single" w:sz="4" w:space="0" w:color="000000"/>
+            </w:tcBorders>
+          </w:tcPr>
+          <w:p>
+            <w:pPr>
+              <w:spacing w:before="20" w:after="20" w:lineRule="auto" w:line="276"/>
+              <w:jc w:val="center"/>
+            </w:pPr>
+            <w:r/>
+            <w:r>
+              <w:rPr>
+                <w:rFonts w:ascii="Calibri" w:hAnsi="Calibri"/>
+                <w:b w:val="0"/>
+                <w:sz w:val="18"/>
+              </w:rPr>
+              <w:t>GPIO 23</w:t>
+            </w:r>
+          </w:p>
+        </w:tc>
+        <w:tc>
+          <w:tcPr>
+            <w:tcW w:type="dxa" w:w="3513"/>
+            <w:tcBorders>
+              <w:top w:val="single" w:sz="4" w:space="0" w:color="000000"/>
+              <w:left w:val="single" w:sz="4" w:space="0" w:color="000000"/>
+              <w:bottom w:val="single" w:sz="4" w:space="0" w:color="000000"/>
+              <w:right w:val="single" w:sz="4" w:space="0" w:color="000000"/>
+              <w:insideH w:val="single" w:sz="4" w:space="0" w:color="000000"/>
+              <w:insideV w:val="single" w:sz="4" w:space="0" w:color="000000"/>
+            </w:tcBorders>
+          </w:tcPr>
+          <w:p>
+            <w:pPr>
+              <w:spacing w:before="20" w:after="20" w:lineRule="auto" w:line="276"/>
+              <w:jc w:val="left"/>
+            </w:pPr>
+            <w:r/>
+            <w:r>
+              <w:rPr>
+                <w:rFonts w:ascii="Calibri" w:hAnsi="Calibri"/>
+                <w:b w:val="0"/>
+                <w:sz w:val="18"/>
+              </w:rPr>
+              <w:t>Nodo maestro (SPI)</w:t>
+            </w:r>
+          </w:p>
+        </w:tc>
+      </w:tr>
+      <w:tr>
+        <w:tc>
+          <w:tcPr>
+            <w:tcW w:type="dxa" w:w="3513"/>
+            <w:shd w:val="clear" w:color="auto" w:fill="F2F8FF"/>
+            <w:tcBorders>
+              <w:top w:val="single" w:sz="4" w:space="0" w:color="000000"/>
+              <w:left w:val="single" w:sz="4" w:space="0" w:color="000000"/>
+              <w:bottom w:val="single" w:sz="4" w:space="0" w:color="000000"/>
+              <w:right w:val="single" w:sz="4" w:space="0" w:color="000000"/>
+              <w:insideH w:val="single" w:sz="4" w:space="0" w:color="000000"/>
+              <w:insideV w:val="single" w:sz="4" w:space="0" w:color="000000"/>
+            </w:tcBorders>
+          </w:tcPr>
+          <w:p>
+            <w:pPr>
+              <w:spacing w:before="20" w:after="20" w:lineRule="auto" w:line="276"/>
+              <w:jc w:val="left"/>
+            </w:pPr>
+            <w:r/>
+            <w:r>
+              <w:rPr>
+                <w:rFonts w:ascii="Calibri" w:hAnsi="Calibri"/>
+                <w:b w:val="0"/>
+                <w:sz w:val="18"/>
+              </w:rPr>
+              <w:t>SD MISO</w:t>
+            </w:r>
+          </w:p>
+        </w:tc>
+        <w:tc>
+          <w:tcPr>
+            <w:tcW w:type="dxa" w:w="3513"/>
+            <w:shd w:val="clear" w:color="auto" w:fill="F2F8FF"/>
+            <w:tcBorders>
+              <w:top w:val="single" w:sz="4" w:space="0" w:color="000000"/>
+              <w:left w:val="single" w:sz="4" w:space="0" w:color="000000"/>
+              <w:bottom w:val="single" w:sz="4" w:space="0" w:color="000000"/>
+              <w:right w:val="single" w:sz="4" w:space="0" w:color="000000"/>
+              <w:insideH w:val="single" w:sz="4" w:space="0" w:color="000000"/>
+              <w:insideV w:val="single" w:sz="4" w:space="0" w:color="000000"/>
+            </w:tcBorders>
+          </w:tcPr>
+          <w:p>
+            <w:pPr>
+              <w:spacing w:before="20" w:after="20" w:lineRule="auto" w:line="276"/>
+              <w:jc w:val="center"/>
+            </w:pPr>
+            <w:r/>
+            <w:r>
+              <w:rPr>
+                <w:rFonts w:ascii="Calibri" w:hAnsi="Calibri"/>
+                <w:b w:val="0"/>
+                <w:sz w:val="18"/>
+              </w:rPr>
+              <w:t>GPIO 19</w:t>
+            </w:r>
+          </w:p>
+        </w:tc>
+        <w:tc>
+          <w:tcPr>
+            <w:tcW w:type="dxa" w:w="3513"/>
+            <w:shd w:val="clear" w:color="auto" w:fill="F2F8FF"/>
+            <w:tcBorders>
+              <w:top w:val="single" w:sz="4" w:space="0" w:color="000000"/>
+              <w:left w:val="single" w:sz="4" w:space="0" w:color="000000"/>
+              <w:bottom w:val="single" w:sz="4" w:space="0" w:color="000000"/>
+              <w:right w:val="single" w:sz="4" w:space="0" w:color="000000"/>
+              <w:insideH w:val="single" w:sz="4" w:space="0" w:color="000000"/>
+              <w:insideV w:val="single" w:sz="4" w:space="0" w:color="000000"/>
+            </w:tcBorders>
+          </w:tcPr>
+          <w:p>
+            <w:pPr>
+              <w:spacing w:before="20" w:after="20" w:lineRule="auto" w:line="276"/>
+              <w:jc w:val="left"/>
+            </w:pPr>
+            <w:r/>
+            <w:r>
+              <w:rPr>
+                <w:rFonts w:ascii="Calibri" w:hAnsi="Calibri"/>
+                <w:b w:val="0"/>
+                <w:sz w:val="18"/>
+              </w:rPr>
+              <w:t>Nodo maestro (SPI)</w:t>
+            </w:r>
+          </w:p>
+        </w:tc>
+      </w:tr>
+      <w:tr>
+        <w:tc>
+          <w:tcPr>
+            <w:tcW w:type="dxa" w:w="3513"/>
+            <w:tcBorders>
+              <w:top w:val="single" w:sz="4" w:space="0" w:color="000000"/>
+              <w:left w:val="single" w:sz="4" w:space="0" w:color="000000"/>
+              <w:bottom w:val="single" w:sz="4" w:space="0" w:color="000000"/>
+              <w:right w:val="single" w:sz="4" w:space="0" w:color="000000"/>
+              <w:insideH w:val="single" w:sz="4" w:space="0" w:color="000000"/>
+              <w:insideV w:val="single" w:sz="4" w:space="0" w:color="000000"/>
+            </w:tcBorders>
+          </w:tcPr>
+          <w:p>
+            <w:pPr>
+              <w:spacing w:before="20" w:after="20" w:lineRule="auto" w:line="276"/>
+              <w:jc w:val="left"/>
+            </w:pPr>
+            <w:r/>
+            <w:r>
+              <w:rPr>
+                <w:rFonts w:ascii="Calibri" w:hAnsi="Calibri"/>
+                <w:b w:val="0"/>
+                <w:sz w:val="18"/>
+              </w:rPr>
+              <w:t>SD SCK</w:t>
+            </w:r>
+          </w:p>
+        </w:tc>
+        <w:tc>
+          <w:tcPr>
+            <w:tcW w:type="dxa" w:w="3513"/>
+            <w:tcBorders>
+              <w:top w:val="single" w:sz="4" w:space="0" w:color="000000"/>
+              <w:left w:val="single" w:sz="4" w:space="0" w:color="000000"/>
+              <w:bottom w:val="single" w:sz="4" w:space="0" w:color="000000"/>
+              <w:right w:val="single" w:sz="4" w:space="0" w:color="000000"/>
+              <w:insideH w:val="single" w:sz="4" w:space="0" w:color="000000"/>
+              <w:insideV w:val="single" w:sz="4" w:space="0" w:color="000000"/>
+            </w:tcBorders>
+          </w:tcPr>
+          <w:p>
+            <w:pPr>
+              <w:spacing w:before="20" w:after="20" w:lineRule="auto" w:line="276"/>
+              <w:jc w:val="center"/>
+            </w:pPr>
+            <w:r/>
+            <w:r>
+              <w:rPr>
+                <w:rFonts w:ascii="Calibri" w:hAnsi="Calibri"/>
+                <w:b w:val="0"/>
+                <w:sz w:val="18"/>
+              </w:rPr>
+              <w:t>GPIO 18</w:t>
+            </w:r>
+          </w:p>
+        </w:tc>
+        <w:tc>
+          <w:tcPr>
+            <w:tcW w:type="dxa" w:w="3513"/>
+            <w:tcBorders>
+              <w:top w:val="single" w:sz="4" w:space="0" w:color="000000"/>
+              <w:left w:val="single" w:sz="4" w:space="0" w:color="000000"/>
+              <w:bottom w:val="single" w:sz="4" w:space="0" w:color="000000"/>
+              <w:right w:val="single" w:sz="4" w:space="0" w:color="000000"/>
+              <w:insideH w:val="single" w:sz="4" w:space="0" w:color="000000"/>
+              <w:insideV w:val="single" w:sz="4" w:space="0" w:color="000000"/>
+            </w:tcBorders>
+          </w:tcPr>
+          <w:p>
+            <w:pPr>
+              <w:spacing w:before="20" w:after="20" w:lineRule="auto" w:line="276"/>
+              <w:jc w:val="left"/>
+            </w:pPr>
+            <w:r/>
+            <w:r>
+              <w:rPr>
+                <w:rFonts w:ascii="Calibri" w:hAnsi="Calibri"/>
+                <w:b w:val="0"/>
+                <w:sz w:val="18"/>
+              </w:rPr>
+              <w:t>Nodo maestro (SPI)</w:t>
+            </w:r>
+          </w:p>
+        </w:tc>
+      </w:tr>
+      <w:tr>
+        <w:tc>
+          <w:tcPr>
+            <w:tcW w:type="dxa" w:w="3513"/>
+            <w:shd w:val="clear" w:color="auto" w:fill="F2F8FF"/>
+            <w:tcBorders>
+              <w:top w:val="single" w:sz="4" w:space="0" w:color="000000"/>
+              <w:left w:val="single" w:sz="4" w:space="0" w:color="000000"/>
+              <w:bottom w:val="single" w:sz="4" w:space="0" w:color="000000"/>
+              <w:right w:val="single" w:sz="4" w:space="0" w:color="000000"/>
+              <w:insideH w:val="single" w:sz="4" w:space="0" w:color="000000"/>
+              <w:insideV w:val="single" w:sz="4" w:space="0" w:color="000000"/>
+            </w:tcBorders>
+          </w:tcPr>
+          <w:p>
+            <w:pPr>
+              <w:spacing w:before="20" w:after="20" w:lineRule="auto" w:line="276"/>
+              <w:jc w:val="left"/>
+            </w:pPr>
+            <w:r/>
+            <w:r>
+              <w:rPr>
+                <w:rFonts w:ascii="Calibri" w:hAnsi="Calibri"/>
+                <w:b w:val="0"/>
+                <w:sz w:val="18"/>
+              </w:rPr>
+              <w:t>SD CS</w:t>
+            </w:r>
+          </w:p>
+        </w:tc>
+        <w:tc>
+          <w:tcPr>
+            <w:tcW w:type="dxa" w:w="3513"/>
+            <w:shd w:val="clear" w:color="auto" w:fill="F2F8FF"/>
+            <w:tcBorders>
+              <w:top w:val="single" w:sz="4" w:space="0" w:color="000000"/>
+              <w:left w:val="single" w:sz="4" w:space="0" w:color="000000"/>
+              <w:bottom w:val="single" w:sz="4" w:space="0" w:color="000000"/>
+              <w:right w:val="single" w:sz="4" w:space="0" w:color="000000"/>
+              <w:insideH w:val="single" w:sz="4" w:space="0" w:color="000000"/>
+              <w:insideV w:val="single" w:sz="4" w:space="0" w:color="000000"/>
+            </w:tcBorders>
+          </w:tcPr>
+          <w:p>
+            <w:pPr>
+              <w:spacing w:before="20" w:after="20" w:lineRule="auto" w:line="276"/>
+              <w:jc w:val="center"/>
+            </w:pPr>
+            <w:r/>
+            <w:r>
+              <w:rPr>
+                <w:rFonts w:ascii="Calibri" w:hAnsi="Calibri"/>
+                <w:b w:val="0"/>
+                <w:sz w:val="18"/>
+              </w:rPr>
+              <w:t>GPIO 5</w:t>
+            </w:r>
+          </w:p>
+        </w:tc>
+        <w:tc>
+          <w:tcPr>
+            <w:tcW w:type="dxa" w:w="3513"/>
+            <w:shd w:val="clear" w:color="auto" w:fill="F2F8FF"/>
+            <w:tcBorders>
+              <w:top w:val="single" w:sz="4" w:space="0" w:color="000000"/>
+              <w:left w:val="single" w:sz="4" w:space="0" w:color="000000"/>
+              <w:bottom w:val="single" w:sz="4" w:space="0" w:color="000000"/>
+              <w:right w:val="single" w:sz="4" w:space="0" w:color="000000"/>
+              <w:insideH w:val="single" w:sz="4" w:space="0" w:color="000000"/>
+              <w:insideV w:val="single" w:sz="4" w:space="0" w:color="000000"/>
+            </w:tcBorders>
+          </w:tcPr>
+          <w:p>
+            <w:pPr>
+              <w:spacing w:before="20" w:after="20" w:lineRule="auto" w:line="276"/>
+              <w:jc w:val="left"/>
+            </w:pPr>
+            <w:r/>
+            <w:r>
+              <w:rPr>
+                <w:rFonts w:ascii="Calibri" w:hAnsi="Calibri"/>
+                <w:b w:val="0"/>
+                <w:sz w:val="18"/>
+              </w:rPr>
+              <w:t>Nodo maestro (SPI)</w:t>
+            </w:r>
+          </w:p>
+        </w:tc>
+      </w:tr>
+      <w:tr>
+        <w:tc>
+          <w:tcPr>
+            <w:tcW w:type="dxa" w:w="3513"/>
+            <w:tcBorders>
+              <w:top w:val="single" w:sz="4" w:space="0" w:color="000000"/>
+              <w:left w:val="single" w:sz="4" w:space="0" w:color="000000"/>
+              <w:bottom w:val="single" w:sz="4" w:space="0" w:color="000000"/>
+              <w:right w:val="single" w:sz="4" w:space="0" w:color="000000"/>
+              <w:insideH w:val="single" w:sz="4" w:space="0" w:color="000000"/>
+              <w:insideV w:val="single" w:sz="4" w:space="0" w:color="000000"/>
+            </w:tcBorders>
+          </w:tcPr>
+          <w:p>
+            <w:pPr>
+              <w:spacing w:before="20" w:after="20" w:lineRule="auto" w:line="276"/>
+              <w:jc w:val="left"/>
+            </w:pPr>
+            <w:r/>
+            <w:r>
+              <w:rPr>
+                <w:rFonts w:ascii="Calibri" w:hAnsi="Calibri"/>
+                <w:b w:val="0"/>
+                <w:sz w:val="18"/>
+              </w:rPr>
+              <w:t>Sensor HR (analógico)</w:t>
+            </w:r>
+          </w:p>
+        </w:tc>
+        <w:tc>
+          <w:tcPr>
+            <w:tcW w:type="dxa" w:w="3513"/>
+            <w:tcBorders>
+              <w:top w:val="single" w:sz="4" w:space="0" w:color="000000"/>
+              <w:left w:val="single" w:sz="4" w:space="0" w:color="000000"/>
+              <w:bottom w:val="single" w:sz="4" w:space="0" w:color="000000"/>
+              <w:right w:val="single" w:sz="4" w:space="0" w:color="000000"/>
+              <w:insideH w:val="single" w:sz="4" w:space="0" w:color="000000"/>
+              <w:insideV w:val="single" w:sz="4" w:space="0" w:color="000000"/>
+            </w:tcBorders>
+          </w:tcPr>
+          <w:p>
+            <w:pPr>
+              <w:spacing w:before="20" w:after="20" w:lineRule="auto" w:line="276"/>
+              <w:jc w:val="center"/>
+            </w:pPr>
+            <w:r/>
+            <w:r>
+              <w:rPr>
+                <w:rFonts w:ascii="Calibri" w:hAnsi="Calibri"/>
+                <w:b w:val="0"/>
+                <w:sz w:val="18"/>
+              </w:rPr>
+              <w:t>GPIO 34 (ADC1_CH6)</w:t>
+            </w:r>
+          </w:p>
+        </w:tc>
+        <w:tc>
+          <w:tcPr>
+            <w:tcW w:type="dxa" w:w="3513"/>
+            <w:tcBorders>
+              <w:top w:val="single" w:sz="4" w:space="0" w:color="000000"/>
+              <w:left w:val="single" w:sz="4" w:space="0" w:color="000000"/>
+              <w:bottom w:val="single" w:sz="4" w:space="0" w:color="000000"/>
+              <w:right w:val="single" w:sz="4" w:space="0" w:color="000000"/>
+              <w:insideH w:val="single" w:sz="4" w:space="0" w:color="000000"/>
+              <w:insideV w:val="single" w:sz="4" w:space="0" w:color="000000"/>
+            </w:tcBorders>
           </w:tcPr>
           <w:p>
             <w:pPr>
@@ -5382,7 +6538,6 @@
               <w:insideH w:val="single" w:sz="4" w:space="0" w:color="000000"/>
               <w:insideV w:val="single" w:sz="4" w:space="0" w:color="000000"/>
             </w:tcBorders>
-            <w:vAlign w:val="center"/>
           </w:tcPr>
           <w:p>
             <w:pPr>
@@ -5396,7 +6551,7 @@
                 <w:b w:val="0"/>
                 <w:sz w:val="18"/>
               </w:rPr>
-              <w:t>SD MOSI</w:t>
+              <w:t>Portapilas 4×AA (+6V)</w:t>
             </w:r>
           </w:p>
         </w:tc>
@@ -5412,7 +6567,6 @@
               <w:insideH w:val="single" w:sz="4" w:space="0" w:color="000000"/>
               <w:insideV w:val="single" w:sz="4" w:space="0" w:color="000000"/>
             </w:tcBorders>
-            <w:vAlign w:val="center"/>
           </w:tcPr>
           <w:p>
             <w:pPr>
@@ -5426,7 +6580,7 @@
                 <w:b w:val="0"/>
                 <w:sz w:val="18"/>
               </w:rPr>
-              <w:t>GPIO 23</w:t>
+              <w:t>VIN / USB 5V</w:t>
             </w:r>
           </w:p>
         </w:tc>
@@ -5442,7 +6596,6 @@
               <w:insideH w:val="single" w:sz="4" w:space="0" w:color="000000"/>
               <w:insideV w:val="single" w:sz="4" w:space="0" w:color="000000"/>
             </w:tcBorders>
-            <w:vAlign w:val="center"/>
           </w:tcPr>
           <w:p>
             <w:pPr>
@@ -5456,7 +6609,7 @@
                 <w:b w:val="0"/>
                 <w:sz w:val="18"/>
               </w:rPr>
-              <w:t>Nodo maestro (SPI)</w:t>
+              <w:t>Nodo maestro – alimentación</w:t>
             </w:r>
           </w:p>
         </w:tc>
@@ -5473,7 +6626,6 @@
               <w:insideH w:val="single" w:sz="4" w:space="0" w:color="000000"/>
               <w:insideV w:val="single" w:sz="4" w:space="0" w:color="000000"/>
             </w:tcBorders>
-            <w:vAlign w:val="center"/>
           </w:tcPr>
           <w:p>
             <w:pPr>
@@ -5487,7 +6639,7 @@
                 <w:b w:val="0"/>
                 <w:sz w:val="18"/>
               </w:rPr>
-              <w:t>SD MISO</w:t>
+              <w:t>Batería Li 3.7V/600mAh</w:t>
             </w:r>
           </w:p>
         </w:tc>
@@ -5502,7 +6654,6 @@
               <w:insideH w:val="single" w:sz="4" w:space="0" w:color="000000"/>
               <w:insideV w:val="single" w:sz="4" w:space="0" w:color="000000"/>
             </w:tcBorders>
-            <w:vAlign w:val="center"/>
           </w:tcPr>
           <w:p>
             <w:pPr>
@@ -5516,7 +6667,7 @@
                 <w:b w:val="0"/>
                 <w:sz w:val="18"/>
               </w:rPr>
-              <w:t>GPIO 19</w:t>
+              <w:t>VIN del DevKit</w:t>
             </w:r>
           </w:p>
         </w:tc>
@@ -5531,7 +6682,6 @@
               <w:insideH w:val="single" w:sz="4" w:space="0" w:color="000000"/>
               <w:insideV w:val="single" w:sz="4" w:space="0" w:color="000000"/>
             </w:tcBorders>
-            <w:vAlign w:val="center"/>
           </w:tcPr>
           <w:p>
             <w:pPr>
@@ -5545,7 +6695,7 @@
                 <w:b w:val="0"/>
                 <w:sz w:val="18"/>
               </w:rPr>
-              <w:t>Nodo maestro (SPI)</w:t>
+              <w:t>Nodo movimiento – vía TP4056</w:t>
             </w:r>
           </w:p>
         </w:tc>
@@ -5563,7 +6713,6 @@
               <w:insideH w:val="single" w:sz="4" w:space="0" w:color="000000"/>
               <w:insideV w:val="single" w:sz="4" w:space="0" w:color="000000"/>
             </w:tcBorders>
-            <w:vAlign w:val="center"/>
           </w:tcPr>
           <w:p>
             <w:pPr>
@@ -5577,7 +6726,7 @@
                 <w:b w:val="0"/>
                 <w:sz w:val="18"/>
               </w:rPr>
-              <w:t>SD SCK</w:t>
+              <w:t>Powerbank 20.000 mAh</w:t>
             </w:r>
           </w:p>
         </w:tc>
@@ -5593,7 +6742,6 @@
               <w:insideH w:val="single" w:sz="4" w:space="0" w:color="000000"/>
               <w:insideV w:val="single" w:sz="4" w:space="0" w:color="000000"/>
             </w:tcBorders>
-            <w:vAlign w:val="center"/>
           </w:tcPr>
           <w:p>
             <w:pPr>
@@ -5607,7 +6755,7 @@
                 <w:b w:val="0"/>
                 <w:sz w:val="18"/>
               </w:rPr>
-              <w:t>GPIO 18</w:t>
+              <w:t>USB-C del módulo</w:t>
             </w:r>
           </w:p>
         </w:tc>
@@ -5623,7 +6771,6 @@
               <w:insideH w:val="single" w:sz="4" w:space="0" w:color="000000"/>
               <w:insideV w:val="single" w:sz="4" w:space="0" w:color="000000"/>
             </w:tcBorders>
-            <w:vAlign w:val="center"/>
           </w:tcPr>
           <w:p>
             <w:pPr>
@@ -5637,188 +6784,7 @@
                 <w:b w:val="0"/>
                 <w:sz w:val="18"/>
               </w:rPr>
-              <w:t>Nodo maestro (SPI)</w:t>
-            </w:r>
-          </w:p>
-        </w:tc>
-      </w:tr>
-      <w:tr>
-        <w:tc>
-          <w:tcPr>
-            <w:tcW w:type="dxa" w:w="3513"/>
-            <w:tcBorders>
-              <w:top w:val="single" w:sz="4" w:space="0" w:color="000000"/>
-              <w:left w:val="single" w:sz="4" w:space="0" w:color="000000"/>
-              <w:bottom w:val="single" w:sz="4" w:space="0" w:color="000000"/>
-              <w:right w:val="single" w:sz="4" w:space="0" w:color="000000"/>
-              <w:insideH w:val="single" w:sz="4" w:space="0" w:color="000000"/>
-              <w:insideV w:val="single" w:sz="4" w:space="0" w:color="000000"/>
-            </w:tcBorders>
-            <w:vAlign w:val="center"/>
-          </w:tcPr>
-          <w:p>
-            <w:pPr>
-              <w:spacing w:before="20" w:after="20" w:lineRule="auto" w:line="276"/>
-              <w:jc w:val="left"/>
-            </w:pPr>
-            <w:r/>
-            <w:r>
-              <w:rPr>
-                <w:rFonts w:ascii="Calibri" w:hAnsi="Calibri"/>
-                <w:b w:val="0"/>
-                <w:sz w:val="18"/>
-              </w:rPr>
-              <w:t>SD CS</w:t>
-            </w:r>
-          </w:p>
-        </w:tc>
-        <w:tc>
-          <w:tcPr>
-            <w:tcW w:type="dxa" w:w="3513"/>
-            <w:tcBorders>
-              <w:top w:val="single" w:sz="4" w:space="0" w:color="000000"/>
-              <w:left w:val="single" w:sz="4" w:space="0" w:color="000000"/>
-              <w:bottom w:val="single" w:sz="4" w:space="0" w:color="000000"/>
-              <w:right w:val="single" w:sz="4" w:space="0" w:color="000000"/>
-              <w:insideH w:val="single" w:sz="4" w:space="0" w:color="000000"/>
-              <w:insideV w:val="single" w:sz="4" w:space="0" w:color="000000"/>
-            </w:tcBorders>
-            <w:vAlign w:val="center"/>
-          </w:tcPr>
-          <w:p>
-            <w:pPr>
-              <w:spacing w:before="20" w:after="20" w:lineRule="auto" w:line="276"/>
-              <w:jc w:val="center"/>
-            </w:pPr>
-            <w:r/>
-            <w:r>
-              <w:rPr>
-                <w:rFonts w:ascii="Calibri" w:hAnsi="Calibri"/>
-                <w:b w:val="0"/>
-                <w:sz w:val="18"/>
-              </w:rPr>
-              <w:t>GPIO 5</w:t>
-            </w:r>
-          </w:p>
-        </w:tc>
-        <w:tc>
-          <w:tcPr>
-            <w:tcW w:type="dxa" w:w="3513"/>
-            <w:tcBorders>
-              <w:top w:val="single" w:sz="4" w:space="0" w:color="000000"/>
-              <w:left w:val="single" w:sz="4" w:space="0" w:color="000000"/>
-              <w:bottom w:val="single" w:sz="4" w:space="0" w:color="000000"/>
-              <w:right w:val="single" w:sz="4" w:space="0" w:color="000000"/>
-              <w:insideH w:val="single" w:sz="4" w:space="0" w:color="000000"/>
-              <w:insideV w:val="single" w:sz="4" w:space="0" w:color="000000"/>
-            </w:tcBorders>
-            <w:vAlign w:val="center"/>
-          </w:tcPr>
-          <w:p>
-            <w:pPr>
-              <w:spacing w:before="20" w:after="20" w:lineRule="auto" w:line="276"/>
-              <w:jc w:val="left"/>
-            </w:pPr>
-            <w:r/>
-            <w:r>
-              <w:rPr>
-                <w:rFonts w:ascii="Calibri" w:hAnsi="Calibri"/>
-                <w:b w:val="0"/>
-                <w:sz w:val="18"/>
-              </w:rPr>
-              <w:t>Nodo maestro (SPI)</w:t>
-            </w:r>
-          </w:p>
-        </w:tc>
-      </w:tr>
-      <w:tr>
-        <w:tc>
-          <w:tcPr>
-            <w:tcW w:type="dxa" w:w="3513"/>
-            <w:shd w:val="clear" w:color="auto" w:fill="F2F8FF"/>
-            <w:tcBorders>
-              <w:top w:val="single" w:sz="4" w:space="0" w:color="000000"/>
-              <w:left w:val="single" w:sz="4" w:space="0" w:color="000000"/>
-              <w:bottom w:val="single" w:sz="4" w:space="0" w:color="000000"/>
-              <w:right w:val="single" w:sz="4" w:space="0" w:color="000000"/>
-              <w:insideH w:val="single" w:sz="4" w:space="0" w:color="000000"/>
-              <w:insideV w:val="single" w:sz="4" w:space="0" w:color="000000"/>
-            </w:tcBorders>
-            <w:vAlign w:val="center"/>
-          </w:tcPr>
-          <w:p>
-            <w:pPr>
-              <w:spacing w:before="20" w:after="20" w:lineRule="auto" w:line="276"/>
-              <w:jc w:val="left"/>
-            </w:pPr>
-            <w:r/>
-            <w:r>
-              <w:rPr>
-                <w:rFonts w:ascii="Calibri" w:hAnsi="Calibri"/>
-                <w:b w:val="0"/>
-                <w:sz w:val="18"/>
-              </w:rPr>
-              <w:t>Sensor HR (analógico)</w:t>
-            </w:r>
-          </w:p>
-        </w:tc>
-        <w:tc>
-          <w:tcPr>
-            <w:tcW w:type="dxa" w:w="3513"/>
-            <w:shd w:val="clear" w:color="auto" w:fill="F2F8FF"/>
-            <w:tcBorders>
-              <w:top w:val="single" w:sz="4" w:space="0" w:color="000000"/>
-              <w:left w:val="single" w:sz="4" w:space="0" w:color="000000"/>
-              <w:bottom w:val="single" w:sz="4" w:space="0" w:color="000000"/>
-              <w:right w:val="single" w:sz="4" w:space="0" w:color="000000"/>
-              <w:insideH w:val="single" w:sz="4" w:space="0" w:color="000000"/>
-              <w:insideV w:val="single" w:sz="4" w:space="0" w:color="000000"/>
-            </w:tcBorders>
-            <w:vAlign w:val="center"/>
-          </w:tcPr>
-          <w:p>
-            <w:pPr>
-              <w:spacing w:before="20" w:after="20" w:lineRule="auto" w:line="276"/>
-              <w:jc w:val="center"/>
-            </w:pPr>
-            <w:r/>
-            <w:r>
-              <w:rPr>
-                <w:rFonts w:ascii="Calibri" w:hAnsi="Calibri"/>
-                <w:b w:val="0"/>
-                <w:sz w:val="18"/>
-              </w:rPr>
-              <w:t>GPIO 34 (ADC1_CH6)</w:t>
-            </w:r>
-          </w:p>
-        </w:tc>
-        <w:tc>
-          <w:tcPr>
-            <w:tcW w:type="dxa" w:w="3513"/>
-            <w:shd w:val="clear" w:color="auto" w:fill="F2F8FF"/>
-            <w:tcBorders>
-              <w:top w:val="single" w:sz="4" w:space="0" w:color="000000"/>
-              <w:left w:val="single" w:sz="4" w:space="0" w:color="000000"/>
-              <w:bottom w:val="single" w:sz="4" w:space="0" w:color="000000"/>
-              <w:right w:val="single" w:sz="4" w:space="0" w:color="000000"/>
-              <w:insideH w:val="single" w:sz="4" w:space="0" w:color="000000"/>
-              <w:insideV w:val="single" w:sz="4" w:space="0" w:color="000000"/>
-            </w:tcBorders>
-            <w:vAlign w:val="center"/>
-          </w:tcPr>
-          <w:p>
-            <w:pPr>
-              <w:spacing w:before="20" w:after="20" w:lineRule="auto" w:line="276"/>
-              <w:jc w:val="left"/>
-            </w:pPr>
-            <w:r/>
-            <w:r>
-              <w:rPr>
-                <w:rFonts w:ascii="Calibri" w:hAnsi="Calibri"/>
-                <w:b w:val="0"/>
-                <w:sz w:val="18"/>
-              </w:rPr>
-              <w:t>Nodo maestro</w:t>
+              <w:t>Nodo táctil S3 – alimentación</w:t>
             </w:r>
           </w:p>
         </w:tc>
@@ -5864,7 +6830,7 @@
           <w:rFonts w:ascii="Calibri" w:hAnsi="Calibri"/>
           <w:sz w:val="20"/>
         </w:rPr>
-        <w:t>Configurar la dirección MAC del nodo maestro en los archivos main.c de esp32_2 y esp_32_s3_touch_1.28 (macro MASTER_MAC_ADDR). Utilizar la herramienta 'Dirección mac' del repositorio para obtener la MAC actual del nodo maestro.</w:t>
+        <w:t>Configurar la dirección MAC del nodo maestro en los archivos main.c de esp32_2 y esp_32_s3_touch_1.28 (macro MASTER_MAC_ADDR). Utilizar la herramienta 'Dirección mac' del repositorio para obtenerla.</w:t>
       </w:r>
     </w:p>
     <w:p>
@@ -5892,7 +6858,7 @@
           <w:rFonts w:ascii="Calibri" w:hAnsi="Calibri"/>
           <w:sz w:val="20"/>
         </w:rPr>
-        <w:t>Para la herramienta WHO_AM_I: abrir el archivo .ino en Arduino IDE, seleccionar la placa 'ESP32 Dev Module' y puerto COM correspondiente, luego cargar el firmware.</w:t>
+        <w:t>Para la herramienta WHO_AM_I: abrir el .ino en Arduino IDE, seleccionar placa 'ESP32 Dev Module' y cargar el firmware.</w:t>
       </w:r>
     </w:p>
     <w:p>
@@ -5906,7 +6872,7 @@
           <w:rFonts w:ascii="Calibri" w:hAnsi="Calibri"/>
           <w:sz w:val="20"/>
         </w:rPr>
-        <w:t>Verificar la carga exitosa monitoreando la salida serial a 115200 baudios.</w:t>
+        <w:t>Verificar la carga monitoreando la salida serial a 115200 baudios.</w:t>
       </w:r>
     </w:p>
     <w:p>
@@ -5926,17 +6892,16 @@
     </w:p>
     <w:p>
       <w:pPr>
-        <w:spacing w:before="0" w:after="80" w:lineRule="auto" w:line="360"/>
+        <w:pStyle w:val="ListNumber"/>
+        <w:spacing w:before="0" w:after="40" w:lineRule="auto" w:line="312"/>
         <w:jc w:val="both"/>
       </w:pPr>
       <w:r>
         <w:rPr>
           <w:rFonts w:ascii="Calibri" w:hAnsi="Calibri"/>
-          <w:b w:val="0"/>
-          <w:i w:val="0"/>
-          <w:sz w:val="22"/>
+          <w:sz w:val="20"/>
         </w:rPr>
-        <w:t>Una vez cargado el firmware en cada nodo, seguir el procedimiento de operación descrito a continuación:</w:t>
+        <w:t>Conectar las fuentes de alimentación: encender el portapilas 4×AA del nodo maestro; asegurarse de que la powerbank del nodo táctil S3 esté cargada; verificar que la batería de litio del nodo movimiento esté cargada mediante el módulo TP4056 (LED azul = carga completa).</w:t>
       </w:r>
     </w:p>
     <w:p>
@@ -5950,7 +6915,7 @@
           <w:rFonts w:ascii="Calibri" w:hAnsi="Calibri"/>
           <w:sz w:val="20"/>
         </w:rPr>
-        <w:t>Encender el nodo maestro primero; esperar al menos 3 segundos para que inicialice el módulo RTC y el sistema de archivos de la tarjeta SD.</w:t>
+        <w:t>Encender el nodo maestro primero; esperar 3 segundos para que inicialice el RTC y el sistema de archivos de la SD.</w:t>
       </w:r>
     </w:p>
     <w:p>
@@ -5964,7 +6929,7 @@
           <w:rFonts w:ascii="Calibri" w:hAnsi="Calibri"/>
           <w:sz w:val="20"/>
         </w:rPr>
-        <w:t>Encender los nodos esclavos (esp32_2 y esp32_s3). Cada nodo ejecutará automáticamente la calibración del sensor IMU durante los primeros 2 segundos.</w:t>
+        <w:t>Encender los nodos esclavos (esp32_2 y esp32_s3). Cada nodo ejecutará la calibración automática del IMU durante los primeros 2 segundos.</w:t>
       </w:r>
     </w:p>
     <w:p>
@@ -5978,7 +6943,7 @@
           <w:rFonts w:ascii="Calibri" w:hAnsi="Calibri"/>
           <w:sz w:val="20"/>
         </w:rPr>
-        <w:t>Verificar el emparejamiento ESP-NOW: el monitor serie del nodo maestro (115200 baudios) debe mostrar mensajes de recepción con el formato: '[ESPNOW] Datos IMU recibidos: roll=X.XX pitch=Y.YY accX=Z.ZZ'.</w:t>
+        <w:t>Verificar el emparejamiento ESP-NOW: el monitor serie del maestro (115200 baudios) debe mostrar: '[ESPNOW] Datos IMU recibidos: roll=X.XX pitch=Y.YY accX=Z.ZZ'.</w:t>
       </w:r>
     </w:p>
     <w:p>
@@ -5992,7 +6957,7 @@
           <w:rFonts w:ascii="Calibri" w:hAnsi="Calibri"/>
           <w:sz w:val="20"/>
         </w:rPr>
-        <w:t>Los datos de ritmo cardíaco se mostrarán en el monitor serie del nodo maestro como: '[HR] Valor ADC: XXXX | BPM estimado: YY'.</w:t>
+        <w:t>Los registros se almacenan en la SD en formato CSV: 'datos_YYYY-MM-DD.csv' con columnas: timestamp, roll, pitch, accX, accY, accZ, bpm.</w:t>
       </w:r>
     </w:p>
     <w:p>
@@ -6006,7 +6971,7 @@
           <w:rFonts w:ascii="Calibri" w:hAnsi="Calibri"/>
           <w:sz w:val="20"/>
         </w:rPr>
-        <w:t>Los registros completos se almacenan en la tarjeta SD en formato CSV bajo el nombre 'datos_YYYY-MM-DD.csv' con las columnas: timestamp, roll, pitch, accX, accY, accZ, bpm.</w:t>
+        <w:t>Para diagnóstico WHO_AM_I: ejecutar la herramienta y verificar que el registro 0x75 retorna 0x72 (MPU6050C). Un valor diferente indica sensor falsificado o revisión distinta.</w:t>
       </w:r>
     </w:p>
     <w:p>
@@ -6020,21 +6985,7 @@
           <w:rFonts w:ascii="Calibri" w:hAnsi="Calibri"/>
           <w:sz w:val="20"/>
         </w:rPr>
-        <w:t>Para el diagnóstico WHO_AM_I: ejecutar la herramienta y verificar en el monitor serie que el registro 0x75 retorna el valor 0x72 (MPU6050C). Un valor diferente indica sensor falsificado o revisión de hardware alternativa.</w:t>
-      </w:r>
-    </w:p>
-    <w:p>
-      <w:pPr>
-        <w:pStyle w:val="ListNumber"/>
-        <w:spacing w:before="0" w:after="40" w:lineRule="auto" w:line="312"/>
-        <w:jc w:val="both"/>
-      </w:pPr>
-      <w:r>
-        <w:rPr>
-          <w:rFonts w:ascii="Calibri" w:hAnsi="Calibri"/>
-          <w:sz w:val="20"/>
-        </w:rPr>
-        <w:t>Para detener el registro, apagar los nodos esclavos primero y luego el nodo maestro para garantizar el cierre correcto del archivo CSV en la SD.</w:t>
+        <w:t>Para detener el sistema: apagar nodos esclavos primero, luego el maestro, garantizando el cierre correcto del archivo CSV en la SD.</w:t>
       </w:r>
     </w:p>
     <w:p>
@@ -6054,7 +7005,7 @@
           <w:color w:val="00467F"/>
           <w:sz w:val="26"/>
         </w:rPr>
-        <w:t>7. Validación y Caracterización</w:t>
+        <w:t>7. Estado del Prototipo y Trabajo Futuro</w:t>
       </w:r>
     </w:p>
     <w:p>
@@ -6069,7 +7020,7 @@
           <w:i w:val="0"/>
           <w:sz w:val="22"/>
         </w:rPr>
-        <w:t>La validación del sistema se realizó mediante pruebas de funcionamiento en escenario real, evaluando la capacidad del sistema para capturar, transmitir y almacenar datos de movimiento y ritmo cardíaco de forma continua durante sesiones de 30 minutos. Los ensayos incluyeron actividades representativas de la vida diaria: caminar en línea recta, subir y bajar escaleras, sentarse y levantarse, y permanencia en reposo.</w:t>
+        <w:t>El sistema presentado en este artículo corresponde a un prototipo funcional en etapa de desarrollo. Los cuatro nodos han sido implementados y el firmware se ejecuta correctamente en condiciones de laboratorio, con comunicación ESP-NOW verificada entre nodos y registro de datos en tarjeta SD. En esta versión no se han realizado pruebas de validación clínica formal ni caracterización estadística exhaustiva de los sensores, por lo que los valores de referencia presentados corresponden a las especificaciones técnicas de los datasheets de los fabricantes.</w:t>
       </w:r>
     </w:p>
     <w:p>
@@ -6084,7 +7035,7 @@
           <w:color w:val="00467F"/>
           <w:sz w:val="22"/>
         </w:rPr>
-        <w:t>7.1 Especificaciones Técnicas del Sistema</w:t>
+        <w:t>7.1 Especificaciones Técnicas de Referencia (Datasheet)</w:t>
       </w:r>
     </w:p>
     <w:p>
@@ -6099,7 +7050,7 @@
           <w:i w:val="0"/>
           <w:sz w:val="22"/>
         </w:rPr>
-        <w:t>La siguiente tabla presenta las características técnicas medidas y configuradas del sistema:</w:t>
+        <w:t>La siguiente tabla resume los parámetros técnicos de los componentes principales según sus hojas de datos:</w:t>
       </w:r>
     </w:p>
     <w:tbl>
@@ -6127,7 +7078,6 @@
               <w:insideH w:val="single" w:sz="4" w:space="0" w:color="000000"/>
               <w:insideV w:val="single" w:sz="4" w:space="0" w:color="000000"/>
             </w:tcBorders>
-            <w:vAlign w:val="center"/>
           </w:tcPr>
           <w:p>
             <w:pPr>
@@ -6157,7 +7107,6 @@
               <w:insideH w:val="single" w:sz="4" w:space="0" w:color="000000"/>
               <w:insideV w:val="single" w:sz="4" w:space="0" w:color="000000"/>
             </w:tcBorders>
-            <w:vAlign w:val="center"/>
           </w:tcPr>
           <w:p>
             <w:pPr>
@@ -6187,7 +7136,6 @@
               <w:insideH w:val="single" w:sz="4" w:space="0" w:color="000000"/>
               <w:insideV w:val="single" w:sz="4" w:space="0" w:color="000000"/>
             </w:tcBorders>
-            <w:vAlign w:val="center"/>
           </w:tcPr>
           <w:p>
             <w:pPr>
@@ -6219,7 +7167,6 @@
               <w:insideH w:val="single" w:sz="4" w:space="0" w:color="000000"/>
               <w:insideV w:val="single" w:sz="4" w:space="0" w:color="000000"/>
             </w:tcBorders>
-            <w:vAlign w:val="center"/>
           </w:tcPr>
           <w:p>
             <w:pPr>
@@ -6249,7 +7196,6 @@
               <w:insideH w:val="single" w:sz="4" w:space="0" w:color="000000"/>
               <w:insideV w:val="single" w:sz="4" w:space="0" w:color="000000"/>
             </w:tcBorders>
-            <w:vAlign w:val="center"/>
           </w:tcPr>
           <w:p>
             <w:pPr>
@@ -6279,7 +7225,6 @@
               <w:insideH w:val="single" w:sz="4" w:space="0" w:color="000000"/>
               <w:insideV w:val="single" w:sz="4" w:space="0" w:color="000000"/>
             </w:tcBorders>
-            <w:vAlign w:val="center"/>
           </w:tcPr>
           <w:p>
             <w:pPr>
@@ -6293,7 +7238,7 @@
                 <w:b w:val="0"/>
                 <w:sz w:val="18"/>
               </w:rPr>
-              <w:t>Rango ±2g configurado</w:t>
+              <w:t>Rango ±2g, datasheet InvenSense</w:t>
             </w:r>
           </w:p>
         </w:tc>
@@ -6310,7 +7255,6 @@
               <w:insideH w:val="single" w:sz="4" w:space="0" w:color="000000"/>
               <w:insideV w:val="single" w:sz="4" w:space="0" w:color="000000"/>
             </w:tcBorders>
-            <w:vAlign w:val="center"/>
           </w:tcPr>
           <w:p>
             <w:pPr>
@@ -6339,7 +7283,6 @@
               <w:insideH w:val="single" w:sz="4" w:space="0" w:color="000000"/>
               <w:insideV w:val="single" w:sz="4" w:space="0" w:color="000000"/>
             </w:tcBorders>
-            <w:vAlign w:val="center"/>
           </w:tcPr>
           <w:p>
             <w:pPr>
@@ -6368,7 +7311,6 @@
               <w:insideH w:val="single" w:sz="4" w:space="0" w:color="000000"/>
               <w:insideV w:val="single" w:sz="4" w:space="0" w:color="000000"/>
             </w:tcBorders>
-            <w:vAlign w:val="center"/>
           </w:tcPr>
           <w:p>
             <w:pPr>
@@ -6382,7 +7324,7 @@
                 <w:b w:val="0"/>
                 <w:sz w:val="18"/>
               </w:rPr>
-              <w:t>Rango ±250°/s configurado</w:t>
+              <w:t>Rango ±250°/s, datasheet InvenSense</w:t>
             </w:r>
           </w:p>
         </w:tc>
@@ -6400,7 +7342,6 @@
               <w:insideH w:val="single" w:sz="4" w:space="0" w:color="000000"/>
               <w:insideV w:val="single" w:sz="4" w:space="0" w:color="000000"/>
             </w:tcBorders>
-            <w:vAlign w:val="center"/>
           </w:tcPr>
           <w:p>
             <w:pPr>
@@ -6430,7 +7371,6 @@
               <w:insideH w:val="single" w:sz="4" w:space="0" w:color="000000"/>
               <w:insideV w:val="single" w:sz="4" w:space="0" w:color="000000"/>
             </w:tcBorders>
-            <w:vAlign w:val="center"/>
           </w:tcPr>
           <w:p>
             <w:pPr>
@@ -6460,7 +7400,6 @@
               <w:insideH w:val="single" w:sz="4" w:space="0" w:color="000000"/>
               <w:insideV w:val="single" w:sz="4" w:space="0" w:color="000000"/>
             </w:tcBorders>
-            <w:vAlign w:val="center"/>
           </w:tcPr>
           <w:p>
             <w:pPr>
@@ -6491,7 +7430,6 @@
               <w:insideH w:val="single" w:sz="4" w:space="0" w:color="000000"/>
               <w:insideV w:val="single" w:sz="4" w:space="0" w:color="000000"/>
             </w:tcBorders>
-            <w:vAlign w:val="center"/>
           </w:tcPr>
           <w:p>
             <w:pPr>
@@ -6520,7 +7458,6 @@
               <w:insideH w:val="single" w:sz="4" w:space="0" w:color="000000"/>
               <w:insideV w:val="single" w:sz="4" w:space="0" w:color="000000"/>
             </w:tcBorders>
-            <w:vAlign w:val="center"/>
           </w:tcPr>
           <w:p>
             <w:pPr>
@@ -6549,7 +7486,6 @@
               <w:insideH w:val="single" w:sz="4" w:space="0" w:color="000000"/>
               <w:insideV w:val="single" w:sz="4" w:space="0" w:color="000000"/>
             </w:tcBorders>
-            <w:vAlign w:val="center"/>
           </w:tcPr>
           <w:p>
             <w:pPr>
@@ -6581,7 +7517,6 @@
               <w:insideH w:val="single" w:sz="4" w:space="0" w:color="000000"/>
               <w:insideV w:val="single" w:sz="4" w:space="0" w:color="000000"/>
             </w:tcBorders>
-            <w:vAlign w:val="center"/>
           </w:tcPr>
           <w:p>
             <w:pPr>
@@ -6595,7 +7530,7 @@
                 <w:b w:val="0"/>
                 <w:sz w:val="18"/>
               </w:rPr>
-              <w:t>Latencia ESP-NOW (promedio)</w:t>
+              <w:t>Latencia ESP-NOW</w:t>
             </w:r>
           </w:p>
         </w:tc>
@@ -6611,7 +7546,6 @@
               <w:insideH w:val="single" w:sz="4" w:space="0" w:color="000000"/>
               <w:insideV w:val="single" w:sz="4" w:space="0" w:color="000000"/>
             </w:tcBorders>
-            <w:vAlign w:val="center"/>
           </w:tcPr>
           <w:p>
             <w:pPr>
@@ -6625,7 +7559,7 @@
                 <w:b w:val="0"/>
                 <w:sz w:val="18"/>
               </w:rPr>
-              <w:t>&lt; 8 ms</w:t>
+              <w:t>&lt; 10 ms (estimado)</w:t>
             </w:r>
           </w:p>
         </w:tc>
@@ -6641,7 +7575,6 @@
               <w:insideH w:val="single" w:sz="4" w:space="0" w:color="000000"/>
               <w:insideV w:val="single" w:sz="4" w:space="0" w:color="000000"/>
             </w:tcBorders>
-            <w:vAlign w:val="center"/>
           </w:tcPr>
           <w:p>
             <w:pPr>
@@ -6655,7 +7588,7 @@
                 <w:b w:val="0"/>
                 <w:sz w:val="18"/>
               </w:rPr>
-              <w:t>Medido a 3 m de distancia</w:t>
+              <w:t>Especificación Espressif</w:t>
             </w:r>
           </w:p>
         </w:tc>
@@ -6672,7 +7605,6 @@
               <w:insideH w:val="single" w:sz="4" w:space="0" w:color="000000"/>
               <w:insideV w:val="single" w:sz="4" w:space="0" w:color="000000"/>
             </w:tcBorders>
-            <w:vAlign w:val="center"/>
           </w:tcPr>
           <w:p>
             <w:pPr>
@@ -6686,7 +7618,7 @@
                 <w:b w:val="0"/>
                 <w:sz w:val="18"/>
               </w:rPr>
-              <w:t>Alcance ESP-NOW (estimado)</w:t>
+              <w:t>Alcance ESP-NOW</w:t>
             </w:r>
           </w:p>
         </w:tc>
@@ -6701,7 +7633,6 @@
               <w:insideH w:val="single" w:sz="4" w:space="0" w:color="000000"/>
               <w:insideV w:val="single" w:sz="4" w:space="0" w:color="000000"/>
             </w:tcBorders>
-            <w:vAlign w:val="center"/>
           </w:tcPr>
           <w:p>
             <w:pPr>
@@ -6730,7 +7661,6 @@
               <w:insideH w:val="single" w:sz="4" w:space="0" w:color="000000"/>
               <w:insideV w:val="single" w:sz="4" w:space="0" w:color="000000"/>
             </w:tcBorders>
-            <w:vAlign w:val="center"/>
           </w:tcPr>
           <w:p>
             <w:pPr>
@@ -6744,7 +7674,7 @@
                 <w:b w:val="0"/>
                 <w:sz w:val="18"/>
               </w:rPr>
-              <w:t>Sin obstáculos</w:t>
+              <w:t>Especificación Espressif</w:t>
             </w:r>
           </w:p>
         </w:tc>
@@ -6762,7 +7692,6 @@
               <w:insideH w:val="single" w:sz="4" w:space="0" w:color="000000"/>
               <w:insideV w:val="single" w:sz="4" w:space="0" w:color="000000"/>
             </w:tcBorders>
-            <w:vAlign w:val="center"/>
           </w:tcPr>
           <w:p>
             <w:pPr>
@@ -6792,7 +7721,6 @@
               <w:insideH w:val="single" w:sz="4" w:space="0" w:color="000000"/>
               <w:insideV w:val="single" w:sz="4" w:space="0" w:color="000000"/>
             </w:tcBorders>
-            <w:vAlign w:val="center"/>
           </w:tcPr>
           <w:p>
             <w:pPr>
@@ -6822,7 +7750,6 @@
               <w:insideH w:val="single" w:sz="4" w:space="0" w:color="000000"/>
               <w:insideV w:val="single" w:sz="4" w:space="0" w:color="000000"/>
             </w:tcBorders>
-            <w:vAlign w:val="center"/>
           </w:tcPr>
           <w:p>
             <w:pPr>
@@ -6836,7 +7763,7 @@
                 <w:b w:val="0"/>
                 <w:sz w:val="18"/>
               </w:rPr>
-              <w:t>Datasheet Maxim</w:t>
+              <w:t>Datasheet Maxim Integrated</w:t>
             </w:r>
           </w:p>
         </w:tc>
@@ -6853,7 +7780,6 @@
               <w:insideH w:val="single" w:sz="4" w:space="0" w:color="000000"/>
               <w:insideV w:val="single" w:sz="4" w:space="0" w:color="000000"/>
             </w:tcBorders>
-            <w:vAlign w:val="center"/>
           </w:tcPr>
           <w:p>
             <w:pPr>
@@ -6882,7 +7808,6 @@
               <w:insideH w:val="single" w:sz="4" w:space="0" w:color="000000"/>
               <w:insideV w:val="single" w:sz="4" w:space="0" w:color="000000"/>
             </w:tcBorders>
-            <w:vAlign w:val="center"/>
           </w:tcPr>
           <w:p>
             <w:pPr>
@@ -6911,7 +7836,6 @@
               <w:insideH w:val="single" w:sz="4" w:space="0" w:color="000000"/>
               <w:insideV w:val="single" w:sz="4" w:space="0" w:color="000000"/>
             </w:tcBorders>
-            <w:vAlign w:val="center"/>
           </w:tcPr>
           <w:p>
             <w:pPr>
@@ -6943,7 +7867,6 @@
               <w:insideH w:val="single" w:sz="4" w:space="0" w:color="000000"/>
               <w:insideV w:val="single" w:sz="4" w:space="0" w:color="000000"/>
             </w:tcBorders>
-            <w:vAlign w:val="center"/>
           </w:tcPr>
           <w:p>
             <w:pPr>
@@ -6957,7 +7880,7 @@
                 <w:b w:val="0"/>
                 <w:sz w:val="18"/>
               </w:rPr>
-              <w:t>Capacidad tarjeta microSD</w:t>
+              <w:t>Capacidad powerbank (Nodo S3)</w:t>
             </w:r>
           </w:p>
         </w:tc>
@@ -6973,7 +7896,6 @@
               <w:insideH w:val="single" w:sz="4" w:space="0" w:color="000000"/>
               <w:insideV w:val="single" w:sz="4" w:space="0" w:color="000000"/>
             </w:tcBorders>
-            <w:vAlign w:val="center"/>
           </w:tcPr>
           <w:p>
             <w:pPr>
@@ -6987,7 +7909,7 @@
                 <w:b w:val="0"/>
                 <w:sz w:val="18"/>
               </w:rPr>
-              <w:t>16 GB</w:t>
+              <w:t>20.000 mAh / 5V USB</w:t>
             </w:r>
           </w:p>
         </w:tc>
@@ -7003,7 +7925,6 @@
               <w:insideH w:val="single" w:sz="4" w:space="0" w:color="000000"/>
               <w:insideV w:val="single" w:sz="4" w:space="0" w:color="000000"/>
             </w:tcBorders>
-            <w:vAlign w:val="center"/>
           </w:tcPr>
           <w:p>
             <w:pPr>
@@ -7017,7 +7938,7 @@
                 <w:b w:val="0"/>
                 <w:sz w:val="18"/>
               </w:rPr>
-              <w:t>Formato FAT32</w:t>
+              <w:t>Autonomía estimada: 40–60 h</w:t>
             </w:r>
           </w:p>
         </w:tc>
@@ -7034,7 +7955,6 @@
               <w:insideH w:val="single" w:sz="4" w:space="0" w:color="000000"/>
               <w:insideV w:val="single" w:sz="4" w:space="0" w:color="000000"/>
             </w:tcBorders>
-            <w:vAlign w:val="center"/>
           </w:tcPr>
           <w:p>
             <w:pPr>
@@ -7048,7 +7968,7 @@
                 <w:b w:val="0"/>
                 <w:sz w:val="18"/>
               </w:rPr>
-              <w:t>Consumo nodo maestro (activo)</w:t>
+              <w:t>Batería Li (Nodo Movimiento)</w:t>
             </w:r>
           </w:p>
         </w:tc>
@@ -7063,7 +7983,6 @@
               <w:insideH w:val="single" w:sz="4" w:space="0" w:color="000000"/>
               <w:insideV w:val="single" w:sz="4" w:space="0" w:color="000000"/>
             </w:tcBorders>
-            <w:vAlign w:val="center"/>
           </w:tcPr>
           <w:p>
             <w:pPr>
@@ -7077,7 +7996,7 @@
                 <w:b w:val="0"/>
                 <w:sz w:val="18"/>
               </w:rPr>
-              <w:t>~180 mA @ 3.3V</w:t>
+              <w:t>3.7 V / 600 mAh</w:t>
             </w:r>
           </w:p>
         </w:tc>
@@ -7092,7 +8011,6 @@
               <w:insideH w:val="single" w:sz="4" w:space="0" w:color="000000"/>
               <w:insideV w:val="single" w:sz="4" w:space="0" w:color="000000"/>
             </w:tcBorders>
-            <w:vAlign w:val="center"/>
           </w:tcPr>
           <w:p>
             <w:pPr>
@@ -7106,7 +8024,7 @@
                 <w:b w:val="0"/>
                 <w:sz w:val="18"/>
               </w:rPr>
-              <w:t>Medido con multímetro</w:t>
+              <w:t>Autonomía estimada: 2–4 h</w:t>
             </w:r>
           </w:p>
         </w:tc>
@@ -7124,7 +8042,6 @@
               <w:insideH w:val="single" w:sz="4" w:space="0" w:color="000000"/>
               <w:insideV w:val="single" w:sz="4" w:space="0" w:color="000000"/>
             </w:tcBorders>
-            <w:vAlign w:val="center"/>
           </w:tcPr>
           <w:p>
             <w:pPr>
@@ -7138,7 +8055,7 @@
                 <w:b w:val="0"/>
                 <w:sz w:val="18"/>
               </w:rPr>
-              <w:t>Consumo nodo movimiento (activo)</w:t>
+              <w:t>Portapilas 4×AA (Nodo Maestro)</w:t>
             </w:r>
           </w:p>
         </w:tc>
@@ -7154,7 +8071,6 @@
               <w:insideH w:val="single" w:sz="4" w:space="0" w:color="000000"/>
               <w:insideV w:val="single" w:sz="4" w:space="0" w:color="000000"/>
             </w:tcBorders>
-            <w:vAlign w:val="center"/>
           </w:tcPr>
           <w:p>
             <w:pPr>
@@ -7168,7 +8084,7 @@
                 <w:b w:val="0"/>
                 <w:sz w:val="18"/>
               </w:rPr>
-              <w:t>~120 mA @ 3.3V</w:t>
+              <w:t>~6V / 2.400–3.000 mAh</w:t>
             </w:r>
           </w:p>
         </w:tc>
@@ -7184,7 +8100,6 @@
               <w:insideH w:val="single" w:sz="4" w:space="0" w:color="000000"/>
               <w:insideV w:val="single" w:sz="4" w:space="0" w:color="000000"/>
             </w:tcBorders>
-            <w:vAlign w:val="center"/>
           </w:tcPr>
           <w:p>
             <w:pPr>
@@ -7198,7 +8113,7 @@
                 <w:b w:val="0"/>
                 <w:sz w:val="18"/>
               </w:rPr>
-              <w:t>Medido con multímetro</w:t>
+              <w:t>Pilas alcalinas, autonomía: 8–15 h</w:t>
             </w:r>
           </w:p>
         </w:tc>
@@ -7215,97 +8130,6 @@
               <w:insideH w:val="single" w:sz="4" w:space="0" w:color="000000"/>
               <w:insideV w:val="single" w:sz="4" w:space="0" w:color="000000"/>
             </w:tcBorders>
-            <w:vAlign w:val="center"/>
-          </w:tcPr>
-          <w:p>
-            <w:pPr>
-              <w:spacing w:before="20" w:after="20" w:lineRule="auto" w:line="276"/>
-              <w:jc w:val="left"/>
-            </w:pPr>
-            <w:r/>
-            <w:r>
-              <w:rPr>
-                <w:rFonts w:ascii="Calibri" w:hAnsi="Calibri"/>
-                <w:b w:val="0"/>
-                <w:sz w:val="18"/>
-              </w:rPr>
-              <w:t>Ruido relativo sensor (estimado)</w:t>
-            </w:r>
-          </w:p>
-        </w:tc>
-        <w:tc>
-          <w:tcPr>
-            <w:tcW w:type="dxa" w:w="3513"/>
-            <w:tcBorders>
-              <w:top w:val="single" w:sz="4" w:space="0" w:color="000000"/>
-              <w:left w:val="single" w:sz="4" w:space="0" w:color="000000"/>
-              <w:bottom w:val="single" w:sz="4" w:space="0" w:color="000000"/>
-              <w:right w:val="single" w:sz="4" w:space="0" w:color="000000"/>
-              <w:insideH w:val="single" w:sz="4" w:space="0" w:color="000000"/>
-              <w:insideV w:val="single" w:sz="4" w:space="0" w:color="000000"/>
-            </w:tcBorders>
-            <w:vAlign w:val="center"/>
-          </w:tcPr>
-          <w:p>
-            <w:pPr>
-              <w:spacing w:before="20" w:after="20" w:lineRule="auto" w:line="276"/>
-              <w:jc w:val="center"/>
-            </w:pPr>
-            <w:r/>
-            <w:r>
-              <w:rPr>
-                <w:rFonts w:ascii="Calibri" w:hAnsi="Calibri"/>
-                <w:b w:val="0"/>
-                <w:sz w:val="18"/>
-              </w:rPr>
-              <w:t>±3%</w:t>
-            </w:r>
-          </w:p>
-        </w:tc>
-        <w:tc>
-          <w:tcPr>
-            <w:tcW w:type="dxa" w:w="3513"/>
-            <w:tcBorders>
-              <w:top w:val="single" w:sz="4" w:space="0" w:color="000000"/>
-              <w:left w:val="single" w:sz="4" w:space="0" w:color="000000"/>
-              <w:bottom w:val="single" w:sz="4" w:space="0" w:color="000000"/>
-              <w:right w:val="single" w:sz="4" w:space="0" w:color="000000"/>
-              <w:insideH w:val="single" w:sz="4" w:space="0" w:color="000000"/>
-              <w:insideV w:val="single" w:sz="4" w:space="0" w:color="000000"/>
-            </w:tcBorders>
-            <w:vAlign w:val="center"/>
-          </w:tcPr>
-          <w:p>
-            <w:pPr>
-              <w:spacing w:before="20" w:after="20" w:lineRule="auto" w:line="276"/>
-              <w:jc w:val="left"/>
-            </w:pPr>
-            <w:r/>
-            <w:r>
-              <w:rPr>
-                <w:rFonts w:ascii="Calibri" w:hAnsi="Calibri"/>
-                <w:b w:val="0"/>
-                <w:sz w:val="18"/>
-              </w:rPr>
-              <w:t>Dependiente de temperatura</w:t>
-            </w:r>
-          </w:p>
-        </w:tc>
-      </w:tr>
-      <w:tr>
-        <w:tc>
-          <w:tcPr>
-            <w:tcW w:type="dxa" w:w="3513"/>
-            <w:shd w:val="clear" w:color="auto" w:fill="F2F8FF"/>
-            <w:tcBorders>
-              <w:top w:val="single" w:sz="4" w:space="0" w:color="000000"/>
-              <w:left w:val="single" w:sz="4" w:space="0" w:color="000000"/>
-              <w:bottom w:val="single" w:sz="4" w:space="0" w:color="000000"/>
-              <w:right w:val="single" w:sz="4" w:space="0" w:color="000000"/>
-              <w:insideH w:val="single" w:sz="4" w:space="0" w:color="000000"/>
-              <w:insideV w:val="single" w:sz="4" w:space="0" w:color="000000"/>
-            </w:tcBorders>
-            <w:vAlign w:val="center"/>
           </w:tcPr>
           <w:p>
             <w:pPr>
@@ -7326,7 +8150,6 @@
         <w:tc>
           <w:tcPr>
             <w:tcW w:type="dxa" w:w="3513"/>
-            <w:shd w:val="clear" w:color="auto" w:fill="F2F8FF"/>
             <w:tcBorders>
               <w:top w:val="single" w:sz="4" w:space="0" w:color="000000"/>
               <w:left w:val="single" w:sz="4" w:space="0" w:color="000000"/>
@@ -7335,7 +8158,6 @@
               <w:insideH w:val="single" w:sz="4" w:space="0" w:color="000000"/>
               <w:insideV w:val="single" w:sz="4" w:space="0" w:color="000000"/>
             </w:tcBorders>
-            <w:vAlign w:val="center"/>
           </w:tcPr>
           <w:p>
             <w:pPr>
@@ -7356,7 +8178,6 @@
         <w:tc>
           <w:tcPr>
             <w:tcW w:type="dxa" w:w="3513"/>
-            <w:shd w:val="clear" w:color="auto" w:fill="F2F8FF"/>
             <w:tcBorders>
               <w:top w:val="single" w:sz="4" w:space="0" w:color="000000"/>
               <w:left w:val="single" w:sz="4" w:space="0" w:color="000000"/>
@@ -7365,7 +8186,6 @@
               <w:insideH w:val="single" w:sz="4" w:space="0" w:color="000000"/>
               <w:insideV w:val="single" w:sz="4" w:space="0" w:color="000000"/>
             </w:tcBorders>
-            <w:vAlign w:val="center"/>
           </w:tcPr>
           <w:p>
             <w:pPr>
@@ -7388,6 +8208,7 @@
         <w:tc>
           <w:tcPr>
             <w:tcW w:type="dxa" w:w="3513"/>
+            <w:shd w:val="clear" w:color="auto" w:fill="F2F8FF"/>
             <w:tcBorders>
               <w:top w:val="single" w:sz="4" w:space="0" w:color="000000"/>
               <w:left w:val="single" w:sz="4" w:space="0" w:color="000000"/>
@@ -7396,7 +8217,6 @@
               <w:insideH w:val="single" w:sz="4" w:space="0" w:color="000000"/>
               <w:insideV w:val="single" w:sz="4" w:space="0" w:color="000000"/>
             </w:tcBorders>
-            <w:vAlign w:val="center"/>
           </w:tcPr>
           <w:p>
             <w:pPr>
@@ -7417,6 +8237,7 @@
         <w:tc>
           <w:tcPr>
             <w:tcW w:type="dxa" w:w="3513"/>
+            <w:shd w:val="clear" w:color="auto" w:fill="F2F8FF"/>
             <w:tcBorders>
               <w:top w:val="single" w:sz="4" w:space="0" w:color="000000"/>
               <w:left w:val="single" w:sz="4" w:space="0" w:color="000000"/>
@@ -7425,7 +8246,6 @@
               <w:insideH w:val="single" w:sz="4" w:space="0" w:color="000000"/>
               <w:insideV w:val="single" w:sz="4" w:space="0" w:color="000000"/>
             </w:tcBorders>
-            <w:vAlign w:val="center"/>
           </w:tcPr>
           <w:p>
             <w:pPr>
@@ -7446,6 +8266,7 @@
         <w:tc>
           <w:tcPr>
             <w:tcW w:type="dxa" w:w="3513"/>
+            <w:shd w:val="clear" w:color="auto" w:fill="F2F8FF"/>
             <w:tcBorders>
               <w:top w:val="single" w:sz="4" w:space="0" w:color="000000"/>
               <w:left w:val="single" w:sz="4" w:space="0" w:color="000000"/>
@@ -7454,7 +8275,6 @@
               <w:insideH w:val="single" w:sz="4" w:space="0" w:color="000000"/>
               <w:insideV w:val="single" w:sz="4" w:space="0" w:color="000000"/>
             </w:tcBorders>
-            <w:vAlign w:val="center"/>
           </w:tcPr>
           <w:p>
             <w:pPr>
@@ -7486,7 +8306,7 @@
           <w:color w:val="00467F"/>
           <w:sz w:val="22"/>
         </w:rPr>
-        <w:t>7.2 Caso de Uso: Monitoreo de Actividades Diarias</w:t>
+        <w:t>7.2 Funcionalidades Implementadas</w:t>
       </w:r>
     </w:p>
     <w:p>
@@ -7501,7 +8321,120 @@
           <w:i w:val="0"/>
           <w:sz w:val="22"/>
         </w:rPr>
-        <w:t>Durante las pruebas de validación, un sujeto de prueba portó el nodo de movimiento (esp32_2) fijado al antebrazo derecho mediante una pulsera de velcro, mientras el nodo maestro permanecía en una bolsa de cintura. Se realizaron 5 repeticiones de cada actividad, registrándose un total de 1 800 muestras por actividad en 30 minutos.</w:t>
+        <w:t>Las siguientes funcionalidades han sido verificadas en el prototipo actual:</w:t>
+      </w:r>
+    </w:p>
+    <w:p>
+      <w:pPr>
+        <w:pStyle w:val="ListBullet"/>
+        <w:spacing w:before="0" w:after="40" w:lineRule="auto" w:line="312"/>
+        <w:jc w:val="both"/>
+      </w:pPr>
+      <w:r>
+        <w:rPr>
+          <w:rFonts w:ascii="Calibri" w:hAnsi="Calibri"/>
+          <w:sz w:val="20"/>
+        </w:rPr>
+        <w:t>Comunicación inalámbrica ESP-NOW entre los tres nodos esclavos y el nodo maestro.</w:t>
+      </w:r>
+    </w:p>
+    <w:p>
+      <w:pPr>
+        <w:pStyle w:val="ListBullet"/>
+        <w:spacing w:before="0" w:after="40" w:lineRule="auto" w:line="312"/>
+        <w:jc w:val="both"/>
+      </w:pPr>
+      <w:r>
+        <w:rPr>
+          <w:rFonts w:ascii="Calibri" w:hAnsi="Calibri"/>
+          <w:sz w:val="20"/>
+        </w:rPr>
+        <w:t>Lectura y transmisión de datos IMU (roll, pitch, aceleración triaxial) desde el nodo de movimiento.</w:t>
+      </w:r>
+    </w:p>
+    <w:p>
+      <w:pPr>
+        <w:pStyle w:val="ListBullet"/>
+        <w:spacing w:before="0" w:after="40" w:lineRule="auto" w:line="312"/>
+        <w:jc w:val="both"/>
+      </w:pPr>
+      <w:r>
+        <w:rPr>
+          <w:rFonts w:ascii="Calibri" w:hAnsi="Calibri"/>
+          <w:sz w:val="20"/>
+        </w:rPr>
+        <w:t>Almacenamiento de registros con marcas de tiempo en tarjeta microSD.</w:t>
+      </w:r>
+    </w:p>
+    <w:p>
+      <w:pPr>
+        <w:pStyle w:val="ListBullet"/>
+        <w:spacing w:before="0" w:after="40" w:lineRule="auto" w:line="312"/>
+        <w:jc w:val="both"/>
+      </w:pPr>
+      <w:r>
+        <w:rPr>
+          <w:rFonts w:ascii="Calibri" w:hAnsi="Calibri"/>
+          <w:sz w:val="20"/>
+        </w:rPr>
+        <w:t>Adquisición de señal analógica de ritmo cardíaco mediante ADC.</w:t>
+      </w:r>
+    </w:p>
+    <w:p>
+      <w:pPr>
+        <w:pStyle w:val="ListBullet"/>
+        <w:spacing w:before="0" w:after="40" w:lineRule="auto" w:line="312"/>
+        <w:jc w:val="both"/>
+      </w:pPr>
+      <w:r>
+        <w:rPr>
+          <w:rFonts w:ascii="Calibri" w:hAnsi="Calibri"/>
+          <w:sz w:val="20"/>
+        </w:rPr>
+        <w:t>Herramienta de diagnóstico WHO_AM_I para verificación de autenticidad del sensor MPU6050.</w:t>
+      </w:r>
+    </w:p>
+    <w:p>
+      <w:pPr>
+        <w:pStyle w:val="ListBullet"/>
+        <w:spacing w:before="0" w:after="40" w:lineRule="auto" w:line="312"/>
+        <w:jc w:val="both"/>
+      </w:pPr>
+      <w:r>
+        <w:rPr>
+          <w:rFonts w:ascii="Calibri" w:hAnsi="Calibri"/>
+          <w:sz w:val="20"/>
+        </w:rPr>
+        <w:t>Interfaz de usuario local en el nodo táctil-visual ESP32-S3.</w:t>
+      </w:r>
+    </w:p>
+    <w:p>
+      <w:pPr>
+        <w:pStyle w:val="ListBullet"/>
+        <w:spacing w:before="0" w:after="40" w:lineRule="auto" w:line="312"/>
+        <w:jc w:val="both"/>
+      </w:pPr>
+      <w:r>
+        <w:rPr>
+          <w:rFonts w:ascii="Calibri" w:hAnsi="Calibri"/>
+          <w:sz w:val="20"/>
+        </w:rPr>
+        <w:t>Operación autónoma e inalámbrica mediante fuentes de alimentación independientes en cada nodo.</w:t>
+      </w:r>
+    </w:p>
+    <w:p>
+      <w:pPr>
+        <w:spacing w:before="120" w:after="60" w:lineRule="auto" w:line="276"/>
+        <w:jc w:val="left"/>
+      </w:pPr>
+      <w:r>
+        <w:rPr>
+          <w:rFonts w:ascii="Calibri" w:hAnsi="Calibri"/>
+          <w:b/>
+          <w:color w:val="00467F"/>
+          <w:sz w:val="22"/>
+        </w:rPr>
+        <w:t>7.3 Limitaciones Actuales y Trabajo Futuro</w:t>
       </w:r>
     </w:p>
     <w:p>
@@ -7516,37 +8449,7 @@
           <w:i w:val="0"/>
           <w:sz w:val="22"/>
         </w:rPr>
-        <w:t>Los resultados obtenidos durante la validación demuestran que el sistema logra discriminar correctamente entre actividades de reposo (roll ≈ 0°, pitch ≈ 0°, accZ ≈ 1g), caminata (variación rítmica de roll ±15° a 2 Hz) y eventos de subida de escaleras (pitch ≈ 25–35°). El ritmo cardíaco en reposo se registró en el rango de 65–75 BPM, con un incremento a 95–110 BPM durante la actividad de caminata moderada.</w:t>
-      </w:r>
-    </w:p>
-    <w:p>
-      <w:pPr>
-        <w:spacing w:before="120" w:after="60" w:lineRule="auto" w:line="276"/>
-        <w:jc w:val="left"/>
-      </w:pPr>
-      <w:r>
-        <w:rPr>
-          <w:rFonts w:ascii="Calibri" w:hAnsi="Calibri"/>
-          <w:b/>
-          <w:color w:val="00467F"/>
-          <w:sz w:val="22"/>
-        </w:rPr>
-        <w:t>7.3 Capacidades y Limitaciones</w:t>
-      </w:r>
-    </w:p>
-    <w:p>
-      <w:pPr>
-        <w:spacing w:before="0" w:after="80" w:lineRule="auto" w:line="360"/>
-        <w:jc w:val="both"/>
-      </w:pPr>
-      <w:r>
-        <w:rPr>
-          <w:rFonts w:ascii="Calibri" w:hAnsi="Calibri"/>
-          <w:b w:val="0"/>
-          <w:i w:val="0"/>
-          <w:sz w:val="22"/>
-        </w:rPr>
-        <w:t>Las principales capacidades del sistema son:</w:t>
+        <w:t>Las limitaciones identificadas en la versión actual del prototipo son:</w:t>
       </w:r>
     </w:p>
     <w:p>
@@ -7560,7 +8463,7 @@
           <w:rFonts w:ascii="Calibri" w:hAnsi="Calibri"/>
           <w:sz w:val="20"/>
         </w:rPr>
-        <w:t>Monitoreo en tiempo real de orientación (roll/pitch), aceleración triaxial y ritmo cardíaco.</w:t>
+        <w:t>No se ha realizado validación clínica formal ni pruebas de precisión comparativas con equipos de referencia.</w:t>
       </w:r>
     </w:p>
     <w:p>
@@ -7574,7 +8477,7 @@
           <w:rFonts w:ascii="Calibri" w:hAnsi="Calibri"/>
           <w:sz w:val="20"/>
         </w:rPr>
-        <w:t>Registro persistente en tarjeta SD con marcas de tiempo precisas (RTC DS3231).</w:t>
+        <w:t>Cifrado ESP-NOW desactivado: los datos se transmiten sin cifrado, lo que limita el uso en aplicaciones clínicas con requisitos de privacidad.</w:t>
       </w:r>
     </w:p>
     <w:p>
@@ -7588,7 +8491,7 @@
           <w:rFonts w:ascii="Calibri" w:hAnsi="Calibri"/>
           <w:sz w:val="20"/>
         </w:rPr>
-        <w:t>Arquitectura modular y escalable: se pueden agregar nodos adicionales sin modificar el firmware del maestro.</w:t>
+        <w:t>Frecuencia de muestreo de 10 Hz: adecuada para AVD de baja frecuencia, insuficiente para movimientos de alta dinámica (se requeriría ≥50 Hz).</w:t>
       </w:r>
     </w:p>
     <w:p>
@@ -7602,7 +8505,7 @@
           <w:rFonts w:ascii="Calibri" w:hAnsi="Calibri"/>
           <w:sz w:val="20"/>
         </w:rPr>
-        <w:t>Comunicación inalámbrica de baja latencia sin dependencia de infraestructura WiFi.</w:t>
+        <w:t>El sensor analógico de ritmo cardíaco es susceptible a artefactos por movimiento; se recomienda el módulo MAX30102 para mayor precisión.</w:t>
       </w:r>
     </w:p>
     <w:p>
@@ -7616,78 +8519,7 @@
           <w:rFonts w:ascii="Calibri" w:hAnsi="Calibri"/>
           <w:sz w:val="20"/>
         </w:rPr>
-        <w:t>Firmware de código abierto (MIT) con documentación Doxygen y herramientas de diagnóstico incluidas.</w:t>
-      </w:r>
-    </w:p>
-    <w:p>
-      <w:pPr>
-        <w:spacing w:before="0" w:after="80" w:lineRule="auto" w:line="360"/>
-        <w:jc w:val="both"/>
-      </w:pPr>
-      <w:r>
-        <w:rPr>
-          <w:rFonts w:ascii="Calibri" w:hAnsi="Calibri"/>
-          <w:b w:val="0"/>
-          <w:i w:val="0"/>
-          <w:sz w:val="22"/>
-        </w:rPr>
-        <w:t>Las limitaciones identificadas en la versión actual son:</w:t>
-      </w:r>
-    </w:p>
-    <w:p>
-      <w:pPr>
-        <w:pStyle w:val="ListBullet"/>
-        <w:spacing w:before="0" w:after="40" w:lineRule="auto" w:line="312"/>
-        <w:jc w:val="both"/>
-      </w:pPr>
-      <w:r>
-        <w:rPr>
-          <w:rFonts w:ascii="Calibri" w:hAnsi="Calibri"/>
-          <w:sz w:val="20"/>
-        </w:rPr>
-        <w:t>Autonomía de batería no caracterizada: el sistema no incluye gestión de energía ni batería integrada en esta versión; requiere alimentación externa mediante cable USB (5V).</w:t>
-      </w:r>
-    </w:p>
-    <w:p>
-      <w:pPr>
-        <w:pStyle w:val="ListBullet"/>
-        <w:spacing w:before="0" w:after="40" w:lineRule="auto" w:line="312"/>
-        <w:jc w:val="both"/>
-      </w:pPr>
-      <w:r>
-        <w:rPr>
-          <w:rFonts w:ascii="Calibri" w:hAnsi="Calibri"/>
-          <w:sz w:val="20"/>
-        </w:rPr>
-        <w:t>Cifrado ESP-NOW desactivado: los datos se transmiten sin cifrado, lo cual limita el uso en aplicaciones clínicas donde la privacidad de los datos es crítica.</w:t>
-      </w:r>
-    </w:p>
-    <w:p>
-      <w:pPr>
-        <w:pStyle w:val="ListBullet"/>
-        <w:spacing w:before="0" w:after="40" w:lineRule="auto" w:line="312"/>
-        <w:jc w:val="both"/>
-      </w:pPr>
-      <w:r>
-        <w:rPr>
-          <w:rFonts w:ascii="Calibri" w:hAnsi="Calibri"/>
-          <w:sz w:val="20"/>
-        </w:rPr>
-        <w:t>Frecuencia de muestreo IMU: la cadencia de 10 Hz es adecuada para AVD de baja frecuencia, pero insuficiente para capturar movimientos rápidos en deportes de alto impacto (se requeriría ≥50 Hz).</w:t>
-      </w:r>
-    </w:p>
-    <w:p>
-      <w:pPr>
-        <w:pStyle w:val="ListBullet"/>
-        <w:spacing w:before="0" w:after="40" w:lineRule="auto" w:line="312"/>
-        <w:jc w:val="both"/>
-      </w:pPr>
-      <w:r>
-        <w:rPr>
-          <w:rFonts w:ascii="Calibri" w:hAnsi="Calibri"/>
-          <w:sz w:val="20"/>
-        </w:rPr>
-        <w:t>Derivación del sensor HR: el sensor analógico simple para ritmo cardíaco es susceptible a artefactos por movimiento; se recomienda reemplazarlo por un módulo MAX30102 para mayor precisión clínica.</w:t>
+        <w:t>La autonomía de la batería de litio del nodo de movimiento (2–4 h) es limitada para sesiones prolongadas; se proyecta incrementar la capacidad.</w:t>
       </w:r>
     </w:p>
     <w:p>
@@ -7752,7 +8584,7 @@
           <w:i w:val="0"/>
           <w:sz w:val="22"/>
         </w:rPr>
-        <w:t>Sincere thanks to the open-source community for providing freely available tools, drivers, and documentation that made this project possible without significant economic barriers.</w:t>
+        <w:t>Sincere thanks to the open-source community for providing freely available tools, drivers, and documentation that made this prototype possible without significant economic barriers.</w:t>
       </w:r>
     </w:p>
     <w:p>

</xml_diff>

<commit_message>
Update articulo HardwareX: remove schematic, COP prices, fix 3 nodes, clarify WHO_AM_I as software
Agent-Logs-Url: https://github.com/Cdcuellar/Sistemas-embebidos---Actividades-de-la-vida-diaria/sessions/9869bd4c-6d17-46be-b7c7-fa106ccb5758

Co-authored-by: Cdcuellar <153051653+Cdcuellar@users.noreply.github.com>
</commit_message>
<xml_diff>
--- a/articulo_sistema_monitoreo_vestible_HardwareX.docx
+++ b/articulo_sistema_monitoreo_vestible_HardwareX.docx
@@ -686,14 +686,15 @@
               <w:spacing w:before="20" w:after="20" w:lineRule="auto" w:line="276"/>
               <w:jc w:val="left"/>
             </w:pPr>
-            <w:r/>
+            <w:r>
+              <w:t>$311,000 COP (aprox.)</w:t>
+            </w:r>
             <w:r>
               <w:rPr>
                 <w:rFonts w:ascii="Calibri" w:hAnsi="Calibri"/>
                 <w:b w:val="0"/>
                 <w:sz w:val="20"/>
               </w:rPr>
-              <w:t>USD 60.40 (~COP 240.000 / ~MXN 1.200 / ~EUR 56 / ~ARS 60.000)</w:t>
             </w:r>
           </w:p>
         </w:tc>
@@ -727,7 +728,7 @@
           <w:i w:val="0"/>
           <w:sz w:val="22"/>
         </w:rPr>
-        <w:t>Este artículo documenta el diseño e implementación de un prototipo de sistema de monitoreo vestible para actividades de la vida diaria (AVD) basado en una arquitectura de sensores inerciales distribuidos sobre microcontroladores ESP32. El sistema comprende cuatro nodos: un nodo maestro (ESP32 DevKit V1) alimentado por un portapilas de 4 pilas AA, encargado de la coordinación central, la adquisición del ritmo cardíaco, el registro de marcas de tiempo mediante un módulo RTC DS3231 y el almacenamiento en tarjeta microSD; un nodo de movimiento (ESP32 DevKit V1) alimentado por una batería de litio de 3.7 V / 600 mAh, que captura datos de orientación e inercia con el sensor MPU6050; un nodo táctil-visual (ESP32-S3 Touch 1.28") alimentado por una powerbank de 20.000 mAh con pantalla táctil e interfaz local; y una herramienta de diagnóstico para la identificación del registro WHO_AM_I del MPU6050. La comunicación entre nodos se realiza mediante ESP-NOW. El costo total del prototipo es de aproximadamente USD 60.40, con firmware completo y documentación bajo licencia MIT, favoreciendo la reproducibilidad académica.</w:t>
+        <w:t>Este artículo documenta el diseño e implementación de un prototipo de sistema de monitoreo vestible para actividades de la vida diaria (AVD) basado en una arquitectura de sensores inerciales distribuidos sobre microcontroladores ESP32. El sistema comprende tres nodos: un nodo maestro (ESP32 DevKit V1) alimentado por un portapilas de 4 pilas AA, encargado de la coordinación central, la adquisición del ritmo cardíaco, el registro de marcas de tiempo mediante un módulo RTC DS3231 y el almacenamiento en tarjeta microSD; un nodo de movimiento (ESP32 DevKit V1) alimentado por una batería de litio de 3.7 V / 600 mAh, que captura datos de orientación e inercia con el sensor MPU6050; un nodo táctil-visual (ESP32-S3 Touch 1.28") alimentado por una powerbank de 20.000 mAh con pantalla táctil e interfaz local. La comunicación entre nodos se realiza mediante el protocolo ESP-NOW en topología en estrella. Adicionalmente, el repositorio incluye WHO_AM_I, una herramienta puramente software para verificar la autenticidad del sensor MPU6050 mediante la lectura del registro interno 0x75. El costo total del prototipo es de aproximadamente $311,000 COP, con firmware completo y documentación bajo licencia MIT, favoreciendo la reproducibilidad académica.</w:t>
       </w:r>
     </w:p>
     <w:p>
@@ -757,7 +758,7 @@
           <w:i w:val="0"/>
           <w:sz w:val="22"/>
         </w:rPr>
-        <w:t>This article documents the design and implementation of a wearable monitoring prototype for activities of daily living (ADL) based on a distributed inertial sensor architecture built on ESP32 microcontrollers. The system comprises four nodes: a master node (ESP32 DevKit V1) powered by a 4×AA battery holder, responsible for central coordination, heart rate acquisition, real-time timestamping via DS3231 RTC, and microSD data logging; a motion node (ESP32 DevKit V1) powered by a 3.7 V / 600 mAh lithium battery, capturing orientation and inertial data from an MPU6050 sensor; a touch-display node (ESP32-S3 Touch 1.28") powered by a 20,000 mAh powerbank with graphical interface; and a WHO_AM_I diagnostic tool. Inter-node communication uses the ESP-NOW protocol. The total prototype cost is approximately USD 60.40. Complete firmware and documentation are available under the MIT license.</w:t>
+        <w:t>This article documents the design and implementation of a wearable monitoring prototype for activities of daily living (ADL) based on a distributed inertial sensor architecture built on ESP32 microcontrollers. The system comprises three nodes: a master node (ESP32 DevKit V1) powered by a 4×AA battery holder, responsible for central coordination, heart rate acquisition, real-time timestamping via DS3231 RTC, and microSD data logging; a motion node (ESP32 DevKit V1) powered by a 3.7 V / 600 mAh lithium battery, capturing orientation and inertial data from an MPU6050 sensor; a touch-display node (ESP32-S3 Touch 1.28") powered by a 20,000 mAh powerbank with graphical interface. Inter-node communication uses the ESP-NOW star-topology protocol. Additionally, the repository includes WHO_AM_I, a purely software tool for verifying MPU6050 sensor authenticity by reading internal register 0x75. The total prototype cost is approximately $311,000 COP. Complete firmware and documentation are available under the MIT license.</w:t>
       </w:r>
     </w:p>
     <w:p>
@@ -828,7 +829,7 @@
           <w:i w:val="0"/>
           <w:sz w:val="22"/>
         </w:rPr>
-        <w:t>Los dispositivos comerciales actuales —Fitbit Charge 6, Apple Watch Series 9, Garmin Vivosmart 5— ofrecen capacidades de monitoreo avanzadas, pero presentan limitaciones en entornos académicos: acceso restringido a datos en crudo, imposibilidad de modificar el firmware, costos elevados (USD 150–500) y ausencia de modularidad. El prototipo presentado propone una arquitectura abierta, de bajo costo (~USD 60.40) y completamente modificable, basada en microcontroladores ESP32 de amplia disponibilidad en el mercado latinoamericano.</w:t>
+        <w:t>Los dispositivos comerciales actuales —Fitbit Charge 6, Apple Watch Series 9, Garmin Vivosmart 5— ofrecen capacidades de monitoreo avanzadas, pero presentan limitaciones en entornos académicos: acceso restringido a datos en crudo, imposibilidad de modificar el firmware, costos elevados ($600,000–$2,000,000 COP) y ausencia de modularidad. El prototipo presentado propone una arquitectura abierta, de bajo costo (~$311,000 COP) y completamente modificable, basada en microcontroladores ESP32 de amplia disponibilidad en el mercado latinoamericano.</w:t>
       </w:r>
     </w:p>
     <w:p>
@@ -888,7 +889,7 @@
           <w:i w:val="0"/>
           <w:sz w:val="22"/>
         </w:rPr>
-        <w:t>El prototipo está conformado por cuatro nodos ESP32 que operan de manera coordinada mediante el protocolo ESP-NOW en una topología en estrella. Cada nodo cuenta con su propia fuente de alimentación independiente, lo que permite su operación de forma inalámbrica y portable.</w:t>
+        <w:t>El prototipo está conformado por tres nodos ESP32 que operan de manera coordinada mediante el protocolo ESP-NOW en una topología en estrella. Cada nodo cuenta con su propia fuente de alimentación independiente, lo que permite su operación de forma inalámbrica y portable.</w:t>
       </w:r>
     </w:p>
     <w:p>
@@ -918,7 +919,7 @@
           <w:i w:val="0"/>
           <w:sz w:val="22"/>
         </w:rPr>
-        <w:t>Directorio: esp32_1_hr_rstc_sd_master. Constituye el núcleo central del sistema. Fuente de alimentación: portapilas de 4 pilas AA (6 V nominal → regulado a 3.3 V por el regulador integrado del DevKit) con capacidad aproximada de 2.400–3.000 mAh en configuración alcalina. Recibe paquetes de datos IMU (32 bytes) desde los nodos esclavos mediante ESP-NOW en el canal 1. Adquiere la señal de ritmo cardíaco a través del ADC en GPIO 34 (12 bits). Se comunica con el módulo RTC DS3231 por I2C (SDA: GPIO 21, SCL: GPIO 22) para marcas de tiempo con precisión ±2 ppm. Almacena los registros en tarjeta microSD mediante SPI (MOSI: GPIO 23, MISO: GPIO 19, SCK: GPIO 18, CS: GPIO 5).</w:t>
+        <w:t>Directorio: esp32_1_hr_rstc_sd_master. Constituye el núcleo central del sistema. Al encenderse, inicializa el módulo RTC DS3231 por I2C (GPIO 21/22) para obtener marcas de tiempo precisas, monta el sistema de archivos de la tarjeta microSD por SPI (CS: GPIO 5, CLK: GPIO 18, MISO: GPIO 19, MOSI: GPIO 23) y crea o abre el archivo CSV diario con el formato "datos_YYYY-MM-DD.csv". A continuación, registra su propia dirección MAC y configura el stack ESP-NOW como receptor, habilitando el callback de recepción de paquetes. Cada vez que recibe un paquete ESP-NOW de un nodo esclavo (estructura datos_imu_t de 32 bytes), el maestro extrae los campos roll, pitch, accX, accY, accZ, y los combina con la lectura ADC del sensor de ritmo cardíaco (GPIO 34, 12 bits) y la marca de tiempo actual del RTC, escribiendo una línea CSV en la SD. Este flujo garantiza la sincronización temporal centralizada y la persistencia de datos sin necesidad de infraestructura WiFi externa. Fuente de alimentación: portapilas de 4 pilas AA (6 V nominal → regulado a 3.3 V por el regulador integrado del DevKit). Autonomía estimada: 8–15 horas con pilas alcalinas.</w:t>
       </w:r>
     </w:p>
     <w:p>
@@ -948,7 +949,7 @@
           <w:i w:val="0"/>
           <w:sz w:val="22"/>
         </w:rPr>
-        <w:t>Directorio: esp32_2. Fuente de alimentación: batería de litio recargable de 3.7 V / 600 mAh, conectada directamente al pin VIN del DevKit a través de un módulo de carga TP4056. Esta configuración permite una autonomía estimada de 2–4 horas en operación continua. Integra el sensor MPU6050 mediante I2C (SDA: GPIO 21, SCL: GPIO 22). El driver propio (mpu6050.c / mpu6050.h) realiza calibración automática, calcula roll y pitch, y encapsula los datos en una estructura de 32 bytes que se transmite al nodo maestro por ESP-NOW cada 500 ms. El acelerómetro opera en ±2g (16 384 LSB/g) y el giroscopio en ±250°/s (131 LSB/°/s).</w:t>
+        <w:t>Directorio: esp32_2. Al iniciar, el firmware configura el bus I2C (GPIO 21/22) y realiza la inicialización del sensor MPU6050: escribe la configuración de rango (±2g / ±250°/s), establece el divisor de frecuencia de muestreo a 100 Hz interno y ejecuta una rutina de calibración de 2 segundos (promedia 200 lecturas para determinar los offsets de acelerómetro y giroscopio). Una vez calibrado, el nodo entra en el bucle principal: cada 100 ms lee los registros raw del MPU6050 (aceleración triaxial y velocidad angular), calcula los ángulos de roll y pitch mediante integración complementaria (α = 0.98), empaqueta los 6 valores en la estructura datos_imu_t y los transmite al nodo maestro vía ESP-NOW usando la dirección MAC configurada en MASTER_MAC_ADDR. La transmisión ESP-NOW opera sobre la capa MAC 802.11 sin requerir conexión a punto de acceso, con latencia &lt; 10 ms. Fuente de alimentación: batería de litio recargable de 3.7 V / 600 mAh, conectada directamente al pin VIN del DevKit a través de un módulo de carga TP4056. Autonomía estimada: 2–4 horas de operación continua.</w:t>
       </w:r>
     </w:p>
     <w:p>
@@ -978,7 +979,7 @@
           <w:i w:val="0"/>
           <w:sz w:val="22"/>
         </w:rPr>
-        <w:t>Directorio: esp_32_s3_touch_1.28. Fuente de alimentación: powerbank de 20.000 mAh conectada por USB-C, lo que proporciona una autonomía muy extensa (estimada en 40–60 horas de operación continua), adecuada para uso prolongado durante el día. Utiliza el sensor inercial QMI8658 como dispositivo primario, con compatibilidad hacia el MPU6050. Dispone de pantalla táctil circular de 1.28 pulgadas que permite la interacción local del usuario. Los datos IMU se transmiten al nodo maestro mediante ESP-NOW siguiendo el mismo esquema de empaquetado del nodo de movimiento.</w:t>
+        <w:t>Directorio: esp_32_s3_touch_1.28. Este nodo cumple una doble función: actúa como esclavo ESP-NOW enviando datos de movimiento al maestro, y simultáneamente presenta una interfaz gráfica local en su pantalla táctil circular de 1.28". Al arrancar, configura el sensor QMI8658 (IMU de 6 ejes integrado en la placa) por SPI, inicializa el controlador de pantalla GC9A01 y registra el nodo en la red ESP-NOW con la dirección MAC del maestro. En cada ciclo (cada 500 ms), lee los datos del QMI8658, actualiza los valores numéricos en la pantalla (roll, pitch, aceleración) y envía el paquete datos_imu_t al nodo maestro. La pantalla táctil permite al usuario visualizar los datos en tiempo real sin necesidad de un monitor externo, facilitando el despliegue en campo. Fuente de alimentación: powerbank de 20.000 mAh conectada por USB-C, lo que proporciona una autonomía estimada de 40–60 horas de operación continua.</w:t>
       </w:r>
     </w:p>
     <w:p>
@@ -993,7 +994,7 @@
           <w:color w:val="00467F"/>
           <w:sz w:val="22"/>
         </w:rPr>
-        <w:t>2.4 Herramienta de Diagnóstico – WHO_AM_I</w:t>
+        <w:t>2.4 Herramienta de Diagnóstico por Software – WHO_AM_I</w:t>
       </w:r>
     </w:p>
     <w:p>
@@ -1008,7 +1009,7 @@
           <w:i w:val="0"/>
           <w:sz w:val="22"/>
         </w:rPr>
-        <w:t>Directorio: herramienta_who_i_am_id_interno_arduino_ide. Desarrollada en Arduino IDE para ESP32 DevKit V1. Lee el registro 0x75 (WHO_AM_I) del MPU6050 mediante I2C a 100 kHz (GPIO 21/22). El valor esperado es 0x72 (variante MPU6050C). Permite detectar sensores falsificados o revisiones de hardware diferentes antes de su integración en el sistema.</w:t>
+        <w:t>Herramienta puramente software (no constituye un nodo hardware). Directorio: herramienta_who_i_am_id_interno_arduino_ide. Desarrollada en Arduino IDE para ESP32 DevKit V1. Lee el registro 0x75 (WHO_AM_I) del MPU6050 mediante I2C a 100 kHz (GPIO 21/22). El valor esperado es 0x72 (MPU6050C); cualquier otro valor indica sensor falsificado o revisión diferente. Esta herramienta se ejecuta exclusivamente en la computadora del desarrollador a través del monitor serial y no forma parte de la arquitectura distribuida del sistema en tiempo de ejecución.</w:t>
       </w:r>
     </w:p>
     <w:p>
@@ -2121,58 +2122,6 @@
         </w:tc>
       </w:tr>
     </w:tbl>
-    <w:p>
-      <w:pPr>
-        <w:spacing w:before="120" w:after="60" w:lineRule="auto" w:line="276"/>
-        <w:jc w:val="left"/>
-      </w:pPr>
-      <w:r>
-        <w:rPr>
-          <w:rFonts w:ascii="Calibri" w:hAnsi="Calibri"/>
-          <w:b/>
-          <w:color w:val="00467F"/>
-          <w:sz w:val="22"/>
-        </w:rPr>
-        <w:t>Esquema de Conexiones del Sistema</w:t>
-      </w:r>
-    </w:p>
-    <w:p>
-      <w:pPr>
-        <w:spacing w:before="40" w:after="40" w:lineRule="auto" w:line="276"/>
-        <w:jc w:val="left"/>
-      </w:pPr>
-      <w:r>
-        <w:rPr>
-          <w:rFonts w:ascii="Courier New" w:hAnsi="Courier New"/>
-          <w:sz w:val="16"/>
-        </w:rPr>
-        <w:t xml:space="preserve">  [Nodo Movimiento]          [Nodo Táctil S3]         [Diagnóstico]</w:t>
-        <w:br/>
-        <w:t xml:space="preserve">  MPU6050 (I2C)              QMI8658 / MPU6050        WHO_AM_I Tool</w:t>
-        <w:br/>
-        <w:t xml:space="preserve">  Bat. Litio 3.7V/600mAh     Powerbank 20.000 mAh     USB/Serial</w:t>
-        <w:br/>
-        <w:t xml:space="preserve">        |     ESP-NOW              |     ESP-NOW</w:t>
-        <w:br/>
-        <w:t xml:space="preserve">        +-----------+--------------+</w:t>
-        <w:br/>
-        <w:t xml:space="preserve">                    |</w:t>
-        <w:br/>
-        <w:t xml:space="preserve">           [NODO MAESTRO – ESP32 DevKit V1]</w:t>
-        <w:br/>
-        <w:t xml:space="preserve">           ┌──────────────────────────────┐</w:t>
-        <w:br/>
-        <w:t xml:space="preserve">           │ Portapilas 4×AA (6V)          │</w:t>
-        <w:br/>
-        <w:t xml:space="preserve">           │ ADC HR      GPIO 34           │</w:t>
-        <w:br/>
-        <w:t xml:space="preserve">           │ RTC DS3231  I2C GPIO 21/22    │</w:t>
-        <w:br/>
-        <w:t xml:space="preserve">           │ MicroSD     SPI GPIO 5/18/19/23│</w:t>
-        <w:br/>
-        <w:t xml:space="preserve">           └──────────────────────────────┘</w:t>
-      </w:r>
-    </w:p>
     <w:p/>
     <w:p>
       <w:pPr>
@@ -2335,7 +2284,7 @@
               </w:rPr>
               <w:t>Costo Unit.</w:t>
               <w:br/>
-              <w:t>(USD)</w:t>
+              <w:t>(COP)</w:t>
             </w:r>
           </w:p>
         </w:tc>
@@ -2366,7 +2315,7 @@
               </w:rPr>
               <w:t>Costo Total</w:t>
               <w:br/>
-              <w:t>(USD)</w:t>
+              <w:t>(COP)</w:t>
             </w:r>
           </w:p>
         </w:tc>
@@ -2542,7 +2491,7 @@
                 <w:b w:val="0"/>
                 <w:sz w:val="18"/>
               </w:rPr>
-              <w:t>$12.00</w:t>
+              <w:t>$48,000</w:t>
             </w:r>
           </w:p>
         </w:tc>
@@ -2571,7 +2520,7 @@
                 <w:b w:val="0"/>
                 <w:sz w:val="18"/>
               </w:rPr>
-              <w:t>$24.00</w:t>
+              <w:t>$96,000</w:t>
             </w:r>
           </w:p>
         </w:tc>
@@ -2743,7 +2692,7 @@
                 <w:b w:val="0"/>
                 <w:sz w:val="18"/>
               </w:rPr>
-              <w:t>$4.00</w:t>
+              <w:t>$16,000</w:t>
             </w:r>
           </w:p>
         </w:tc>
@@ -2771,7 +2720,7 @@
                 <w:b w:val="0"/>
                 <w:sz w:val="18"/>
               </w:rPr>
-              <w:t>$4.00</w:t>
+              <w:t>$16,000</w:t>
             </w:r>
           </w:p>
         </w:tc>
@@ -2945,7 +2894,7 @@
                 <w:b w:val="0"/>
                 <w:sz w:val="18"/>
               </w:rPr>
-              <w:t>$18.00</w:t>
+              <w:t>$72,000</w:t>
             </w:r>
           </w:p>
         </w:tc>
@@ -2974,7 +2923,7 @@
                 <w:b w:val="0"/>
                 <w:sz w:val="18"/>
               </w:rPr>
-              <w:t>$18.00</w:t>
+              <w:t>$72,000</w:t>
             </w:r>
           </w:p>
         </w:tc>
@@ -3146,7 +3095,7 @@
                 <w:b w:val="0"/>
                 <w:sz w:val="18"/>
               </w:rPr>
-              <w:t>$2.50</w:t>
+              <w:t>$10,000</w:t>
             </w:r>
           </w:p>
         </w:tc>
@@ -3174,7 +3123,7 @@
                 <w:b w:val="0"/>
                 <w:sz w:val="18"/>
               </w:rPr>
-              <w:t>$2.50</w:t>
+              <w:t>$10,000</w:t>
             </w:r>
           </w:p>
         </w:tc>
@@ -3348,7 +3297,7 @@
                 <w:b w:val="0"/>
                 <w:sz w:val="18"/>
               </w:rPr>
-              <w:t>$4.00</w:t>
+              <w:t>$16,000</w:t>
             </w:r>
           </w:p>
         </w:tc>
@@ -3377,7 +3326,7 @@
                 <w:b w:val="0"/>
                 <w:sz w:val="18"/>
               </w:rPr>
-              <w:t>$4.00</w:t>
+              <w:t>$16,000</w:t>
             </w:r>
           </w:p>
         </w:tc>
@@ -3549,7 +3498,7 @@
                 <w:b w:val="0"/>
                 <w:sz w:val="18"/>
               </w:rPr>
-              <w:t>$3.00</w:t>
+              <w:t>$12,000</w:t>
             </w:r>
           </w:p>
         </w:tc>
@@ -3577,7 +3526,7 @@
                 <w:b w:val="0"/>
                 <w:sz w:val="18"/>
               </w:rPr>
-              <w:t>$3.00</w:t>
+              <w:t>$12,000</w:t>
             </w:r>
           </w:p>
         </w:tc>
@@ -3751,7 +3700,7 @@
                 <w:b w:val="0"/>
                 <w:sz w:val="18"/>
               </w:rPr>
-              <w:t>$0.80</w:t>
+              <w:t>$3,200</w:t>
             </w:r>
           </w:p>
         </w:tc>
@@ -3780,7 +3729,7 @@
                 <w:b w:val="0"/>
                 <w:sz w:val="18"/>
               </w:rPr>
-              <w:t>$0.80</w:t>
+              <w:t>$3,200</w:t>
             </w:r>
           </w:p>
         </w:tc>
@@ -3952,7 +3901,7 @@
                 <w:b w:val="0"/>
                 <w:sz w:val="18"/>
               </w:rPr>
-              <w:t>$15.00</w:t>
+              <w:t>$60,000</w:t>
             </w:r>
           </w:p>
         </w:tc>
@@ -3980,7 +3929,7 @@
                 <w:b w:val="0"/>
                 <w:sz w:val="18"/>
               </w:rPr>
-              <w:t>$15.00</w:t>
+              <w:t>$60,000</w:t>
             </w:r>
           </w:p>
         </w:tc>
@@ -4154,7 +4103,7 @@
                 <w:b w:val="0"/>
                 <w:sz w:val="18"/>
               </w:rPr>
-              <w:t>$1.50</w:t>
+              <w:t>$6,000</w:t>
             </w:r>
           </w:p>
         </w:tc>
@@ -4183,7 +4132,7 @@
                 <w:b w:val="0"/>
                 <w:sz w:val="18"/>
               </w:rPr>
-              <w:t>$1.50</w:t>
+              <w:t>$6,000</w:t>
             </w:r>
           </w:p>
         </w:tc>
@@ -4355,7 +4304,7 @@
                 <w:b w:val="0"/>
                 <w:sz w:val="18"/>
               </w:rPr>
-              <w:t>$2.00</w:t>
+              <w:t>$8,000</w:t>
             </w:r>
           </w:p>
         </w:tc>
@@ -4383,7 +4332,7 @@
                 <w:b w:val="0"/>
                 <w:sz w:val="18"/>
               </w:rPr>
-              <w:t>$2.00</w:t>
+              <w:t>$8,000</w:t>
             </w:r>
           </w:p>
         </w:tc>
@@ -4557,7 +4506,7 @@
                 <w:b w:val="0"/>
                 <w:sz w:val="18"/>
               </w:rPr>
-              <w:t>$0.10</w:t>
+              <w:t>$400</w:t>
             </w:r>
           </w:p>
         </w:tc>
@@ -4586,7 +4535,7 @@
                 <w:b w:val="0"/>
                 <w:sz w:val="18"/>
               </w:rPr>
-              <w:t>$0.20</w:t>
+              <w:t>$800</w:t>
             </w:r>
           </w:p>
         </w:tc>
@@ -4758,7 +4707,7 @@
                 <w:b w:val="0"/>
                 <w:sz w:val="18"/>
               </w:rPr>
-              <w:t>$0.08</w:t>
+              <w:t>$320</w:t>
             </w:r>
           </w:p>
         </w:tc>
@@ -4786,7 +4735,7 @@
                 <w:b w:val="0"/>
                 <w:sz w:val="18"/>
               </w:rPr>
-              <w:t>$1.20</w:t>
+              <w:t>$4,800</w:t>
             </w:r>
           </w:p>
         </w:tc>
@@ -4960,7 +4909,7 @@
                 <w:b w:val="0"/>
                 <w:sz w:val="18"/>
               </w:rPr>
-              <w:t>$1.50</w:t>
+              <w:t>$6,000</w:t>
             </w:r>
           </w:p>
         </w:tc>
@@ -4989,7 +4938,7 @@
                 <w:b w:val="0"/>
                 <w:sz w:val="18"/>
               </w:rPr>
-              <w:t>$1.50</w:t>
+              <w:t>$6,000</w:t>
             </w:r>
           </w:p>
         </w:tc>
@@ -5191,7 +5140,7 @@
                 <w:b/>
                 <w:sz w:val="18"/>
               </w:rPr>
-              <w:t>$77.70</w:t>
+              <w:t>$311,000</w:t>
             </w:r>
           </w:p>
         </w:tc>
@@ -5220,7 +5169,6 @@
                 <w:b/>
                 <w:sz w:val="18"/>
               </w:rPr>
-              <w:t>USD / ~COP 310.000 / ~MXN 1.550 / ~EUR 72 / ~ARS 77.700</w:t>
             </w:r>
           </w:p>
         </w:tc>
@@ -7020,7 +6968,7 @@
           <w:i w:val="0"/>
           <w:sz w:val="22"/>
         </w:rPr>
-        <w:t>El sistema presentado en este artículo corresponde a un prototipo funcional en etapa de desarrollo. Los cuatro nodos han sido implementados y el firmware se ejecuta correctamente en condiciones de laboratorio, con comunicación ESP-NOW verificada entre nodos y registro de datos en tarjeta SD. En esta versión no se han realizado pruebas de validación clínica formal ni caracterización estadística exhaustiva de los sensores, por lo que los valores de referencia presentados corresponden a las especificaciones técnicas de los datasheets de los fabricantes.</w:t>
+        <w:t>El sistema presentado en este artículo corresponde a un prototipo funcional en etapa de desarrollo. Los tres nodos han sido implementados y el firmware se ejecuta correctamente en condiciones de laboratorio, con comunicación ESP-NOW verificada entre nodos y registro de datos en tarjeta SD. En esta versión no se han realizado pruebas de validación clínica formal ni caracterización estadística exhaustiva de los sensores, por lo que los valores de referencia presentados corresponden a las especificaciones técnicas de los datasheets de los fabricantes.</w:t>
       </w:r>
     </w:p>
     <w:p>

</xml_diff>

<commit_message>
BOM: precios reales Colombia (Mercado Libre), ESP32-S3 prestado por Universidad del Cauca ($0)
Agent-Logs-Url: https://github.com/Cdcuellar/Sistemas-embebidos---Actividades-de-la-vida-diaria/sessions/83b5507b-537a-4693-a15e-4b9ddc440c03

Co-authored-by: Cdcuellar <153051653+Cdcuellar@users.noreply.github.com>
</commit_message>
<xml_diff>
--- a/articulo_sistema_monitoreo_vestible_HardwareX.docx
+++ b/articulo_sistema_monitoreo_vestible_HardwareX.docx
@@ -687,7 +687,7 @@
               <w:jc w:val="left"/>
             </w:pPr>
             <w:r>
-              <w:t>$311,000 COP (aprox.)</w:t>
+              <w:t>$237,400 COP (aprox.) – excluye ESP32-S3 Touch (prestado por la Universidad del Cauca)</w:t>
             </w:r>
             <w:r>
               <w:rPr>
@@ -728,7 +728,7 @@
           <w:i w:val="0"/>
           <w:sz w:val="22"/>
         </w:rPr>
-        <w:t>Este artículo documenta el diseño e implementación de un prototipo de sistema de monitoreo vestible para actividades de la vida diaria (AVD) basado en una arquitectura de sensores inerciales distribuidos sobre microcontroladores ESP32. El sistema comprende tres nodos: un nodo maestro (ESP32 DevKit V1) alimentado por un portapilas de 4 pilas AA, encargado de la coordinación central, la adquisición del ritmo cardíaco, el registro de marcas de tiempo mediante un módulo RTC DS3231 y el almacenamiento en tarjeta microSD; un nodo de movimiento (ESP32 DevKit V1) alimentado por una batería de litio de 3.7 V / 600 mAh, que captura datos de orientación e inercia con el sensor MPU6050; un nodo táctil-visual (ESP32-S3 Touch 1.28") alimentado por una powerbank de 20.000 mAh con pantalla táctil e interfaz local. La comunicación entre nodos se realiza mediante el protocolo ESP-NOW en topología en estrella. Adicionalmente, el repositorio incluye WHO_AM_I, una herramienta puramente software para verificar la autenticidad del sensor MPU6050 mediante la lectura del registro interno 0x75. El costo total del prototipo es de aproximadamente $311,000 COP, con firmware completo y documentación bajo licencia MIT, favoreciendo la reproducibilidad académica.</w:t>
+        <w:t>Este artículo documenta el diseño e implementación de un prototipo de sistema de monitoreo vestible para actividades de la vida diaria (AVD) basado en una arquitectura de sensores inerciales distribuidos sobre microcontroladores ESP32. El sistema comprende tres nodos: un nodo maestro (ESP32 DevKit V1) alimentado por un portapilas de 4 pilas AA, encargado de la coordinación central, la adquisición del ritmo cardíaco, el registro de marcas de tiempo mediante un módulo RTC DS3231 y el almacenamiento en tarjeta microSD; un nodo de movimiento (ESP32 DevKit V1) alimentado por una batería de litio de 3.7 V / 600 mAh, que captura datos de orientación e inercia con el sensor MPU6050; un nodo táctil-visual (ESP32-S3 Touch 1.28") alimentado por una powerbank de 20.000 mAh con pantalla táctil e interfaz local. La comunicación entre nodos se realiza mediante el protocolo ESP-NOW en topología en estrella. Adicionalmente, el repositorio incluye WHO_AM_I, una herramienta puramente software para verificar la autenticidad del sensor MPU6050 mediante la lectura del registro interno 0x75. El costo total del prototipo es de aproximadamente $237,400 COP, con firmware completo y documentación bajo licencia MIT, favoreciendo la reproducibilidad académica.</w:t>
       </w:r>
     </w:p>
     <w:p>
@@ -758,7 +758,7 @@
           <w:i w:val="0"/>
           <w:sz w:val="22"/>
         </w:rPr>
-        <w:t>This article documents the design and implementation of a wearable monitoring prototype for activities of daily living (ADL) based on a distributed inertial sensor architecture built on ESP32 microcontrollers. The system comprises three nodes: a master node (ESP32 DevKit V1) powered by a 4×AA battery holder, responsible for central coordination, heart rate acquisition, real-time timestamping via DS3231 RTC, and microSD data logging; a motion node (ESP32 DevKit V1) powered by a 3.7 V / 600 mAh lithium battery, capturing orientation and inertial data from an MPU6050 sensor; a touch-display node (ESP32-S3 Touch 1.28") powered by a 20,000 mAh powerbank with graphical interface. Inter-node communication uses the ESP-NOW star-topology protocol. Additionally, the repository includes WHO_AM_I, a purely software tool for verifying MPU6050 sensor authenticity by reading internal register 0x75. The total prototype cost is approximately $311,000 COP. Complete firmware and documentation are available under the MIT license.</w:t>
+        <w:t>This article documents the design and implementation of a wearable monitoring prototype for activities of daily living (ADL) based on a distributed inertial sensor architecture built on ESP32 microcontrollers. The system comprises three nodes: a master node (ESP32 DevKit V1) powered by a 4×AA battery holder, responsible for central coordination, heart rate acquisition, real-time timestamping via DS3231 RTC, and microSD data logging; a motion node (ESP32 DevKit V1) powered by a 3.7 V / 600 mAh lithium battery, capturing orientation and inertial data from an MPU6050 sensor; a touch-display node (ESP32-S3 Touch 1.28") powered by a 20,000 mAh powerbank with graphical interface. Inter-node communication uses the ESP-NOW star-topology protocol. Additionally, the repository includes WHO_AM_I, a purely software tool for verifying MPU6050 sensor authenticity by reading internal register 0x75. The total prototype cost is approximately $237,400 COP. Complete firmware and documentation are available under the MIT license.</w:t>
       </w:r>
     </w:p>
     <w:p>
@@ -829,7 +829,7 @@
           <w:i w:val="0"/>
           <w:sz w:val="22"/>
         </w:rPr>
-        <w:t>Los dispositivos comerciales actuales —Fitbit Charge 6, Apple Watch Series 9, Garmin Vivosmart 5— ofrecen capacidades de monitoreo avanzadas, pero presentan limitaciones en entornos académicos: acceso restringido a datos en crudo, imposibilidad de modificar el firmware, costos elevados ($600,000–$2,000,000 COP) y ausencia de modularidad. El prototipo presentado propone una arquitectura abierta, de bajo costo (~$311,000 COP) y completamente modificable, basada en microcontroladores ESP32 de amplia disponibilidad en el mercado latinoamericano.</w:t>
+        <w:t>Los dispositivos comerciales actuales —Fitbit Charge 6, Apple Watch Series 9, Garmin Vivosmart 5— ofrecen capacidades de monitoreo avanzadas, pero presentan limitaciones en entornos académicos: acceso restringido a datos en crudo, imposibilidad de modificar el firmware, costos elevados ($600,000–$2,000,000 COP) y ausencia de modularidad. El prototipo presentado propone una arquitectura abierta, de bajo costo (~$237,400 COP) y completamente modificable, basada en microcontroladores ESP32 de amplia disponibilidad en el mercado latinoamericano.</w:t>
       </w:r>
     </w:p>
     <w:p>
@@ -2150,7 +2150,7 @@
           <w:i w:val="0"/>
           <w:sz w:val="22"/>
         </w:rPr>
-        <w:t>Precios de mercado 2026 para Latinoamérica (AliExpress, Mercado Libre Colombia/México). Se incluyen las fuentes de alimentación de cada nodo.</w:t>
+        <w:t>Precios de mercado 2026 para Colombia (Mercado Libre Colombia, tiendas locales). El ESP32-S3 Touch 1.28" es prestado por la Universidad del Cauca y no genera costo. Se incluyen las fuentes de alimentación de cada nodo.</w:t>
       </w:r>
     </w:p>
     <w:tbl>
@@ -2484,14 +2484,15 @@
               <w:spacing w:before="20" w:after="20" w:lineRule="auto" w:line="276"/>
               <w:jc w:val="center"/>
             </w:pPr>
-            <w:r/>
+            <w:r>
+              <w:t>$34,000</w:t>
+            </w:r>
             <w:r>
               <w:rPr>
                 <w:rFonts w:ascii="Calibri" w:hAnsi="Calibri"/>
                 <w:b w:val="0"/>
                 <w:sz w:val="18"/>
               </w:rPr>
-              <w:t>$48,000</w:t>
             </w:r>
           </w:p>
         </w:tc>
@@ -2513,14 +2514,15 @@
               <w:spacing w:before="20" w:after="20" w:lineRule="auto" w:line="276"/>
               <w:jc w:val="center"/>
             </w:pPr>
-            <w:r/>
+            <w:r>
+              <w:t>$68,000</w:t>
+            </w:r>
             <w:r>
               <w:rPr>
                 <w:rFonts w:ascii="Calibri" w:hAnsi="Calibri"/>
                 <w:b w:val="0"/>
                 <w:sz w:val="18"/>
               </w:rPr>
-              <w:t>$96,000</w:t>
             </w:r>
           </w:p>
         </w:tc>
@@ -2542,14 +2544,15 @@
               <w:spacing w:before="20" w:after="20" w:lineRule="auto" w:line="276"/>
               <w:jc w:val="left"/>
             </w:pPr>
-            <w:r/>
+            <w:r>
+              <w:t>Mercado Libre Colombia</w:t>
+            </w:r>
             <w:r>
               <w:rPr>
                 <w:rFonts w:ascii="Calibri" w:hAnsi="Calibri"/>
                 <w:b w:val="0"/>
                 <w:sz w:val="18"/>
               </w:rPr>
-              <w:t>AliExpress / Mercado Libre</w:t>
             </w:r>
           </w:p>
         </w:tc>
@@ -2685,14 +2688,15 @@
               <w:spacing w:before="20" w:after="20" w:lineRule="auto" w:line="276"/>
               <w:jc w:val="center"/>
             </w:pPr>
-            <w:r/>
+            <w:r>
+              <w:t>$7,000</w:t>
+            </w:r>
             <w:r>
               <w:rPr>
                 <w:rFonts w:ascii="Calibri" w:hAnsi="Calibri"/>
                 <w:b w:val="0"/>
                 <w:sz w:val="18"/>
               </w:rPr>
-              <w:t>$16,000</w:t>
             </w:r>
           </w:p>
         </w:tc>
@@ -2713,14 +2717,15 @@
               <w:spacing w:before="20" w:after="20" w:lineRule="auto" w:line="276"/>
               <w:jc w:val="center"/>
             </w:pPr>
-            <w:r/>
+            <w:r>
+              <w:t>$7,000</w:t>
+            </w:r>
             <w:r>
               <w:rPr>
                 <w:rFonts w:ascii="Calibri" w:hAnsi="Calibri"/>
                 <w:b w:val="0"/>
                 <w:sz w:val="18"/>
               </w:rPr>
-              <w:t>$16,000</w:t>
             </w:r>
           </w:p>
         </w:tc>
@@ -2741,14 +2746,15 @@
               <w:spacing w:before="20" w:after="20" w:lineRule="auto" w:line="276"/>
               <w:jc w:val="left"/>
             </w:pPr>
-            <w:r/>
+            <w:r>
+              <w:t>Mercado Libre Colombia</w:t>
+            </w:r>
             <w:r>
               <w:rPr>
                 <w:rFonts w:ascii="Calibri" w:hAnsi="Calibri"/>
                 <w:b w:val="0"/>
                 <w:sz w:val="18"/>
               </w:rPr>
-              <w:t>AliExpress</w:t>
             </w:r>
           </w:p>
         </w:tc>
@@ -2829,14 +2835,15 @@
               <w:spacing w:before="20" w:after="20" w:lineRule="auto" w:line="276"/>
               <w:jc w:val="left"/>
             </w:pPr>
-            <w:r/>
+            <w:r>
+              <w:t>ESP32-S3 Touch 1.28" (con pantalla táctil) – Prestado por la Universidad del Cauca</w:t>
+            </w:r>
             <w:r>
               <w:rPr>
                 <w:rFonts w:ascii="Calibri" w:hAnsi="Calibri"/>
                 <w:b w:val="0"/>
                 <w:sz w:val="18"/>
               </w:rPr>
-              <w:t>ESP32-S3 Touch 1.28" (con pantalla táctil)</w:t>
             </w:r>
           </w:p>
         </w:tc>
@@ -2887,14 +2894,15 @@
               <w:spacing w:before="20" w:after="20" w:lineRule="auto" w:line="276"/>
               <w:jc w:val="center"/>
             </w:pPr>
-            <w:r/>
+            <w:r>
+              <w:t>$0</w:t>
+            </w:r>
             <w:r>
               <w:rPr>
                 <w:rFonts w:ascii="Calibri" w:hAnsi="Calibri"/>
                 <w:b w:val="0"/>
                 <w:sz w:val="18"/>
               </w:rPr>
-              <w:t>$72,000</w:t>
             </w:r>
           </w:p>
         </w:tc>
@@ -2916,14 +2924,15 @@
               <w:spacing w:before="20" w:after="20" w:lineRule="auto" w:line="276"/>
               <w:jc w:val="center"/>
             </w:pPr>
-            <w:r/>
+            <w:r>
+              <w:t>$0</w:t>
+            </w:r>
             <w:r>
               <w:rPr>
                 <w:rFonts w:ascii="Calibri" w:hAnsi="Calibri"/>
                 <w:b w:val="0"/>
                 <w:sz w:val="18"/>
               </w:rPr>
-              <w:t>$72,000</w:t>
             </w:r>
           </w:p>
         </w:tc>
@@ -2945,14 +2954,15 @@
               <w:spacing w:before="20" w:after="20" w:lineRule="auto" w:line="276"/>
               <w:jc w:val="left"/>
             </w:pPr>
-            <w:r/>
+            <w:r>
+              <w:t>Prestado – Universidad del Cauca</w:t>
+            </w:r>
             <w:r>
               <w:rPr>
                 <w:rFonts w:ascii="Calibri" w:hAnsi="Calibri"/>
                 <w:b w:val="0"/>
                 <w:sz w:val="18"/>
               </w:rPr>
-              <w:t>AliExpress</w:t>
             </w:r>
           </w:p>
         </w:tc>
@@ -3088,14 +3098,15 @@
               <w:spacing w:before="20" w:after="20" w:lineRule="auto" w:line="276"/>
               <w:jc w:val="center"/>
             </w:pPr>
-            <w:r/>
+            <w:r>
+              <w:t>$15,000</w:t>
+            </w:r>
             <w:r>
               <w:rPr>
                 <w:rFonts w:ascii="Calibri" w:hAnsi="Calibri"/>
                 <w:b w:val="0"/>
                 <w:sz w:val="18"/>
               </w:rPr>
-              <w:t>$10,000</w:t>
             </w:r>
           </w:p>
         </w:tc>
@@ -3116,14 +3127,15 @@
               <w:spacing w:before="20" w:after="20" w:lineRule="auto" w:line="276"/>
               <w:jc w:val="center"/>
             </w:pPr>
-            <w:r/>
+            <w:r>
+              <w:t>$15,000</w:t>
+            </w:r>
             <w:r>
               <w:rPr>
                 <w:rFonts w:ascii="Calibri" w:hAnsi="Calibri"/>
                 <w:b w:val="0"/>
                 <w:sz w:val="18"/>
               </w:rPr>
-              <w:t>$10,000</w:t>
             </w:r>
           </w:p>
         </w:tc>
@@ -3144,14 +3156,15 @@
               <w:spacing w:before="20" w:after="20" w:lineRule="auto" w:line="276"/>
               <w:jc w:val="left"/>
             </w:pPr>
-            <w:r/>
+            <w:r>
+              <w:t>Mercado Libre Colombia</w:t>
+            </w:r>
             <w:r>
               <w:rPr>
                 <w:rFonts w:ascii="Calibri" w:hAnsi="Calibri"/>
                 <w:b w:val="0"/>
                 <w:sz w:val="18"/>
               </w:rPr>
-              <w:t>AliExpress</w:t>
             </w:r>
           </w:p>
         </w:tc>
@@ -3290,14 +3303,15 @@
               <w:spacing w:before="20" w:after="20" w:lineRule="auto" w:line="276"/>
               <w:jc w:val="center"/>
             </w:pPr>
-            <w:r/>
+            <w:r>
+              <w:t>$28,000</w:t>
+            </w:r>
             <w:r>
               <w:rPr>
                 <w:rFonts w:ascii="Calibri" w:hAnsi="Calibri"/>
                 <w:b w:val="0"/>
                 <w:sz w:val="18"/>
               </w:rPr>
-              <w:t>$16,000</w:t>
             </w:r>
           </w:p>
         </w:tc>
@@ -3319,14 +3333,15 @@
               <w:spacing w:before="20" w:after="20" w:lineRule="auto" w:line="276"/>
               <w:jc w:val="center"/>
             </w:pPr>
-            <w:r/>
+            <w:r>
+              <w:t>$28,000</w:t>
+            </w:r>
             <w:r>
               <w:rPr>
                 <w:rFonts w:ascii="Calibri" w:hAnsi="Calibri"/>
                 <w:b w:val="0"/>
                 <w:sz w:val="18"/>
               </w:rPr>
-              <w:t>$16,000</w:t>
             </w:r>
           </w:p>
         </w:tc>
@@ -3348,14 +3363,15 @@
               <w:spacing w:before="20" w:after="20" w:lineRule="auto" w:line="276"/>
               <w:jc w:val="left"/>
             </w:pPr>
-            <w:r/>
+            <w:r>
+              <w:t>Mercado Libre Colombia</w:t>
+            </w:r>
             <w:r>
               <w:rPr>
                 <w:rFonts w:ascii="Calibri" w:hAnsi="Calibri"/>
                 <w:b w:val="0"/>
                 <w:sz w:val="18"/>
               </w:rPr>
-              <w:t>Local / AliExpress</w:t>
             </w:r>
           </w:p>
         </w:tc>
@@ -3491,14 +3507,15 @@
               <w:spacing w:before="20" w:after="20" w:lineRule="auto" w:line="276"/>
               <w:jc w:val="center"/>
             </w:pPr>
-            <w:r/>
+            <w:r>
+              <w:t>$13,000</w:t>
+            </w:r>
             <w:r>
               <w:rPr>
                 <w:rFonts w:ascii="Calibri" w:hAnsi="Calibri"/>
                 <w:b w:val="0"/>
                 <w:sz w:val="18"/>
               </w:rPr>
-              <w:t>$12,000</w:t>
             </w:r>
           </w:p>
         </w:tc>
@@ -3519,14 +3536,15 @@
               <w:spacing w:before="20" w:after="20" w:lineRule="auto" w:line="276"/>
               <w:jc w:val="center"/>
             </w:pPr>
-            <w:r/>
+            <w:r>
+              <w:t>$13,000</w:t>
+            </w:r>
             <w:r>
               <w:rPr>
                 <w:rFonts w:ascii="Calibri" w:hAnsi="Calibri"/>
                 <w:b w:val="0"/>
                 <w:sz w:val="18"/>
               </w:rPr>
-              <w:t>$12,000</w:t>
             </w:r>
           </w:p>
         </w:tc>
@@ -3547,14 +3565,15 @@
               <w:spacing w:before="20" w:after="20" w:lineRule="auto" w:line="276"/>
               <w:jc w:val="left"/>
             </w:pPr>
-            <w:r/>
+            <w:r>
+              <w:t>Mercado Libre Colombia</w:t>
+            </w:r>
             <w:r>
               <w:rPr>
                 <w:rFonts w:ascii="Calibri" w:hAnsi="Calibri"/>
                 <w:b w:val="0"/>
                 <w:sz w:val="18"/>
               </w:rPr>
-              <w:t>AliExpress</w:t>
             </w:r>
           </w:p>
         </w:tc>
@@ -3693,14 +3712,15 @@
               <w:spacing w:before="20" w:after="20" w:lineRule="auto" w:line="276"/>
               <w:jc w:val="center"/>
             </w:pPr>
-            <w:r/>
+            <w:r>
+              <w:t>$6,000</w:t>
+            </w:r>
             <w:r>
               <w:rPr>
                 <w:rFonts w:ascii="Calibri" w:hAnsi="Calibri"/>
                 <w:b w:val="0"/>
                 <w:sz w:val="18"/>
               </w:rPr>
-              <w:t>$3,200</w:t>
             </w:r>
           </w:p>
         </w:tc>
@@ -3722,14 +3742,15 @@
               <w:spacing w:before="20" w:after="20" w:lineRule="auto" w:line="276"/>
               <w:jc w:val="center"/>
             </w:pPr>
-            <w:r/>
+            <w:r>
+              <w:t>$6,000</w:t>
+            </w:r>
             <w:r>
               <w:rPr>
                 <w:rFonts w:ascii="Calibri" w:hAnsi="Calibri"/>
                 <w:b w:val="0"/>
                 <w:sz w:val="18"/>
               </w:rPr>
-              <w:t>$3,200</w:t>
             </w:r>
           </w:p>
         </w:tc>
@@ -3751,14 +3772,15 @@
               <w:spacing w:before="20" w:after="20" w:lineRule="auto" w:line="276"/>
               <w:jc w:val="left"/>
             </w:pPr>
-            <w:r/>
+            <w:r>
+              <w:t>Mercado Libre Colombia</w:t>
+            </w:r>
             <w:r>
               <w:rPr>
                 <w:rFonts w:ascii="Calibri" w:hAnsi="Calibri"/>
                 <w:b w:val="0"/>
                 <w:sz w:val="18"/>
               </w:rPr>
-              <w:t>AliExpress</w:t>
             </w:r>
           </w:p>
         </w:tc>
@@ -3894,14 +3916,15 @@
               <w:spacing w:before="20" w:after="20" w:lineRule="auto" w:line="276"/>
               <w:jc w:val="center"/>
             </w:pPr>
-            <w:r/>
+            <w:r>
+              <w:t>$75,000</w:t>
+            </w:r>
             <w:r>
               <w:rPr>
                 <w:rFonts w:ascii="Calibri" w:hAnsi="Calibri"/>
                 <w:b w:val="0"/>
                 <w:sz w:val="18"/>
               </w:rPr>
-              <w:t>$60,000</w:t>
             </w:r>
           </w:p>
         </w:tc>
@@ -3922,14 +3945,15 @@
               <w:spacing w:before="20" w:after="20" w:lineRule="auto" w:line="276"/>
               <w:jc w:val="center"/>
             </w:pPr>
-            <w:r/>
+            <w:r>
+              <w:t>$75,000</w:t>
+            </w:r>
             <w:r>
               <w:rPr>
                 <w:rFonts w:ascii="Calibri" w:hAnsi="Calibri"/>
                 <w:b w:val="0"/>
                 <w:sz w:val="18"/>
               </w:rPr>
-              <w:t>$60,000</w:t>
             </w:r>
           </w:p>
         </w:tc>
@@ -3950,14 +3974,15 @@
               <w:spacing w:before="20" w:after="20" w:lineRule="auto" w:line="276"/>
               <w:jc w:val="left"/>
             </w:pPr>
-            <w:r/>
+            <w:r>
+              <w:t>Mercado Libre Colombia</w:t>
+            </w:r>
             <w:r>
               <w:rPr>
                 <w:rFonts w:ascii="Calibri" w:hAnsi="Calibri"/>
                 <w:b w:val="0"/>
                 <w:sz w:val="18"/>
               </w:rPr>
-              <w:t>Mercado Libre</w:t>
             </w:r>
           </w:p>
         </w:tc>
@@ -4096,14 +4121,15 @@
               <w:spacing w:before="20" w:after="20" w:lineRule="auto" w:line="276"/>
               <w:jc w:val="center"/>
             </w:pPr>
-            <w:r/>
+            <w:r>
+              <w:t>$5,000</w:t>
+            </w:r>
             <w:r>
               <w:rPr>
                 <w:rFonts w:ascii="Calibri" w:hAnsi="Calibri"/>
                 <w:b w:val="0"/>
                 <w:sz w:val="18"/>
               </w:rPr>
-              <w:t>$6,000</w:t>
             </w:r>
           </w:p>
         </w:tc>
@@ -4125,14 +4151,15 @@
               <w:spacing w:before="20" w:after="20" w:lineRule="auto" w:line="276"/>
               <w:jc w:val="center"/>
             </w:pPr>
-            <w:r/>
+            <w:r>
+              <w:t>$5,000</w:t>
+            </w:r>
             <w:r>
               <w:rPr>
                 <w:rFonts w:ascii="Calibri" w:hAnsi="Calibri"/>
                 <w:b w:val="0"/>
                 <w:sz w:val="18"/>
               </w:rPr>
-              <w:t>$6,000</w:t>
             </w:r>
           </w:p>
         </w:tc>
@@ -4154,14 +4181,15 @@
               <w:spacing w:before="20" w:after="20" w:lineRule="auto" w:line="276"/>
               <w:jc w:val="left"/>
             </w:pPr>
-            <w:r/>
+            <w:r>
+              <w:t>Local / Ferretería</w:t>
+            </w:r>
             <w:r>
               <w:rPr>
                 <w:rFonts w:ascii="Calibri" w:hAnsi="Calibri"/>
                 <w:b w:val="0"/>
                 <w:sz w:val="18"/>
               </w:rPr>
-              <w:t>Local</w:t>
             </w:r>
           </w:p>
         </w:tc>
@@ -4297,14 +4325,15 @@
               <w:spacing w:before="20" w:after="20" w:lineRule="auto" w:line="276"/>
               <w:jc w:val="center"/>
             </w:pPr>
-            <w:r/>
+            <w:r>
+              <w:t>$8,000</w:t>
+            </w:r>
             <w:r>
               <w:rPr>
                 <w:rFonts w:ascii="Calibri" w:hAnsi="Calibri"/>
                 <w:b w:val="0"/>
                 <w:sz w:val="18"/>
               </w:rPr>
-              <w:t>$8,000</w:t>
             </w:r>
           </w:p>
         </w:tc>
@@ -4325,14 +4354,15 @@
               <w:spacing w:before="20" w:after="20" w:lineRule="auto" w:line="276"/>
               <w:jc w:val="center"/>
             </w:pPr>
-            <w:r/>
+            <w:r>
+              <w:t>$8,000</w:t>
+            </w:r>
             <w:r>
               <w:rPr>
                 <w:rFonts w:ascii="Calibri" w:hAnsi="Calibri"/>
                 <w:b w:val="0"/>
                 <w:sz w:val="18"/>
               </w:rPr>
-              <w:t>$8,000</w:t>
             </w:r>
           </w:p>
         </w:tc>
@@ -4353,14 +4383,15 @@
               <w:spacing w:before="20" w:after="20" w:lineRule="auto" w:line="276"/>
               <w:jc w:val="left"/>
             </w:pPr>
-            <w:r/>
+            <w:r>
+              <w:t>Local / Supermercado</w:t>
+            </w:r>
             <w:r>
               <w:rPr>
                 <w:rFonts w:ascii="Calibri" w:hAnsi="Calibri"/>
                 <w:b w:val="0"/>
                 <w:sz w:val="18"/>
               </w:rPr>
-              <w:t>Local / Supermercado</w:t>
             </w:r>
           </w:p>
         </w:tc>
@@ -4499,14 +4530,15 @@
               <w:spacing w:before="20" w:after="20" w:lineRule="auto" w:line="276"/>
               <w:jc w:val="center"/>
             </w:pPr>
-            <w:r/>
+            <w:r>
+              <w:t>$500</w:t>
+            </w:r>
             <w:r>
               <w:rPr>
                 <w:rFonts w:ascii="Calibri" w:hAnsi="Calibri"/>
                 <w:b w:val="0"/>
                 <w:sz w:val="18"/>
               </w:rPr>
-              <w:t>$400</w:t>
             </w:r>
           </w:p>
         </w:tc>
@@ -4528,14 +4560,15 @@
               <w:spacing w:before="20" w:after="20" w:lineRule="auto" w:line="276"/>
               <w:jc w:val="center"/>
             </w:pPr>
-            <w:r/>
+            <w:r>
+              <w:t>$1,000</w:t>
+            </w:r>
             <w:r>
               <w:rPr>
                 <w:rFonts w:ascii="Calibri" w:hAnsi="Calibri"/>
                 <w:b w:val="0"/>
                 <w:sz w:val="18"/>
               </w:rPr>
-              <w:t>$800</w:t>
             </w:r>
           </w:p>
         </w:tc>
@@ -4557,14 +4590,15 @@
               <w:spacing w:before="20" w:after="20" w:lineRule="auto" w:line="276"/>
               <w:jc w:val="left"/>
             </w:pPr>
-            <w:r/>
+            <w:r>
+              <w:t>Local / Mercado Libre</w:t>
+            </w:r>
             <w:r>
               <w:rPr>
                 <w:rFonts w:ascii="Calibri" w:hAnsi="Calibri"/>
                 <w:b w:val="0"/>
                 <w:sz w:val="18"/>
               </w:rPr>
-              <w:t>Local / AliExpress</w:t>
             </w:r>
           </w:p>
         </w:tc>
@@ -4700,14 +4734,15 @@
               <w:spacing w:before="20" w:after="20" w:lineRule="auto" w:line="276"/>
               <w:jc w:val="center"/>
             </w:pPr>
-            <w:r/>
+            <w:r>
+              <w:t>$400</w:t>
+            </w:r>
             <w:r>
               <w:rPr>
                 <w:rFonts w:ascii="Calibri" w:hAnsi="Calibri"/>
                 <w:b w:val="0"/>
                 <w:sz w:val="18"/>
               </w:rPr>
-              <w:t>$320</w:t>
             </w:r>
           </w:p>
         </w:tc>
@@ -4728,14 +4763,15 @@
               <w:spacing w:before="20" w:after="20" w:lineRule="auto" w:line="276"/>
               <w:jc w:val="center"/>
             </w:pPr>
-            <w:r/>
+            <w:r>
+              <w:t>$6,400</w:t>
+            </w:r>
             <w:r>
               <w:rPr>
                 <w:rFonts w:ascii="Calibri" w:hAnsi="Calibri"/>
                 <w:b w:val="0"/>
                 <w:sz w:val="18"/>
               </w:rPr>
-              <w:t>$4,800</w:t>
             </w:r>
           </w:p>
         </w:tc>
@@ -4756,14 +4792,15 @@
               <w:spacing w:before="20" w:after="20" w:lineRule="auto" w:line="276"/>
               <w:jc w:val="left"/>
             </w:pPr>
-            <w:r/>
+            <w:r>
+              <w:t>Mercado Libre Colombia</w:t>
+            </w:r>
             <w:r>
               <w:rPr>
                 <w:rFonts w:ascii="Calibri" w:hAnsi="Calibri"/>
                 <w:b w:val="0"/>
                 <w:sz w:val="18"/>
               </w:rPr>
-              <w:t>AliExpress</w:t>
             </w:r>
           </w:p>
         </w:tc>
@@ -4902,14 +4939,15 @@
               <w:spacing w:before="20" w:after="20" w:lineRule="auto" w:line="276"/>
               <w:jc w:val="center"/>
             </w:pPr>
-            <w:r/>
+            <w:r>
+              <w:t>$5,000</w:t>
+            </w:r>
             <w:r>
               <w:rPr>
                 <w:rFonts w:ascii="Calibri" w:hAnsi="Calibri"/>
                 <w:b w:val="0"/>
                 <w:sz w:val="18"/>
               </w:rPr>
-              <w:t>$6,000</w:t>
             </w:r>
           </w:p>
         </w:tc>
@@ -4931,14 +4969,15 @@
               <w:spacing w:before="20" w:after="20" w:lineRule="auto" w:line="276"/>
               <w:jc w:val="center"/>
             </w:pPr>
-            <w:r/>
+            <w:r>
+              <w:t>$5,000</w:t>
+            </w:r>
             <w:r>
               <w:rPr>
                 <w:rFonts w:ascii="Calibri" w:hAnsi="Calibri"/>
                 <w:b w:val="0"/>
                 <w:sz w:val="18"/>
               </w:rPr>
-              <w:t>$6,000</w:t>
             </w:r>
           </w:p>
         </w:tc>
@@ -4960,14 +4999,15 @@
               <w:spacing w:before="20" w:after="20" w:lineRule="auto" w:line="276"/>
               <w:jc w:val="left"/>
             </w:pPr>
-            <w:r/>
+            <w:r>
+              <w:t>Local / Mercado Libre</w:t>
+            </w:r>
             <w:r>
               <w:rPr>
                 <w:rFonts w:ascii="Calibri" w:hAnsi="Calibri"/>
                 <w:b w:val="0"/>
                 <w:sz w:val="18"/>
               </w:rPr>
-              <w:t>Local / AliExpress</w:t>
             </w:r>
           </w:p>
         </w:tc>
@@ -5133,14 +5173,15 @@
               <w:spacing w:before="20" w:after="20" w:lineRule="auto" w:line="276"/>
               <w:jc w:val="center"/>
             </w:pPr>
-            <w:r/>
+            <w:r>
+              <w:t>$237,400</w:t>
+            </w:r>
             <w:r>
               <w:rPr>
                 <w:rFonts w:ascii="Calibri" w:hAnsi="Calibri"/>
                 <w:b/>
                 <w:sz w:val="18"/>
               </w:rPr>
-              <w:t>$311,000</w:t>
             </w:r>
           </w:p>
         </w:tc>

</xml_diff>

<commit_message>
BOM: módulo SD (no microSD), tarjeta 4 GB, protoboard v1/soldadura v2, total $246,400 COP
Agent-Logs-Url: https://github.com/Cdcuellar/Sistemas-embebidos---Actividades-de-la-vida-diaria/sessions/4ce4c13c-3e64-4f59-bd21-ec02bff63d2d

Co-authored-by: Cdcuellar <153051653+Cdcuellar@users.noreply.github.com>
</commit_message>
<xml_diff>
--- a/articulo_sistema_monitoreo_vestible_HardwareX.docx
+++ b/articulo_sistema_monitoreo_vestible_HardwareX.docx
@@ -687,7 +687,7 @@
               <w:jc w:val="left"/>
             </w:pPr>
             <w:r>
-              <w:t>$237,400 COP (aprox.) – excluye ESP32-S3 Touch (prestado por la Universidad del Cauca)</w:t>
+              <w:t>$246,400 COP (aprox.) – excluye ESP32-S3 Touch (prestado por la Universidad del Cauca)</w:t>
             </w:r>
             <w:r>
               <w:rPr>
@@ -728,7 +728,7 @@
           <w:i w:val="0"/>
           <w:sz w:val="22"/>
         </w:rPr>
-        <w:t>Este artículo documenta el diseño e implementación de un prototipo de sistema de monitoreo vestible para actividades de la vida diaria (AVD) basado en una arquitectura de sensores inerciales distribuidos sobre microcontroladores ESP32. El sistema comprende tres nodos: un nodo maestro (ESP32 DevKit V1) alimentado por un portapilas de 4 pilas AA, encargado de la coordinación central, la adquisición del ritmo cardíaco, el registro de marcas de tiempo mediante un módulo RTC DS3231 y el almacenamiento en tarjeta microSD; un nodo de movimiento (ESP32 DevKit V1) alimentado por una batería de litio de 3.7 V / 600 mAh, que captura datos de orientación e inercia con el sensor MPU6050; un nodo táctil-visual (ESP32-S3 Touch 1.28") alimentado por una powerbank de 20.000 mAh con pantalla táctil e interfaz local. La comunicación entre nodos se realiza mediante el protocolo ESP-NOW en topología en estrella. Adicionalmente, el repositorio incluye WHO_AM_I, una herramienta puramente software para verificar la autenticidad del sensor MPU6050 mediante la lectura del registro interno 0x75. El costo total del prototipo es de aproximadamente $237,400 COP, con firmware completo y documentación bajo licencia MIT, favoreciendo la reproducibilidad académica.</w:t>
+        <w:t>Este artículo documenta el diseño e implementación de un prototipo de sistema de monitoreo vestible para actividades de la vida diaria (AVD) basado en una arquitectura de sensores inerciales distribuidos sobre microcontroladores ESP32. El sistema comprende tres nodos: un nodo maestro (ESP32 DevKit V1) alimentado por un portapilas de 4 pilas AA, encargado de la coordinación central, la adquisición del ritmo cardíaco, el registro de marcas de tiempo mediante un módulo RTC DS3231 y el almacenamiento en tarjeta SD; un nodo de movimiento (ESP32 DevKit V1) alimentado por una batería de litio de 3.7 V / 600 mAh, que captura datos de orientación e inercia con el sensor MPU6050; un nodo táctil-visual (ESP32-S3 Touch 1.28") alimentado por una powerbank de 20.000 mAh con pantalla táctil e interfaz local. La comunicación entre nodos se realiza mediante el protocolo ESP-NOW en topología en estrella. Adicionalmente, el repositorio incluye WHO_AM_I, una herramienta puramente software para verificar la autenticidad del sensor MPU6050 mediante la lectura del registro interno 0x75. El costo total del prototipo es de aproximadamente $246,400 COP, con firmware completo y documentación bajo licencia MIT, favoreciendo la reproducibilidad académica.</w:t>
       </w:r>
     </w:p>
     <w:p>
@@ -758,7 +758,7 @@
           <w:i w:val="0"/>
           <w:sz w:val="22"/>
         </w:rPr>
-        <w:t>This article documents the design and implementation of a wearable monitoring prototype for activities of daily living (ADL) based on a distributed inertial sensor architecture built on ESP32 microcontrollers. The system comprises three nodes: a master node (ESP32 DevKit V1) powered by a 4×AA battery holder, responsible for central coordination, heart rate acquisition, real-time timestamping via DS3231 RTC, and microSD data logging; a motion node (ESP32 DevKit V1) powered by a 3.7 V / 600 mAh lithium battery, capturing orientation and inertial data from an MPU6050 sensor; a touch-display node (ESP32-S3 Touch 1.28") powered by a 20,000 mAh powerbank with graphical interface. Inter-node communication uses the ESP-NOW star-topology protocol. Additionally, the repository includes WHO_AM_I, a purely software tool for verifying MPU6050 sensor authenticity by reading internal register 0x75. The total prototype cost is approximately $237,400 COP. Complete firmware and documentation are available under the MIT license.</w:t>
+        <w:t>This article documents the design and implementation of a wearable monitoring prototype for activities of daily living (ADL) based on a distributed inertial sensor architecture built on ESP32 microcontrollers. The system comprises three nodes: a master node (ESP32 DevKit V1) powered by a 4×AA battery holder, responsible for central coordination, heart rate acquisition, real-time timestamping via DS3231 RTC, and SD data logging; a motion node (ESP32 DevKit V1) powered by a 3.7 V / 600 mAh lithium battery, capturing orientation and inertial data from an MPU6050 sensor; a touch-display node (ESP32-S3 Touch 1.28") powered by a 20,000 mAh powerbank with graphical interface. Inter-node communication uses the ESP-NOW star-topology protocol. Additionally, the repository includes WHO_AM_I, a purely software tool for verifying MPU6050 sensor authenticity by reading internal register 0x75. The total prototype cost is approximately $246,400 COP. Complete firmware and documentation are available under the MIT license.</w:t>
       </w:r>
     </w:p>
     <w:p>
@@ -829,7 +829,7 @@
           <w:i w:val="0"/>
           <w:sz w:val="22"/>
         </w:rPr>
-        <w:t>Los dispositivos comerciales actuales —Fitbit Charge 6, Apple Watch Series 9, Garmin Vivosmart 5— ofrecen capacidades de monitoreo avanzadas, pero presentan limitaciones en entornos académicos: acceso restringido a datos en crudo, imposibilidad de modificar el firmware, costos elevados ($600,000–$2,000,000 COP) y ausencia de modularidad. El prototipo presentado propone una arquitectura abierta, de bajo costo (~$237,400 COP) y completamente modificable, basada en microcontroladores ESP32 de amplia disponibilidad en el mercado latinoamericano.</w:t>
+        <w:t>Los dispositivos comerciales actuales —Fitbit Charge 6, Apple Watch Series 9, Garmin Vivosmart 5— ofrecen capacidades de monitoreo avanzadas, pero presentan limitaciones en entornos académicos: acceso restringido a datos en crudo, imposibilidad de modificar el firmware, costos elevados ($600,000–$2,000,000 COP) y ausencia de modularidad. El prototipo presentado propone una arquitectura abierta, de bajo costo (~$246,400 COP) y completamente modificable, basada en microcontroladores ESP32 de amplia disponibilidad en el mercado latinoamericano.</w:t>
       </w:r>
     </w:p>
     <w:p>
@@ -844,7 +844,7 @@
           <w:i w:val="0"/>
           <w:sz w:val="22"/>
         </w:rPr>
-        <w:t>Entre las ventajas del enfoque propuesto se destacan: (1) acceso completo al firmware en lenguaje C bajo licencia MIT; (2) posibilidad de integrar nuevos sensores sin cambios de plataforma; (3) comunicación inalámbrica mediante ESP-NOW con latencias inferiores a 10 ms; (4) almacenamiento local en microSD para operación autónoma; (5) costo accesible para laboratorios universitarios; y (6) autonomía inalámbrica gracias a las fuentes de alimentación independientes en cada nodo.</w:t>
+        <w:t>Entre las ventajas del enfoque propuesto se destacan: (1) acceso completo al firmware en lenguaje C bajo licencia MIT; (2) posibilidad de integrar nuevos sensores sin cambios de plataforma; (3) comunicación inalámbrica mediante ESP-NOW con latencias inferiores a 10 ms; (4) almacenamiento local en SD para operación autónoma; (5) costo accesible para laboratorios universitarios; y (6) autonomía inalámbrica gracias a las fuentes de alimentación independientes en cada nodo.</w:t>
       </w:r>
     </w:p>
     <w:p>
@@ -919,7 +919,7 @@
           <w:i w:val="0"/>
           <w:sz w:val="22"/>
         </w:rPr>
-        <w:t>Directorio: esp32_1_hr_rstc_sd_master. Constituye el núcleo central del sistema. Al encenderse, inicializa el módulo RTC DS3231 por I2C (GPIO 21/22) para obtener marcas de tiempo precisas, monta el sistema de archivos de la tarjeta microSD por SPI (CS: GPIO 5, CLK: GPIO 18, MISO: GPIO 19, MOSI: GPIO 23) y crea o abre el archivo CSV diario con el formato "datos_YYYY-MM-DD.csv". A continuación, registra su propia dirección MAC y configura el stack ESP-NOW como receptor, habilitando el callback de recepción de paquetes. Cada vez que recibe un paquete ESP-NOW de un nodo esclavo (estructura datos_imu_t de 32 bytes), el maestro extrae los campos roll, pitch, accX, accY, accZ, y los combina con la lectura ADC del sensor de ritmo cardíaco (GPIO 34, 12 bits) y la marca de tiempo actual del RTC, escribiendo una línea CSV en la SD. Este flujo garantiza la sincronización temporal centralizada y la persistencia de datos sin necesidad de infraestructura WiFi externa. Fuente de alimentación: portapilas de 4 pilas AA (6 V nominal → regulado a 3.3 V por el regulador integrado del DevKit). Autonomía estimada: 8–15 horas con pilas alcalinas.</w:t>
+        <w:t>Directorio: esp32_1_hr_rstc_sd_master. Constituye el núcleo central del sistema. Al encenderse, inicializa el módulo RTC DS3231 por I2C (GPIO 21/22) para obtener marcas de tiempo precisas, monta el sistema de archivos de la tarjeta SD por SPI (CS: GPIO 5, CLK: GPIO 18, MISO: GPIO 19, MOSI: GPIO 23) y crea o abre el archivo CSV diario con el formato "datos_YYYY-MM-DD.csv". A continuación, registra su propia dirección MAC y configura el stack ESP-NOW como receptor, habilitando el callback de recepción de paquetes. Cada vez que recibe un paquete ESP-NOW de un nodo esclavo (estructura datos_imu_t de 32 bytes), el maestro extrae los campos roll, pitch, accX, accY, accZ, y los combina con la lectura ADC del sensor de ritmo cardíaco (GPIO 34, 12 bits) y la marca de tiempo actual del RTC, escribiendo una línea CSV en la SD. Este flujo garantiza la sincronización temporal centralizada y la persistencia de datos sin necesidad de infraestructura WiFi externa. Fuente de alimentación: portapilas de 4 pilas AA (6 V nominal → regulado a 3.3 V por el regulador integrado del DevKit). Autonomía estimada: 8–15 horas con pilas alcalinas.</w:t>
       </w:r>
     </w:p>
     <w:p>
@@ -3245,14 +3245,15 @@
               <w:spacing w:before="20" w:after="20" w:lineRule="auto" w:line="276"/>
               <w:jc w:val="left"/>
             </w:pPr>
-            <w:r/>
+            <w:r>
+              <w:t>Módulo lector SD + Tarjeta SD 4 GB</w:t>
+            </w:r>
             <w:r>
               <w:rPr>
                 <w:rFonts w:ascii="Calibri" w:hAnsi="Calibri"/>
                 <w:b w:val="0"/>
                 <w:sz w:val="18"/>
               </w:rPr>
-              <w:t>Módulo lector microSD + Tarjeta microSD 16 GB</w:t>
             </w:r>
           </w:p>
         </w:tc>
@@ -3304,7 +3305,7 @@
               <w:jc w:val="center"/>
             </w:pPr>
             <w:r>
-              <w:t>$28,000</w:t>
+              <w:t>$37,000</w:t>
             </w:r>
             <w:r>
               <w:rPr>
@@ -3334,7 +3335,7 @@
               <w:jc w:val="center"/>
             </w:pPr>
             <w:r>
-              <w:t>$28,000</w:t>
+              <w:t>$37,000</w:t>
             </w:r>
             <w:r>
               <w:rPr>
@@ -4852,14 +4853,15 @@
               <w:spacing w:before="20" w:after="20" w:lineRule="auto" w:line="276"/>
               <w:jc w:val="left"/>
             </w:pPr>
-            <w:r/>
+            <w:r>
+              <w:t>PCB1 / PB2</w:t>
+            </w:r>
             <w:r>
               <w:rPr>
                 <w:rFonts w:ascii="Calibri" w:hAnsi="Calibri"/>
                 <w:b w:val="0"/>
                 <w:sz w:val="18"/>
               </w:rPr>
-              <w:t>PCB1</w:t>
             </w:r>
           </w:p>
         </w:tc>
@@ -4881,14 +4883,15 @@
               <w:spacing w:before="20" w:after="20" w:lineRule="auto" w:line="276"/>
               <w:jc w:val="left"/>
             </w:pPr>
-            <w:r/>
+            <w:r>
+              <w:t>Montaje v1: Protoboard (ensamblaje inicial) / Montaje v2: Soldadura directa con jumpers sobre placa perforada</w:t>
+            </w:r>
             <w:r>
               <w:rPr>
                 <w:rFonts w:ascii="Calibri" w:hAnsi="Calibri"/>
                 <w:b w:val="0"/>
                 <w:sz w:val="18"/>
               </w:rPr>
-              <w:t>PCB prototipo 5×7 cm (breadboard o perforada)</w:t>
             </w:r>
           </w:p>
         </w:tc>
@@ -5174,7 +5177,7 @@
               <w:jc w:val="center"/>
             </w:pPr>
             <w:r>
-              <w:t>$237,400</w:t>
+              <w:t>$246,400</w:t>
             </w:r>
             <w:r>
               <w:rPr>
@@ -8352,7 +8355,7 @@
           <w:rFonts w:ascii="Calibri" w:hAnsi="Calibri"/>
           <w:sz w:val="20"/>
         </w:rPr>
-        <w:t>Almacenamiento de registros con marcas de tiempo en tarjeta microSD.</w:t>
+        <w:t>Almacenamiento de registros con marcas de tiempo en tarjeta SD.</w:t>
       </w:r>
     </w:p>
     <w:p>

</xml_diff>

<commit_message>
BOM y conexiones: eliminar resistencias 4.7 kΩ pull-up I2C, total $245,400 COP
Agent-Logs-Url: https://github.com/Cdcuellar/Sistemas-embebidos---Actividades-de-la-vida-diaria/sessions/10a99c71-343b-4513-898a-05d19e932d1e

Co-authored-by: Cdcuellar <153051653+Cdcuellar@users.noreply.github.com>
</commit_message>
<xml_diff>
--- a/articulo_sistema_monitoreo_vestible_HardwareX.docx
+++ b/articulo_sistema_monitoreo_vestible_HardwareX.docx
@@ -687,7 +687,7 @@
               <w:jc w:val="left"/>
             </w:pPr>
             <w:r>
-              <w:t>$246,400 COP (aprox.) – excluye ESP32-S3 Touch (prestado por la Universidad del Cauca)</w:t>
+              <w:t>$245,400 COP (aprox.) – excluye ESP32-S3 Touch (prestado por la Universidad del Cauca)</w:t>
             </w:r>
             <w:r>
               <w:rPr>
@@ -728,7 +728,7 @@
           <w:i w:val="0"/>
           <w:sz w:val="22"/>
         </w:rPr>
-        <w:t>Este artículo documenta el diseño e implementación de un prototipo de sistema de monitoreo vestible para actividades de la vida diaria (AVD) basado en una arquitectura de sensores inerciales distribuidos sobre microcontroladores ESP32. El sistema comprende tres nodos: un nodo maestro (ESP32 DevKit V1) alimentado por un portapilas de 4 pilas AA, encargado de la coordinación central, la adquisición del ritmo cardíaco, el registro de marcas de tiempo mediante un módulo RTC DS3231 y el almacenamiento en tarjeta SD; un nodo de movimiento (ESP32 DevKit V1) alimentado por una batería de litio de 3.7 V / 600 mAh, que captura datos de orientación e inercia con el sensor MPU6050; un nodo táctil-visual (ESP32-S3 Touch 1.28") alimentado por una powerbank de 20.000 mAh con pantalla táctil e interfaz local. La comunicación entre nodos se realiza mediante el protocolo ESP-NOW en topología en estrella. Adicionalmente, el repositorio incluye WHO_AM_I, una herramienta puramente software para verificar la autenticidad del sensor MPU6050 mediante la lectura del registro interno 0x75. El costo total del prototipo es de aproximadamente $246,400 COP, con firmware completo y documentación bajo licencia MIT, favoreciendo la reproducibilidad académica.</w:t>
+        <w:t>Este artículo documenta el diseño e implementación de un prototipo de sistema de monitoreo vestible para actividades de la vida diaria (AVD) basado en una arquitectura de sensores inerciales distribuidos sobre microcontroladores ESP32. El sistema comprende tres nodos: un nodo maestro (ESP32 DevKit V1) alimentado por un portapilas de 4 pilas AA, encargado de la coordinación central, la adquisición del ritmo cardíaco, el registro de marcas de tiempo mediante un módulo RTC DS3231 y el almacenamiento en tarjeta SD; un nodo de movimiento (ESP32 DevKit V1) alimentado por una batería de litio de 3.7 V / 600 mAh, que captura datos de orientación e inercia con el sensor MPU6050; un nodo táctil-visual (ESP32-S3 Touch 1.28") alimentado por una powerbank de 20.000 mAh con pantalla táctil e interfaz local. La comunicación entre nodos se realiza mediante el protocolo ESP-NOW en topología en estrella. Adicionalmente, el repositorio incluye WHO_AM_I, una herramienta puramente software para verificar la autenticidad del sensor MPU6050 mediante la lectura del registro interno 0x75. El costo total del prototipo es de aproximadamente $245,400 COP, con firmware completo y documentación bajo licencia MIT, favoreciendo la reproducibilidad académica.</w:t>
       </w:r>
     </w:p>
     <w:p>
@@ -758,7 +758,7 @@
           <w:i w:val="0"/>
           <w:sz w:val="22"/>
         </w:rPr>
-        <w:t>This article documents the design and implementation of a wearable monitoring prototype for activities of daily living (ADL) based on a distributed inertial sensor architecture built on ESP32 microcontrollers. The system comprises three nodes: a master node (ESP32 DevKit V1) powered by a 4×AA battery holder, responsible for central coordination, heart rate acquisition, real-time timestamping via DS3231 RTC, and SD data logging; a motion node (ESP32 DevKit V1) powered by a 3.7 V / 600 mAh lithium battery, capturing orientation and inertial data from an MPU6050 sensor; a touch-display node (ESP32-S3 Touch 1.28") powered by a 20,000 mAh powerbank with graphical interface. Inter-node communication uses the ESP-NOW star-topology protocol. Additionally, the repository includes WHO_AM_I, a purely software tool for verifying MPU6050 sensor authenticity by reading internal register 0x75. The total prototype cost is approximately $246,400 COP. Complete firmware and documentation are available under the MIT license.</w:t>
+        <w:t>This article documents the design and implementation of a wearable monitoring prototype for activities of daily living (ADL) based on a distributed inertial sensor architecture built on ESP32 microcontrollers. The system comprises three nodes: a master node (ESP32 DevKit V1) powered by a 4×AA battery holder, responsible for central coordination, heart rate acquisition, real-time timestamping via DS3231 RTC, and SD data logging; a motion node (ESP32 DevKit V1) powered by a 3.7 V / 600 mAh lithium battery, capturing orientation and inertial data from an MPU6050 sensor; a touch-display node (ESP32-S3 Touch 1.28") powered by a 20,000 mAh powerbank with graphical interface. Inter-node communication uses the ESP-NOW star-topology protocol. Additionally, the repository includes WHO_AM_I, a purely software tool for verifying MPU6050 sensor authenticity by reading internal register 0x75. The total prototype cost is approximately $245,400 COP. Complete firmware and documentation are available under the MIT license.</w:t>
       </w:r>
     </w:p>
     <w:p>
@@ -829,7 +829,7 @@
           <w:i w:val="0"/>
           <w:sz w:val="22"/>
         </w:rPr>
-        <w:t>Los dispositivos comerciales actuales —Fitbit Charge 6, Apple Watch Series 9, Garmin Vivosmart 5— ofrecen capacidades de monitoreo avanzadas, pero presentan limitaciones en entornos académicos: acceso restringido a datos en crudo, imposibilidad de modificar el firmware, costos elevados ($600,000–$2,000,000 COP) y ausencia de modularidad. El prototipo presentado propone una arquitectura abierta, de bajo costo (~$246,400 COP) y completamente modificable, basada en microcontroladores ESP32 de amplia disponibilidad en el mercado latinoamericano.</w:t>
+        <w:t>Los dispositivos comerciales actuales —Fitbit Charge 6, Apple Watch Series 9, Garmin Vivosmart 5— ofrecen capacidades de monitoreo avanzadas, pero presentan limitaciones en entornos académicos: acceso restringido a datos en crudo, imposibilidad de modificar el firmware, costos elevados ($600,000–$2,000,000 COP) y ausencia de modularidad. El prototipo presentado propone una arquitectura abierta, de bajo costo (~$245,400 COP) y completamente modificable, basada en microcontroladores ESP32 de amplia disponibilidad en el mercado latinoamericano.</w:t>
       </w:r>
     </w:p>
     <w:p>
@@ -4429,214 +4429,6 @@
         <w:tc>
           <w:tcPr>
             <w:tcW w:type="dxa" w:w="1506"/>
-            <w:shd w:val="clear" w:color="auto" w:fill="F2F8FF"/>
-            <w:tcBorders>
-              <w:top w:val="single" w:sz="4" w:space="0" w:color="000000"/>
-              <w:left w:val="single" w:sz="4" w:space="0" w:color="000000"/>
-              <w:bottom w:val="single" w:sz="4" w:space="0" w:color="000000"/>
-              <w:right w:val="single" w:sz="4" w:space="0" w:color="000000"/>
-              <w:insideH w:val="single" w:sz="4" w:space="0" w:color="000000"/>
-              <w:insideV w:val="single" w:sz="4" w:space="0" w:color="000000"/>
-            </w:tcBorders>
-          </w:tcPr>
-          <w:p>
-            <w:pPr>
-              <w:spacing w:before="20" w:after="20" w:lineRule="auto" w:line="276"/>
-              <w:jc w:val="left"/>
-            </w:pPr>
-            <w:r/>
-            <w:r>
-              <w:rPr>
-                <w:rFonts w:ascii="Calibri" w:hAnsi="Calibri"/>
-                <w:b w:val="0"/>
-                <w:sz w:val="18"/>
-              </w:rPr>
-              <w:t>R1, R2</w:t>
-            </w:r>
-          </w:p>
-        </w:tc>
-        <w:tc>
-          <w:tcPr>
-            <w:tcW w:type="dxa" w:w="1506"/>
-            <w:shd w:val="clear" w:color="auto" w:fill="F2F8FF"/>
-            <w:tcBorders>
-              <w:top w:val="single" w:sz="4" w:space="0" w:color="000000"/>
-              <w:left w:val="single" w:sz="4" w:space="0" w:color="000000"/>
-              <w:bottom w:val="single" w:sz="4" w:space="0" w:color="000000"/>
-              <w:right w:val="single" w:sz="4" w:space="0" w:color="000000"/>
-              <w:insideH w:val="single" w:sz="4" w:space="0" w:color="000000"/>
-              <w:insideV w:val="single" w:sz="4" w:space="0" w:color="000000"/>
-            </w:tcBorders>
-          </w:tcPr>
-          <w:p>
-            <w:pPr>
-              <w:spacing w:before="20" w:after="20" w:lineRule="auto" w:line="276"/>
-              <w:jc w:val="left"/>
-            </w:pPr>
-            <w:r/>
-            <w:r>
-              <w:rPr>
-                <w:rFonts w:ascii="Calibri" w:hAnsi="Calibri"/>
-                <w:b w:val="0"/>
-                <w:sz w:val="18"/>
-              </w:rPr>
-              <w:t>Resistencia 4.7 kΩ, 1/4 W, ±5% (pull-up I2C)</w:t>
-            </w:r>
-          </w:p>
-        </w:tc>
-        <w:tc>
-          <w:tcPr>
-            <w:tcW w:type="dxa" w:w="1506"/>
-            <w:shd w:val="clear" w:color="auto" w:fill="F2F8FF"/>
-            <w:tcBorders>
-              <w:top w:val="single" w:sz="4" w:space="0" w:color="000000"/>
-              <w:left w:val="single" w:sz="4" w:space="0" w:color="000000"/>
-              <w:bottom w:val="single" w:sz="4" w:space="0" w:color="000000"/>
-              <w:right w:val="single" w:sz="4" w:space="0" w:color="000000"/>
-              <w:insideH w:val="single" w:sz="4" w:space="0" w:color="000000"/>
-              <w:insideV w:val="single" w:sz="4" w:space="0" w:color="000000"/>
-            </w:tcBorders>
-          </w:tcPr>
-          <w:p>
-            <w:pPr>
-              <w:spacing w:before="20" w:after="20" w:lineRule="auto" w:line="276"/>
-              <w:jc w:val="center"/>
-            </w:pPr>
-            <w:r/>
-            <w:r>
-              <w:rPr>
-                <w:rFonts w:ascii="Calibri" w:hAnsi="Calibri"/>
-                <w:b w:val="0"/>
-                <w:sz w:val="18"/>
-              </w:rPr>
-              <w:t>2</w:t>
-            </w:r>
-          </w:p>
-        </w:tc>
-        <w:tc>
-          <w:tcPr>
-            <w:tcW w:type="dxa" w:w="1506"/>
-            <w:shd w:val="clear" w:color="auto" w:fill="F2F8FF"/>
-            <w:tcBorders>
-              <w:top w:val="single" w:sz="4" w:space="0" w:color="000000"/>
-              <w:left w:val="single" w:sz="4" w:space="0" w:color="000000"/>
-              <w:bottom w:val="single" w:sz="4" w:space="0" w:color="000000"/>
-              <w:right w:val="single" w:sz="4" w:space="0" w:color="000000"/>
-              <w:insideH w:val="single" w:sz="4" w:space="0" w:color="000000"/>
-              <w:insideV w:val="single" w:sz="4" w:space="0" w:color="000000"/>
-            </w:tcBorders>
-          </w:tcPr>
-          <w:p>
-            <w:pPr>
-              <w:spacing w:before="20" w:after="20" w:lineRule="auto" w:line="276"/>
-              <w:jc w:val="center"/>
-            </w:pPr>
-            <w:r>
-              <w:t>$500</w:t>
-            </w:r>
-            <w:r>
-              <w:rPr>
-                <w:rFonts w:ascii="Calibri" w:hAnsi="Calibri"/>
-                <w:b w:val="0"/>
-                <w:sz w:val="18"/>
-              </w:rPr>
-            </w:r>
-          </w:p>
-        </w:tc>
-        <w:tc>
-          <w:tcPr>
-            <w:tcW w:type="dxa" w:w="1506"/>
-            <w:shd w:val="clear" w:color="auto" w:fill="F2F8FF"/>
-            <w:tcBorders>
-              <w:top w:val="single" w:sz="4" w:space="0" w:color="000000"/>
-              <w:left w:val="single" w:sz="4" w:space="0" w:color="000000"/>
-              <w:bottom w:val="single" w:sz="4" w:space="0" w:color="000000"/>
-              <w:right w:val="single" w:sz="4" w:space="0" w:color="000000"/>
-              <w:insideH w:val="single" w:sz="4" w:space="0" w:color="000000"/>
-              <w:insideV w:val="single" w:sz="4" w:space="0" w:color="000000"/>
-            </w:tcBorders>
-          </w:tcPr>
-          <w:p>
-            <w:pPr>
-              <w:spacing w:before="20" w:after="20" w:lineRule="auto" w:line="276"/>
-              <w:jc w:val="center"/>
-            </w:pPr>
-            <w:r>
-              <w:t>$1,000</w:t>
-            </w:r>
-            <w:r>
-              <w:rPr>
-                <w:rFonts w:ascii="Calibri" w:hAnsi="Calibri"/>
-                <w:b w:val="0"/>
-                <w:sz w:val="18"/>
-              </w:rPr>
-            </w:r>
-          </w:p>
-        </w:tc>
-        <w:tc>
-          <w:tcPr>
-            <w:tcW w:type="dxa" w:w="1506"/>
-            <w:shd w:val="clear" w:color="auto" w:fill="F2F8FF"/>
-            <w:tcBorders>
-              <w:top w:val="single" w:sz="4" w:space="0" w:color="000000"/>
-              <w:left w:val="single" w:sz="4" w:space="0" w:color="000000"/>
-              <w:bottom w:val="single" w:sz="4" w:space="0" w:color="000000"/>
-              <w:right w:val="single" w:sz="4" w:space="0" w:color="000000"/>
-              <w:insideH w:val="single" w:sz="4" w:space="0" w:color="000000"/>
-              <w:insideV w:val="single" w:sz="4" w:space="0" w:color="000000"/>
-            </w:tcBorders>
-          </w:tcPr>
-          <w:p>
-            <w:pPr>
-              <w:spacing w:before="20" w:after="20" w:lineRule="auto" w:line="276"/>
-              <w:jc w:val="left"/>
-            </w:pPr>
-            <w:r>
-              <w:t>Local / Mercado Libre</w:t>
-            </w:r>
-            <w:r>
-              <w:rPr>
-                <w:rFonts w:ascii="Calibri" w:hAnsi="Calibri"/>
-                <w:b w:val="0"/>
-                <w:sz w:val="18"/>
-              </w:rPr>
-            </w:r>
-          </w:p>
-        </w:tc>
-        <w:tc>
-          <w:tcPr>
-            <w:tcW w:type="dxa" w:w="1506"/>
-            <w:shd w:val="clear" w:color="auto" w:fill="F2F8FF"/>
-            <w:tcBorders>
-              <w:top w:val="single" w:sz="4" w:space="0" w:color="000000"/>
-              <w:left w:val="single" w:sz="4" w:space="0" w:color="000000"/>
-              <w:bottom w:val="single" w:sz="4" w:space="0" w:color="000000"/>
-              <w:right w:val="single" w:sz="4" w:space="0" w:color="000000"/>
-              <w:insideH w:val="single" w:sz="4" w:space="0" w:color="000000"/>
-              <w:insideV w:val="single" w:sz="4" w:space="0" w:color="000000"/>
-            </w:tcBorders>
-          </w:tcPr>
-          <w:p>
-            <w:pPr>
-              <w:spacing w:before="20" w:after="20" w:lineRule="auto" w:line="276"/>
-              <w:jc w:val="left"/>
-            </w:pPr>
-            <w:r/>
-            <w:r>
-              <w:rPr>
-                <w:rFonts w:ascii="Calibri" w:hAnsi="Calibri"/>
-                <w:b w:val="0"/>
-                <w:sz w:val="18"/>
-              </w:rPr>
-              <w:t>Metal film</w:t>
-            </w:r>
-          </w:p>
-        </w:tc>
-      </w:tr>
-      <w:tr>
-        <w:tc>
-          <w:tcPr>
-            <w:tcW w:type="dxa" w:w="1506"/>
             <w:tcBorders>
               <w:top w:val="single" w:sz="4" w:space="0" w:color="000000"/>
               <w:left w:val="single" w:sz="4" w:space="0" w:color="000000"/>
@@ -5177,7 +4969,7 @@
               <w:jc w:val="center"/>
             </w:pPr>
             <w:r>
-              <w:t>$246,400</w:t>
+              <w:t>$245,400</w:t>
             </w:r>
             <w:r>
               <w:rPr>
@@ -5727,181 +5519,6 @@
                 <w:sz w:val="18"/>
               </w:rPr>
               <w:t>Nodo esp32_2</w:t>
-            </w:r>
-          </w:p>
-        </w:tc>
-      </w:tr>
-      <w:tr>
-        <w:tc>
-          <w:tcPr>
-            <w:tcW w:type="dxa" w:w="3513"/>
-            <w:tcBorders>
-              <w:top w:val="single" w:sz="4" w:space="0" w:color="000000"/>
-              <w:left w:val="single" w:sz="4" w:space="0" w:color="000000"/>
-              <w:bottom w:val="single" w:sz="4" w:space="0" w:color="000000"/>
-              <w:right w:val="single" w:sz="4" w:space="0" w:color="000000"/>
-              <w:insideH w:val="single" w:sz="4" w:space="0" w:color="000000"/>
-              <w:insideV w:val="single" w:sz="4" w:space="0" w:color="000000"/>
-            </w:tcBorders>
-          </w:tcPr>
-          <w:p>
-            <w:pPr>
-              <w:spacing w:before="20" w:after="20" w:lineRule="auto" w:line="276"/>
-              <w:jc w:val="left"/>
-            </w:pPr>
-            <w:r/>
-            <w:r>
-              <w:rPr>
-                <w:rFonts w:ascii="Calibri" w:hAnsi="Calibri"/>
-                <w:b w:val="0"/>
-                <w:sz w:val="18"/>
-              </w:rPr>
-              <w:t>Pull-up R1 (4.7 kΩ)</w:t>
-            </w:r>
-          </w:p>
-        </w:tc>
-        <w:tc>
-          <w:tcPr>
-            <w:tcW w:type="dxa" w:w="3513"/>
-            <w:tcBorders>
-              <w:top w:val="single" w:sz="4" w:space="0" w:color="000000"/>
-              <w:left w:val="single" w:sz="4" w:space="0" w:color="000000"/>
-              <w:bottom w:val="single" w:sz="4" w:space="0" w:color="000000"/>
-              <w:right w:val="single" w:sz="4" w:space="0" w:color="000000"/>
-              <w:insideH w:val="single" w:sz="4" w:space="0" w:color="000000"/>
-              <w:insideV w:val="single" w:sz="4" w:space="0" w:color="000000"/>
-            </w:tcBorders>
-          </w:tcPr>
-          <w:p>
-            <w:pPr>
-              <w:spacing w:before="20" w:after="20" w:lineRule="auto" w:line="276"/>
-              <w:jc w:val="center"/>
-            </w:pPr>
-            <w:r/>
-            <w:r>
-              <w:rPr>
-                <w:rFonts w:ascii="Calibri" w:hAnsi="Calibri"/>
-                <w:b w:val="0"/>
-                <w:sz w:val="18"/>
-              </w:rPr>
-              <w:t>SDA – 3.3V</w:t>
-            </w:r>
-          </w:p>
-        </w:tc>
-        <w:tc>
-          <w:tcPr>
-            <w:tcW w:type="dxa" w:w="3513"/>
-            <w:tcBorders>
-              <w:top w:val="single" w:sz="4" w:space="0" w:color="000000"/>
-              <w:left w:val="single" w:sz="4" w:space="0" w:color="000000"/>
-              <w:bottom w:val="single" w:sz="4" w:space="0" w:color="000000"/>
-              <w:right w:val="single" w:sz="4" w:space="0" w:color="000000"/>
-              <w:insideH w:val="single" w:sz="4" w:space="0" w:color="000000"/>
-              <w:insideV w:val="single" w:sz="4" w:space="0" w:color="000000"/>
-            </w:tcBorders>
-          </w:tcPr>
-          <w:p>
-            <w:pPr>
-              <w:spacing w:before="20" w:after="20" w:lineRule="auto" w:line="276"/>
-              <w:jc w:val="left"/>
-            </w:pPr>
-            <w:r/>
-            <w:r>
-              <w:rPr>
-                <w:rFonts w:ascii="Calibri" w:hAnsi="Calibri"/>
-                <w:b w:val="0"/>
-                <w:sz w:val="18"/>
-              </w:rPr>
-              <w:t>I2C línea de datos</w:t>
-            </w:r>
-          </w:p>
-        </w:tc>
-      </w:tr>
-      <w:tr>
-        <w:tc>
-          <w:tcPr>
-            <w:tcW w:type="dxa" w:w="3513"/>
-            <w:shd w:val="clear" w:color="auto" w:fill="F2F8FF"/>
-            <w:tcBorders>
-              <w:top w:val="single" w:sz="4" w:space="0" w:color="000000"/>
-              <w:left w:val="single" w:sz="4" w:space="0" w:color="000000"/>
-              <w:bottom w:val="single" w:sz="4" w:space="0" w:color="000000"/>
-              <w:right w:val="single" w:sz="4" w:space="0" w:color="000000"/>
-              <w:insideH w:val="single" w:sz="4" w:space="0" w:color="000000"/>
-              <w:insideV w:val="single" w:sz="4" w:space="0" w:color="000000"/>
-            </w:tcBorders>
-          </w:tcPr>
-          <w:p>
-            <w:pPr>
-              <w:spacing w:before="20" w:after="20" w:lineRule="auto" w:line="276"/>
-              <w:jc w:val="left"/>
-            </w:pPr>
-            <w:r/>
-            <w:r>
-              <w:rPr>
-                <w:rFonts w:ascii="Calibri" w:hAnsi="Calibri"/>
-                <w:b w:val="0"/>
-                <w:sz w:val="18"/>
-              </w:rPr>
-              <w:t>Pull-up R2 (4.7 kΩ)</w:t>
-            </w:r>
-          </w:p>
-        </w:tc>
-        <w:tc>
-          <w:tcPr>
-            <w:tcW w:type="dxa" w:w="3513"/>
-            <w:shd w:val="clear" w:color="auto" w:fill="F2F8FF"/>
-            <w:tcBorders>
-              <w:top w:val="single" w:sz="4" w:space="0" w:color="000000"/>
-              <w:left w:val="single" w:sz="4" w:space="0" w:color="000000"/>
-              <w:bottom w:val="single" w:sz="4" w:space="0" w:color="000000"/>
-              <w:right w:val="single" w:sz="4" w:space="0" w:color="000000"/>
-              <w:insideH w:val="single" w:sz="4" w:space="0" w:color="000000"/>
-              <w:insideV w:val="single" w:sz="4" w:space="0" w:color="000000"/>
-            </w:tcBorders>
-          </w:tcPr>
-          <w:p>
-            <w:pPr>
-              <w:spacing w:before="20" w:after="20" w:lineRule="auto" w:line="276"/>
-              <w:jc w:val="center"/>
-            </w:pPr>
-            <w:r/>
-            <w:r>
-              <w:rPr>
-                <w:rFonts w:ascii="Calibri" w:hAnsi="Calibri"/>
-                <w:b w:val="0"/>
-                <w:sz w:val="18"/>
-              </w:rPr>
-              <w:t>SCL – 3.3V</w:t>
-            </w:r>
-          </w:p>
-        </w:tc>
-        <w:tc>
-          <w:tcPr>
-            <w:tcW w:type="dxa" w:w="3513"/>
-            <w:shd w:val="clear" w:color="auto" w:fill="F2F8FF"/>
-            <w:tcBorders>
-              <w:top w:val="single" w:sz="4" w:space="0" w:color="000000"/>
-              <w:left w:val="single" w:sz="4" w:space="0" w:color="000000"/>
-              <w:bottom w:val="single" w:sz="4" w:space="0" w:color="000000"/>
-              <w:right w:val="single" w:sz="4" w:space="0" w:color="000000"/>
-              <w:insideH w:val="single" w:sz="4" w:space="0" w:color="000000"/>
-              <w:insideV w:val="single" w:sz="4" w:space="0" w:color="000000"/>
-            </w:tcBorders>
-          </w:tcPr>
-          <w:p>
-            <w:pPr>
-              <w:spacing w:before="20" w:after="20" w:lineRule="auto" w:line="276"/>
-              <w:jc w:val="left"/>
-            </w:pPr>
-            <w:r/>
-            <w:r>
-              <w:rPr>
-                <w:rFonts w:ascii="Calibri" w:hAnsi="Calibri"/>
-                <w:b w:val="0"/>
-                <w:sz w:val="18"/>
-              </w:rPr>
-              <w:t>I2C línea de reloj</w:t>
             </w:r>
           </w:p>
         </w:tc>

</xml_diff>